<commit_message>
S158: ph_pri_guide full re-ingest + curriculum 人文科 re-anchor + cert cleanup + display sync + school-type foundation
- Supabase re-ingest ph_pri_guide_2025 146->315 chunks (was capped at 80/262 pages, missing ch3-6 prose); total 14,505->14,674; live search now surfaces ch5/ch6 content
- curriculum 人文科: 8/9 verify-issue citations re-anchored from EDB circular to real guide real pages (p8/11/19/123/127/192/196/245); idx7 training-cert deleted per Leonard
- removed 人文科 + 科學科 30hr/15hr training-cert items (admin announcements, not policy reqs); clause9 table trimmed to general row, clause29 trimmed to core
- display sync 14,505->14,674 across 7 points (3 _meta.stats + app.html + index.html + K1_API_SPEC + README)
- #3 school-type segmentation foundation: 14-domain profile matrix + per-type tagging 4/13 (school_governance/activity/safety/gov_admin); remaining 9 + per-type docx generation pending

Co-Authored-By: Claude Opus 4.8 (1M context) <noreply@anthropic.com>
</commit_message>
<xml_diff>
--- a/dev/checklists/curriculum/本校課程管理政策_學校版_DRAFT.docx
+++ b/dev/checklists/curriculum/本校課程管理政策_學校版_DRAFT.docx
@@ -3153,7 +3153,7 @@
           <w:sz w:val="22"/>
           <w:szCs w:val="22"/>
         </w:rPr>
-        <w:t xml:space="preserve">就小學科學科，本校須確保有足夠已完成有系統培訓的科主任和教師教授該科。小學科學科教師應完成30小時指定培訓課程，完成者可獲發「小學科學教師專業培訓證書（30小時）」。擬任小學科學科科主任或級統籌者應完成「小學科學課程領導專業培訓證書課程（15小時）」，以提升課程領導和管理能力。</w:t>
+        <w:t xml:space="preserve">就小學科學科，本校須確保有足夠已完成有系統培訓的科主任和教師教授該科。</w:t>
       </w:r>
       <w:r>
         <w:rPr>
@@ -4809,7 +4809,7 @@
         </w:rPr>
         <w:t xml:space="preserve">1　</w:t>
       </w:r>
-      <w:hyperlink w:history="1" r:id="rIdsf2unf-twzfayqpzsxshs">
+      <w:hyperlink w:history="1" r:id="rIdlobybzkpmgz4op08g0-gv">
         <w:r>
           <w:rPr>
             <w:rStyle w:val="Hyperlink"/>
@@ -4835,7 +4835,7 @@
         </w:rPr>
         <w:t xml:space="preserve">2　</w:t>
       </w:r>
-      <w:hyperlink w:history="1" r:id="rIdu_asb1athkhk1pwfgrvjc">
+      <w:hyperlink w:history="1" r:id="rIdiikbnxtopai1ekkotyimb">
         <w:r>
           <w:rPr>
             <w:rStyle w:val="Hyperlink"/>
@@ -4861,7 +4861,7 @@
         </w:rPr>
         <w:t xml:space="preserve">3, 27　</w:t>
       </w:r>
-      <w:hyperlink w:history="1" r:id="rIdktcfg4axiheob-99fersm">
+      <w:hyperlink w:history="1" r:id="rIdbe1ghy0arj3uwqmlopjgz">
         <w:r>
           <w:rPr>
             <w:rStyle w:val="Hyperlink"/>
@@ -4887,7 +4887,7 @@
         </w:rPr>
         <w:t xml:space="preserve">4　</w:t>
       </w:r>
-      <w:hyperlink w:history="1" r:id="rIdnrq5q7-yeqrzsl6f-jg-v">
+      <w:hyperlink w:history="1" r:id="rIdx5t0oogquksmvgwqxoh10">
         <w:r>
           <w:rPr>
             <w:rStyle w:val="Hyperlink"/>
@@ -4913,7 +4913,7 @@
         </w:rPr>
         <w:t xml:space="preserve">5, 54　</w:t>
       </w:r>
-      <w:hyperlink w:history="1" r:id="rIdthhffwjppq78legmisj5w">
+      <w:hyperlink w:history="1" r:id="rIdeq1qatmznubnuh306c7ca">
         <w:r>
           <w:rPr>
             <w:rStyle w:val="Hyperlink"/>
@@ -4939,7 +4939,7 @@
         </w:rPr>
         <w:t xml:space="preserve">6, 52, 142　</w:t>
       </w:r>
-      <w:hyperlink w:history="1" r:id="rId-8cpcyqusjilp3ixhlezq">
+      <w:hyperlink w:history="1" r:id="rId5left9wkuaeaolqcouenp">
         <w:r>
           <w:rPr>
             <w:rStyle w:val="Hyperlink"/>
@@ -4965,7 +4965,7 @@
         </w:rPr>
         <w:t xml:space="preserve">7　</w:t>
       </w:r>
-      <w:hyperlink w:history="1" r:id="rIdea14mhqughivnnnhqc3as">
+      <w:hyperlink w:history="1" r:id="rIdnefj0iqqdvo7vsusrk8ob">
         <w:r>
           <w:rPr>
             <w:rStyle w:val="Hyperlink"/>
@@ -4991,7 +4991,7 @@
         </w:rPr>
         <w:t xml:space="preserve">8　</w:t>
       </w:r>
-      <w:hyperlink w:history="1" r:id="rIdot2445kddr1fcnvgle2bb">
+      <w:hyperlink w:history="1" r:id="rIdwu0vnhismygsh-xxla3eg">
         <w:r>
           <w:rPr>
             <w:rStyle w:val="Hyperlink"/>
@@ -5017,7 +5017,7 @@
         </w:rPr>
         <w:t xml:space="preserve">9　</w:t>
       </w:r>
-      <w:hyperlink w:history="1" r:id="rIdfvhv-nct1ajcksdit4neh">
+      <w:hyperlink w:history="1" r:id="rIdtkbra1rldda3cabqchnvm">
         <w:r>
           <w:rPr>
             <w:rStyle w:val="Hyperlink"/>
@@ -5043,7 +5043,7 @@
         </w:rPr>
         <w:t xml:space="preserve">10　</w:t>
       </w:r>
-      <w:hyperlink w:history="1" r:id="rId6jf1vnrpcxgxsglt-wbeb">
+      <w:hyperlink w:history="1" r:id="rIdjvmmw2nvehn4pufpbgfdn">
         <w:r>
           <w:rPr>
             <w:rStyle w:val="Hyperlink"/>
@@ -5069,7 +5069,7 @@
         </w:rPr>
         <w:t xml:space="preserve">11　</w:t>
       </w:r>
-      <w:hyperlink w:history="1" r:id="rIdgr-ykddxo1w1w5v6bujfi">
+      <w:hyperlink w:history="1" r:id="rIdjeiyzg3wtyc72bvzadeeo">
         <w:r>
           <w:rPr>
             <w:rStyle w:val="Hyperlink"/>
@@ -5095,7 +5095,7 @@
         </w:rPr>
         <w:t xml:space="preserve">12　</w:t>
       </w:r>
-      <w:hyperlink w:history="1" r:id="rIdesf0vt2bwpwzn3wca74qs">
+      <w:hyperlink w:history="1" r:id="rIdiwlks_yd5flilinemd149">
         <w:r>
           <w:rPr>
             <w:rStyle w:val="Hyperlink"/>
@@ -5121,7 +5121,7 @@
         </w:rPr>
         <w:t xml:space="preserve">13　</w:t>
       </w:r>
-      <w:hyperlink w:history="1" r:id="rIdzfx75qf8owposkk_-ao19">
+      <w:hyperlink w:history="1" r:id="rIdnp21jg3xchkw4la1rnhtp">
         <w:r>
           <w:rPr>
             <w:rStyle w:val="Hyperlink"/>
@@ -5147,7 +5147,7 @@
         </w:rPr>
         <w:t xml:space="preserve">14, 30　</w:t>
       </w:r>
-      <w:hyperlink w:history="1" r:id="rIdllylcelt1jasndeha29bo">
+      <w:hyperlink w:history="1" r:id="rIdu6s6rdm9pzag4qrslftpb">
         <w:r>
           <w:rPr>
             <w:rStyle w:val="Hyperlink"/>
@@ -5173,7 +5173,7 @@
         </w:rPr>
         <w:t xml:space="preserve">15, 161　</w:t>
       </w:r>
-      <w:hyperlink w:history="1" r:id="rId2rk958jkb9672vqnog8f5">
+      <w:hyperlink w:history="1" r:id="rId9ewrmfoindvin0l8be5hy">
         <w:r>
           <w:rPr>
             <w:rStyle w:val="Hyperlink"/>
@@ -5199,7 +5199,7 @@
         </w:rPr>
         <w:t xml:space="preserve">16　</w:t>
       </w:r>
-      <w:hyperlink w:history="1" r:id="rIdwo6klbsentgomol-4nnmu">
+      <w:hyperlink w:history="1" r:id="rIdkir5cbmsqrrwp4l6vucsx">
         <w:r>
           <w:rPr>
             <w:rStyle w:val="Hyperlink"/>
@@ -5225,7 +5225,7 @@
         </w:rPr>
         <w:t xml:space="preserve">17　</w:t>
       </w:r>
-      <w:hyperlink w:history="1" r:id="rIdqshsrx7fwhgnuqahod8em">
+      <w:hyperlink w:history="1" r:id="rIdup6esljbcwlgmj6klua97">
         <w:r>
           <w:rPr>
             <w:rStyle w:val="Hyperlink"/>
@@ -5251,7 +5251,7 @@
         </w:rPr>
         <w:t xml:space="preserve">18　</w:t>
       </w:r>
-      <w:hyperlink w:history="1" r:id="rIdr-ldwdlysj4ia3f9yhdzx">
+      <w:hyperlink w:history="1" r:id="rIdu3h4g8a7b-mvhaut9-uqq">
         <w:r>
           <w:rPr>
             <w:rStyle w:val="Hyperlink"/>
@@ -5277,7 +5277,7 @@
         </w:rPr>
         <w:t xml:space="preserve">19, 105　</w:t>
       </w:r>
-      <w:hyperlink w:history="1" r:id="rIdx2-7-w9rd4hdvyvikeseq">
+      <w:hyperlink w:history="1" r:id="rIdyxvffxgzcca2pgipz_7pp">
         <w:r>
           <w:rPr>
             <w:rStyle w:val="Hyperlink"/>
@@ -5303,7 +5303,7 @@
         </w:rPr>
         <w:t xml:space="preserve">20, 118　</w:t>
       </w:r>
-      <w:hyperlink w:history="1" r:id="rId-zcq2rzj9tsnei1qbjawe">
+      <w:hyperlink w:history="1" r:id="rIdey8iya-gqjyms8rlx4rdz">
         <w:r>
           <w:rPr>
             <w:rStyle w:val="Hyperlink"/>
@@ -5329,7 +5329,7 @@
         </w:rPr>
         <w:t xml:space="preserve">21, 42　</w:t>
       </w:r>
-      <w:hyperlink w:history="1" r:id="rIdrzo3vqyo_f2c2iu-tjier">
+      <w:hyperlink w:history="1" r:id="rIdcgcnvap4dtf_iorxxg1ll">
         <w:r>
           <w:rPr>
             <w:rStyle w:val="Hyperlink"/>
@@ -5355,7 +5355,7 @@
         </w:rPr>
         <w:t xml:space="preserve">22, 43　</w:t>
       </w:r>
-      <w:hyperlink w:history="1" r:id="rIdupzc4caryto5kjpbffv1g">
+      <w:hyperlink w:history="1" r:id="rIdrb6ks_udtosiezzw7rlyo">
         <w:r>
           <w:rPr>
             <w:rStyle w:val="Hyperlink"/>
@@ -5381,7 +5381,7 @@
         </w:rPr>
         <w:t xml:space="preserve">23　</w:t>
       </w:r>
-      <w:hyperlink w:history="1" r:id="rIdqn6ycfmcijxbnzb2iwrcb">
+      <w:hyperlink w:history="1" r:id="rIdn4czakuhaq1hua1nut-fl">
         <w:r>
           <w:rPr>
             <w:rStyle w:val="Hyperlink"/>
@@ -5407,7 +5407,7 @@
         </w:rPr>
         <w:t xml:space="preserve">24, 38　</w:t>
       </w:r>
-      <w:hyperlink w:history="1" r:id="rIdp0jrvq44efokp-ddzjuhb">
+      <w:hyperlink w:history="1" r:id="rIdbe8htzt-8p7i7zwlgnarh">
         <w:r>
           <w:rPr>
             <w:rStyle w:val="Hyperlink"/>
@@ -5433,7 +5433,7 @@
         </w:rPr>
         <w:t xml:space="preserve">25　</w:t>
       </w:r>
-      <w:hyperlink w:history="1" r:id="rIdm1tsakbqbepguy38iler5">
+      <w:hyperlink w:history="1" r:id="rIdhmwbxkk8hzjwjnqxlzg9i">
         <w:r>
           <w:rPr>
             <w:rStyle w:val="Hyperlink"/>
@@ -5459,7 +5459,7 @@
         </w:rPr>
         <w:t xml:space="preserve">26　</w:t>
       </w:r>
-      <w:hyperlink w:history="1" r:id="rId4ym3nzefp4yzaopdgnsu8">
+      <w:hyperlink w:history="1" r:id="rId0ub1qdgphck1dm2yhc-cd">
         <w:r>
           <w:rPr>
             <w:rStyle w:val="Hyperlink"/>
@@ -5485,7 +5485,7 @@
         </w:rPr>
         <w:t xml:space="preserve">28　</w:t>
       </w:r>
-      <w:hyperlink w:history="1" r:id="rIddg50qyej3l0s83mbcqhg5">
+      <w:hyperlink w:history="1" r:id="rIdgg6ecv-rs0c0sl0aqkh7p">
         <w:r>
           <w:rPr>
             <w:rStyle w:val="Hyperlink"/>
@@ -5511,7 +5511,7 @@
         </w:rPr>
         <w:t xml:space="preserve">29, 34　</w:t>
       </w:r>
-      <w:hyperlink w:history="1" r:id="rIdpgtzxvz0jqjao1raiv_ca">
+      <w:hyperlink w:history="1" r:id="rIdqiddvjkfcydrjr0wjsyvs">
         <w:r>
           <w:rPr>
             <w:rStyle w:val="Hyperlink"/>
@@ -5537,7 +5537,7 @@
         </w:rPr>
         <w:t xml:space="preserve">31, 84　</w:t>
       </w:r>
-      <w:hyperlink w:history="1" r:id="rId_ofo_-qyrdndgwpvfrwku">
+      <w:hyperlink w:history="1" r:id="rIdtqldukq11nmveanr0uc9y">
         <w:r>
           <w:rPr>
             <w:rStyle w:val="Hyperlink"/>
@@ -5563,7 +5563,7 @@
         </w:rPr>
         <w:t xml:space="preserve">32　</w:t>
       </w:r>
-      <w:hyperlink w:history="1" r:id="rIdwsofcsyblrefkfrvikcob">
+      <w:hyperlink w:history="1" r:id="rIdeobbfip7r97d8upardh-s">
         <w:r>
           <w:rPr>
             <w:rStyle w:val="Hyperlink"/>
@@ -5589,7 +5589,7 @@
         </w:rPr>
         <w:t xml:space="preserve">33, 85　</w:t>
       </w:r>
-      <w:hyperlink w:history="1" r:id="rId-icdg4cpwqpzc3mbhop9c">
+      <w:hyperlink w:history="1" r:id="rIdlgjvrkefqofnf2j-ffdac">
         <w:r>
           <w:rPr>
             <w:rStyle w:val="Hyperlink"/>
@@ -5615,7 +5615,7 @@
         </w:rPr>
         <w:t xml:space="preserve">35　</w:t>
       </w:r>
-      <w:hyperlink w:history="1" r:id="rIdvuabvovxbaqyxojb9s9_x">
+      <w:hyperlink w:history="1" r:id="rIdxmqhceufco2peslbyxg5g">
         <w:r>
           <w:rPr>
             <w:rStyle w:val="Hyperlink"/>
@@ -5641,7 +5641,7 @@
         </w:rPr>
         <w:t xml:space="preserve">36　</w:t>
       </w:r>
-      <w:hyperlink w:history="1" r:id="rIdz3y6ypou9yute_hqdvlxg">
+      <w:hyperlink w:history="1" r:id="rIdywywzx2gwzrjpz9ec9nxf">
         <w:r>
           <w:rPr>
             <w:rStyle w:val="Hyperlink"/>
@@ -5667,7 +5667,7 @@
         </w:rPr>
         <w:t xml:space="preserve">37　</w:t>
       </w:r>
-      <w:hyperlink w:history="1" r:id="rIdwd9upmik1p_e7ttweg6mx">
+      <w:hyperlink w:history="1" r:id="rId2zo69bbi98u0obzirwv0s">
         <w:r>
           <w:rPr>
             <w:rStyle w:val="Hyperlink"/>
@@ -5693,7 +5693,7 @@
         </w:rPr>
         <w:t xml:space="preserve">39　</w:t>
       </w:r>
-      <w:hyperlink w:history="1" r:id="rIdamripbxi3v7o0c2i2q2vp">
+      <w:hyperlink w:history="1" r:id="rId2nbm_knpxdhlcf87cisp7">
         <w:r>
           <w:rPr>
             <w:rStyle w:val="Hyperlink"/>
@@ -5719,7 +5719,7 @@
         </w:rPr>
         <w:t xml:space="preserve">40　</w:t>
       </w:r>
-      <w:hyperlink w:history="1" r:id="rIdxql4s9-mllt64gioken-z">
+      <w:hyperlink w:history="1" r:id="rIdt2lqs9ffechubt1adeifw">
         <w:r>
           <w:rPr>
             <w:rStyle w:val="Hyperlink"/>
@@ -5745,7 +5745,7 @@
         </w:rPr>
         <w:t xml:space="preserve">41　</w:t>
       </w:r>
-      <w:hyperlink w:history="1" r:id="rId1njnheia3q_jyzss0zrje">
+      <w:hyperlink w:history="1" r:id="rIdw8jc23jhajzs05kdikdp8">
         <w:r>
           <w:rPr>
             <w:rStyle w:val="Hyperlink"/>
@@ -5771,7 +5771,7 @@
         </w:rPr>
         <w:t xml:space="preserve">44　</w:t>
       </w:r>
-      <w:hyperlink w:history="1" r:id="rIdsrwe0hv9m9srnm_pvbna8">
+      <w:hyperlink w:history="1" r:id="rId8rdr13wqytvjjfhzhk1x6">
         <w:r>
           <w:rPr>
             <w:rStyle w:val="Hyperlink"/>
@@ -5797,7 +5797,7 @@
         </w:rPr>
         <w:t xml:space="preserve">45, 51　</w:t>
       </w:r>
-      <w:hyperlink w:history="1" r:id="rIdbncrgs6ylsj6bobshoanl">
+      <w:hyperlink w:history="1" r:id="rIdzucg7jrq8zjmhna7sjfq3">
         <w:r>
           <w:rPr>
             <w:rStyle w:val="Hyperlink"/>
@@ -5823,7 +5823,7 @@
         </w:rPr>
         <w:t xml:space="preserve">46　</w:t>
       </w:r>
-      <w:hyperlink w:history="1" r:id="rIdrbvf-bjujrhqflpjt3ux8">
+      <w:hyperlink w:history="1" r:id="rIdg9ipcbva7huawmkdz8wbw">
         <w:r>
           <w:rPr>
             <w:rStyle w:val="Hyperlink"/>
@@ -5849,7 +5849,7 @@
         </w:rPr>
         <w:t xml:space="preserve">47　</w:t>
       </w:r>
-      <w:hyperlink w:history="1" r:id="rIdiqen-m944oeclek30wsui">
+      <w:hyperlink w:history="1" r:id="rIdunvdi0hj0fvlnn9ujckeq">
         <w:r>
           <w:rPr>
             <w:rStyle w:val="Hyperlink"/>
@@ -5875,7 +5875,7 @@
         </w:rPr>
         <w:t xml:space="preserve">48, 50　</w:t>
       </w:r>
-      <w:hyperlink w:history="1" r:id="rId9uw1yb4sory3eri_eu7je">
+      <w:hyperlink w:history="1" r:id="rIdn0jc7b-5eaowa2zhk8l2i">
         <w:r>
           <w:rPr>
             <w:rStyle w:val="Hyperlink"/>
@@ -5901,7 +5901,7 @@
         </w:rPr>
         <w:t xml:space="preserve">49　</w:t>
       </w:r>
-      <w:hyperlink w:history="1" r:id="rIdpol6le7lovfdfgpzvrzim">
+      <w:hyperlink w:history="1" r:id="rIdfcyojoevuqrctythysnc_">
         <w:r>
           <w:rPr>
             <w:rStyle w:val="Hyperlink"/>
@@ -5927,7 +5927,7 @@
         </w:rPr>
         <w:t xml:space="preserve">53, 147　</w:t>
       </w:r>
-      <w:hyperlink w:history="1" r:id="rIdlqtiuoci_br0wdrhpjun7">
+      <w:hyperlink w:history="1" r:id="rIdaaptrdcircabkxic_z6ia">
         <w:r>
           <w:rPr>
             <w:rStyle w:val="Hyperlink"/>
@@ -5953,7 +5953,7 @@
         </w:rPr>
         <w:t xml:space="preserve">55　</w:t>
       </w:r>
-      <w:hyperlink w:history="1" r:id="rIdzk2i0mp7s0bebc8hib4zq">
+      <w:hyperlink w:history="1" r:id="rId4qcut1msmncrez-2pwmhk">
         <w:r>
           <w:rPr>
             <w:rStyle w:val="Hyperlink"/>
@@ -5979,7 +5979,7 @@
         </w:rPr>
         <w:t xml:space="preserve">56, 65　</w:t>
       </w:r>
-      <w:hyperlink w:history="1" r:id="rIdmilx_sgi41wet-guyffel">
+      <w:hyperlink w:history="1" r:id="rId2rzanitvqfivo4wrhhw__">
         <w:r>
           <w:rPr>
             <w:rStyle w:val="Hyperlink"/>
@@ -6005,7 +6005,7 @@
         </w:rPr>
         <w:t xml:space="preserve">57　</w:t>
       </w:r>
-      <w:hyperlink w:history="1" r:id="rIdbu5v0i3m9hw1bikbfhvzd">
+      <w:hyperlink w:history="1" r:id="rIdxt0xgzpz42apzhepxyk5j">
         <w:r>
           <w:rPr>
             <w:rStyle w:val="Hyperlink"/>
@@ -6031,7 +6031,7 @@
         </w:rPr>
         <w:t xml:space="preserve">58　</w:t>
       </w:r>
-      <w:hyperlink w:history="1" r:id="rIdaoavprshplmwytbhncghx">
+      <w:hyperlink w:history="1" r:id="rIdahevt8j-hsiohg_9dkf9s">
         <w:r>
           <w:rPr>
             <w:rStyle w:val="Hyperlink"/>
@@ -6057,7 +6057,7 @@
         </w:rPr>
         <w:t xml:space="preserve">59　</w:t>
       </w:r>
-      <w:hyperlink w:history="1" r:id="rIdacpkofb1plkhjcxyulz9y">
+      <w:hyperlink w:history="1" r:id="rIdf_fiwj4cdkbqqojvbuyl2">
         <w:r>
           <w:rPr>
             <w:rStyle w:val="Hyperlink"/>
@@ -6083,7 +6083,7 @@
         </w:rPr>
         <w:t xml:space="preserve">60, 148, 153　</w:t>
       </w:r>
-      <w:hyperlink w:history="1" r:id="rIdk61kz623dxtjcexxq8pl2">
+      <w:hyperlink w:history="1" r:id="rIdjhhzuqgsvfucl2eklsi92">
         <w:r>
           <w:rPr>
             <w:rStyle w:val="Hyperlink"/>
@@ -6109,7 +6109,7 @@
         </w:rPr>
         <w:t xml:space="preserve">61　</w:t>
       </w:r>
-      <w:hyperlink w:history="1" r:id="rId5xg8ya8995u32d7863sva">
+      <w:hyperlink w:history="1" r:id="rIduzqaezxp9ge9vmk3tko8u">
         <w:r>
           <w:rPr>
             <w:rStyle w:val="Hyperlink"/>
@@ -6135,7 +6135,7 @@
         </w:rPr>
         <w:t xml:space="preserve">62　</w:t>
       </w:r>
-      <w:hyperlink w:history="1" r:id="rIdeoqnmjzzip9a4zmxdam4m">
+      <w:hyperlink w:history="1" r:id="rIdfwpslf-huyzxex5_qbmrl">
         <w:r>
           <w:rPr>
             <w:rStyle w:val="Hyperlink"/>
@@ -6161,7 +6161,7 @@
         </w:rPr>
         <w:t xml:space="preserve">63　</w:t>
       </w:r>
-      <w:hyperlink w:history="1" r:id="rId84pdsdjzqobb7rutl-qht">
+      <w:hyperlink w:history="1" r:id="rIdcf5bl8oclkbxc41k_nnvj">
         <w:r>
           <w:rPr>
             <w:rStyle w:val="Hyperlink"/>
@@ -6187,7 +6187,7 @@
         </w:rPr>
         <w:t xml:space="preserve">64　</w:t>
       </w:r>
-      <w:hyperlink w:history="1" r:id="rIdmzfhcqf-ygpexgep2l0vr">
+      <w:hyperlink w:history="1" r:id="rIdbqvfrsgtgcsljavw_exxm">
         <w:r>
           <w:rPr>
             <w:rStyle w:val="Hyperlink"/>
@@ -6213,7 +6213,7 @@
         </w:rPr>
         <w:t xml:space="preserve">66　</w:t>
       </w:r>
-      <w:hyperlink w:history="1" r:id="rIdr51uhgkvl-qav-lkpa3dv">
+      <w:hyperlink w:history="1" r:id="rId2w8sj8l-rq8nzukqetrxl">
         <w:r>
           <w:rPr>
             <w:rStyle w:val="Hyperlink"/>
@@ -6239,7 +6239,7 @@
         </w:rPr>
         <w:t xml:space="preserve">67　</w:t>
       </w:r>
-      <w:hyperlink w:history="1" r:id="rId1gvnca-rw7hf-bhxnmuon">
+      <w:hyperlink w:history="1" r:id="rIdcqainbkszgesgzbzy8pu4">
         <w:r>
           <w:rPr>
             <w:rStyle w:val="Hyperlink"/>
@@ -6265,7 +6265,7 @@
         </w:rPr>
         <w:t xml:space="preserve">68　</w:t>
       </w:r>
-      <w:hyperlink w:history="1" r:id="rIdq-_llhcvomrb3jcutlzy5">
+      <w:hyperlink w:history="1" r:id="rIdgj-yavjthh3ywnv3u45u3">
         <w:r>
           <w:rPr>
             <w:rStyle w:val="Hyperlink"/>
@@ -6291,7 +6291,7 @@
         </w:rPr>
         <w:t xml:space="preserve">69　</w:t>
       </w:r>
-      <w:hyperlink w:history="1" r:id="rIdj4qqck1r8x7eq0pyt-oxe">
+      <w:hyperlink w:history="1" r:id="rIdb44ltozlwj0n0xjgg0ftv">
         <w:r>
           <w:rPr>
             <w:rStyle w:val="Hyperlink"/>
@@ -6317,7 +6317,7 @@
         </w:rPr>
         <w:t xml:space="preserve">70　</w:t>
       </w:r>
-      <w:hyperlink w:history="1" r:id="rIds9garapwh7ye_8zl6uhb4">
+      <w:hyperlink w:history="1" r:id="rIdzv7kuokv__iiejrjwnoct">
         <w:r>
           <w:rPr>
             <w:rStyle w:val="Hyperlink"/>
@@ -6343,7 +6343,7 @@
         </w:rPr>
         <w:t xml:space="preserve">71　</w:t>
       </w:r>
-      <w:hyperlink w:history="1" r:id="rId-ypk0y8xh5m_lcza09pp5">
+      <w:hyperlink w:history="1" r:id="rIdwe0anzbm5pxf-fubkoqp0">
         <w:r>
           <w:rPr>
             <w:rStyle w:val="Hyperlink"/>
@@ -6369,7 +6369,7 @@
         </w:rPr>
         <w:t xml:space="preserve">72　</w:t>
       </w:r>
-      <w:hyperlink w:history="1" r:id="rIdq2dfmfones5jcpcnbcyz4">
+      <w:hyperlink w:history="1" r:id="rIdcpcqlerxksga4006lm28e">
         <w:r>
           <w:rPr>
             <w:rStyle w:val="Hyperlink"/>
@@ -6395,7 +6395,7 @@
         </w:rPr>
         <w:t xml:space="preserve">73　</w:t>
       </w:r>
-      <w:hyperlink w:history="1" r:id="rIdnjfqcd5acupyhaylsplfe">
+      <w:hyperlink w:history="1" r:id="rIdt1znlskec-i86izfqn4f5">
         <w:r>
           <w:rPr>
             <w:rStyle w:val="Hyperlink"/>
@@ -6421,7 +6421,7 @@
         </w:rPr>
         <w:t xml:space="preserve">74　</w:t>
       </w:r>
-      <w:hyperlink w:history="1" r:id="rIdllng_qpgqrg5xfnqcejlh">
+      <w:hyperlink w:history="1" r:id="rId_niejk-lghwrz3gqswuy3">
         <w:r>
           <w:rPr>
             <w:rStyle w:val="Hyperlink"/>
@@ -6447,7 +6447,7 @@
         </w:rPr>
         <w:t xml:space="preserve">75　</w:t>
       </w:r>
-      <w:hyperlink w:history="1" r:id="rIdrmgj-azxqznzadtr8fap_">
+      <w:hyperlink w:history="1" r:id="rIdp_v0lcoych1o8wmjuw17w">
         <w:r>
           <w:rPr>
             <w:rStyle w:val="Hyperlink"/>
@@ -6473,7 +6473,7 @@
         </w:rPr>
         <w:t xml:space="preserve">76　</w:t>
       </w:r>
-      <w:hyperlink w:history="1" r:id="rIdfqzvnpllqvk-zgctrqikt">
+      <w:hyperlink w:history="1" r:id="rIdi6mngn_1eld8bfo5mkb3o">
         <w:r>
           <w:rPr>
             <w:rStyle w:val="Hyperlink"/>
@@ -6499,7 +6499,7 @@
         </w:rPr>
         <w:t xml:space="preserve">77　</w:t>
       </w:r>
-      <w:hyperlink w:history="1" r:id="rIdlhsbhrnamh3fnuhhu4xpv">
+      <w:hyperlink w:history="1" r:id="rId4lyx26ur01_cru5ocusrv">
         <w:r>
           <w:rPr>
             <w:rStyle w:val="Hyperlink"/>
@@ -6525,7 +6525,7 @@
         </w:rPr>
         <w:t xml:space="preserve">78　</w:t>
       </w:r>
-      <w:hyperlink w:history="1" r:id="rId113zpjc2v2bzcje1ii9kt">
+      <w:hyperlink w:history="1" r:id="rIdtblhhrrcfg5xfxtrhqkx-">
         <w:r>
           <w:rPr>
             <w:rStyle w:val="Hyperlink"/>
@@ -6551,7 +6551,7 @@
         </w:rPr>
         <w:t xml:space="preserve">79　</w:t>
       </w:r>
-      <w:hyperlink w:history="1" r:id="rIdymr23w1v7xs7fi4dptrcq">
+      <w:hyperlink w:history="1" r:id="rIdw5kksuzfkl00fyop1_pdq">
         <w:r>
           <w:rPr>
             <w:rStyle w:val="Hyperlink"/>
@@ -6577,7 +6577,7 @@
         </w:rPr>
         <w:t xml:space="preserve">80　</w:t>
       </w:r>
-      <w:hyperlink w:history="1" r:id="rIdl7bpvqxmtvdxgyc7kelbq">
+      <w:hyperlink w:history="1" r:id="rIdbxqfwehwj7om-ohr7lsip">
         <w:r>
           <w:rPr>
             <w:rStyle w:val="Hyperlink"/>
@@ -6603,7 +6603,7 @@
         </w:rPr>
         <w:t xml:space="preserve">81　</w:t>
       </w:r>
-      <w:hyperlink w:history="1" r:id="rId07psjk3kruhvdbupris82">
+      <w:hyperlink w:history="1" r:id="rIdetwipordgtv5tl1fy-5ej">
         <w:r>
           <w:rPr>
             <w:rStyle w:val="Hyperlink"/>
@@ -6629,7 +6629,7 @@
         </w:rPr>
         <w:t xml:space="preserve">82　</w:t>
       </w:r>
-      <w:hyperlink w:history="1" r:id="rIddfhtlsgz9yae6usfkon_8">
+      <w:hyperlink w:history="1" r:id="rIdw5dsu7hggqiv69vtji84x">
         <w:r>
           <w:rPr>
             <w:rStyle w:val="Hyperlink"/>
@@ -6655,7 +6655,7 @@
         </w:rPr>
         <w:t xml:space="preserve">83　</w:t>
       </w:r>
-      <w:hyperlink w:history="1" r:id="rIdr-0nuasbojxfchr9q9a4b">
+      <w:hyperlink w:history="1" r:id="rIdgmtonfmhqzwerj5xarhrk">
         <w:r>
           <w:rPr>
             <w:rStyle w:val="Hyperlink"/>
@@ -6681,7 +6681,7 @@
         </w:rPr>
         <w:t xml:space="preserve">86　</w:t>
       </w:r>
-      <w:hyperlink w:history="1" r:id="rIdt_prvbb8f64zot4banqgj">
+      <w:hyperlink w:history="1" r:id="rIdwcrnpfqsydd8wezhhfmqv">
         <w:r>
           <w:rPr>
             <w:rStyle w:val="Hyperlink"/>
@@ -6707,7 +6707,7 @@
         </w:rPr>
         <w:t xml:space="preserve">87　</w:t>
       </w:r>
-      <w:hyperlink w:history="1" r:id="rId0ahpyoxomjktn6rzmvn21">
+      <w:hyperlink w:history="1" r:id="rIdnuublmuk5qvpqupm9amks">
         <w:r>
           <w:rPr>
             <w:rStyle w:val="Hyperlink"/>
@@ -6733,7 +6733,7 @@
         </w:rPr>
         <w:t xml:space="preserve">88　</w:t>
       </w:r>
-      <w:hyperlink w:history="1" r:id="rId3scpgmtftc68k0ydnxak7">
+      <w:hyperlink w:history="1" r:id="rId_b5nen5gzqvgf3c-jj2xx">
         <w:r>
           <w:rPr>
             <w:rStyle w:val="Hyperlink"/>
@@ -6759,7 +6759,7 @@
         </w:rPr>
         <w:t xml:space="preserve">89, 94　</w:t>
       </w:r>
-      <w:hyperlink w:history="1" r:id="rIdfkehuo6clqmmmgqjfkvkr">
+      <w:hyperlink w:history="1" r:id="rIds9oq6mc0hdqb5x4gtvemw">
         <w:r>
           <w:rPr>
             <w:rStyle w:val="Hyperlink"/>
@@ -6785,7 +6785,7 @@
         </w:rPr>
         <w:t xml:space="preserve">90　</w:t>
       </w:r>
-      <w:hyperlink w:history="1" r:id="rIdqbp_5wktx9um8ru7gf6cl">
+      <w:hyperlink w:history="1" r:id="rIdvii3hbeqy_uhww4z1j4l6">
         <w:r>
           <w:rPr>
             <w:rStyle w:val="Hyperlink"/>
@@ -6811,7 +6811,7 @@
         </w:rPr>
         <w:t xml:space="preserve">91　</w:t>
       </w:r>
-      <w:hyperlink w:history="1" r:id="rIdqei8gp9unwxbvwrswswgh">
+      <w:hyperlink w:history="1" r:id="rIdxoac0t1xtgjs4ysznqsxo">
         <w:r>
           <w:rPr>
             <w:rStyle w:val="Hyperlink"/>
@@ -6837,7 +6837,7 @@
         </w:rPr>
         <w:t xml:space="preserve">92　</w:t>
       </w:r>
-      <w:hyperlink w:history="1" r:id="rIdbt4hiw_la3nhlvcppa7c1">
+      <w:hyperlink w:history="1" r:id="rIdqugodc0m_rn4conokuxbg">
         <w:r>
           <w:rPr>
             <w:rStyle w:val="Hyperlink"/>
@@ -6863,7 +6863,7 @@
         </w:rPr>
         <w:t xml:space="preserve">93　</w:t>
       </w:r>
-      <w:hyperlink w:history="1" r:id="rIdhqeviundyrsg6j17qtwra">
+      <w:hyperlink w:history="1" r:id="rIddl7kzw_pze-gymdtil3zk">
         <w:r>
           <w:rPr>
             <w:rStyle w:val="Hyperlink"/>
@@ -6889,7 +6889,7 @@
         </w:rPr>
         <w:t xml:space="preserve">95　</w:t>
       </w:r>
-      <w:hyperlink w:history="1" r:id="rId-8gyup5wjgnlsohfndmox">
+      <w:hyperlink w:history="1" r:id="rIdyoqezayduo8jo0n-rsyo9">
         <w:r>
           <w:rPr>
             <w:rStyle w:val="Hyperlink"/>
@@ -6915,7 +6915,7 @@
         </w:rPr>
         <w:t xml:space="preserve">96　</w:t>
       </w:r>
-      <w:hyperlink w:history="1" r:id="rId_tq8mwcjcjhtzwunszl7l">
+      <w:hyperlink w:history="1" r:id="rIdufj5jkpivs3r1fpudlggg">
         <w:r>
           <w:rPr>
             <w:rStyle w:val="Hyperlink"/>
@@ -6941,7 +6941,7 @@
         </w:rPr>
         <w:t xml:space="preserve">97　</w:t>
       </w:r>
-      <w:hyperlink w:history="1" r:id="rIdeiwhfdevd1mg9kfwjq8oi">
+      <w:hyperlink w:history="1" r:id="rIdlq2hbhd1gak4ujwune4y0">
         <w:r>
           <w:rPr>
             <w:rStyle w:val="Hyperlink"/>
@@ -6967,7 +6967,7 @@
         </w:rPr>
         <w:t xml:space="preserve">98, 162　</w:t>
       </w:r>
-      <w:hyperlink w:history="1" r:id="rIdixtwmfslcfotganl7v1-z">
+      <w:hyperlink w:history="1" r:id="rIdbd5j70ngllnrkoxi7kijo">
         <w:r>
           <w:rPr>
             <w:rStyle w:val="Hyperlink"/>
@@ -6993,7 +6993,7 @@
         </w:rPr>
         <w:t xml:space="preserve">99　</w:t>
       </w:r>
-      <w:hyperlink w:history="1" r:id="rIdvtafq-ybzshvitqozbfcs">
+      <w:hyperlink w:history="1" r:id="rIdhwk2lcued_wt_ppgvteqb">
         <w:r>
           <w:rPr>
             <w:rStyle w:val="Hyperlink"/>
@@ -7019,7 +7019,7 @@
         </w:rPr>
         <w:t xml:space="preserve">100　</w:t>
       </w:r>
-      <w:hyperlink w:history="1" r:id="rIdcnpiy8fesjfhh03hx6m__">
+      <w:hyperlink w:history="1" r:id="rIdkjr9vkgm3o17wzhqznagd">
         <w:r>
           <w:rPr>
             <w:rStyle w:val="Hyperlink"/>
@@ -7045,7 +7045,7 @@
         </w:rPr>
         <w:t xml:space="preserve">101　</w:t>
       </w:r>
-      <w:hyperlink w:history="1" r:id="rId7muvk7thwz8ttbhjb156n">
+      <w:hyperlink w:history="1" r:id="rIdvjpi8mbrsopiqpnal1p7c">
         <w:r>
           <w:rPr>
             <w:rStyle w:val="Hyperlink"/>
@@ -7071,7 +7071,7 @@
         </w:rPr>
         <w:t xml:space="preserve">102, 110　</w:t>
       </w:r>
-      <w:hyperlink w:history="1" r:id="rIdwryslssqywagudjwaznsz">
+      <w:hyperlink w:history="1" r:id="rIdzzkxykzzhzbnk0fd5abii">
         <w:r>
           <w:rPr>
             <w:rStyle w:val="Hyperlink"/>
@@ -7097,7 +7097,7 @@
         </w:rPr>
         <w:t xml:space="preserve">103, 126　</w:t>
       </w:r>
-      <w:hyperlink w:history="1" r:id="rIdtaomehglvnvlxizljeaml">
+      <w:hyperlink w:history="1" r:id="rIddsmgokxilqjn75vlww84b">
         <w:r>
           <w:rPr>
             <w:rStyle w:val="Hyperlink"/>
@@ -7123,7 +7123,7 @@
         </w:rPr>
         <w:t xml:space="preserve">104　</w:t>
       </w:r>
-      <w:hyperlink w:history="1" r:id="rIdg7osws2wgd6smrnbngzzw">
+      <w:hyperlink w:history="1" r:id="rIdtpcquleyt_xvp3woyxzwy">
         <w:r>
           <w:rPr>
             <w:rStyle w:val="Hyperlink"/>
@@ -7149,7 +7149,7 @@
         </w:rPr>
         <w:t xml:space="preserve">106　</w:t>
       </w:r>
-      <w:hyperlink w:history="1" r:id="rIdc_mviqdk7ciyofduk6tij">
+      <w:hyperlink w:history="1" r:id="rIdcxul3msh-w4frsqedavtw">
         <w:r>
           <w:rPr>
             <w:rStyle w:val="Hyperlink"/>
@@ -7175,7 +7175,7 @@
         </w:rPr>
         <w:t xml:space="preserve">107　</w:t>
       </w:r>
-      <w:hyperlink w:history="1" r:id="rIdexild_j-7rbloij4ki6d2">
+      <w:hyperlink w:history="1" r:id="rIdbydgjxvknq90vydsked9o">
         <w:r>
           <w:rPr>
             <w:rStyle w:val="Hyperlink"/>
@@ -7201,7 +7201,7 @@
         </w:rPr>
         <w:t xml:space="preserve">108　</w:t>
       </w:r>
-      <w:hyperlink w:history="1" r:id="rIdkxqb-grl22aexjxvxdfzy">
+      <w:hyperlink w:history="1" r:id="rIdzu8pprcpz2t6yho59dlri">
         <w:r>
           <w:rPr>
             <w:rStyle w:val="Hyperlink"/>
@@ -7227,7 +7227,7 @@
         </w:rPr>
         <w:t xml:space="preserve">109　</w:t>
       </w:r>
-      <w:hyperlink w:history="1" r:id="rIdpxlahdcft_yf-fi2ffqnz">
+      <w:hyperlink w:history="1" r:id="rIdzd5kziksxuxgjgsvhxylk">
         <w:r>
           <w:rPr>
             <w:rStyle w:val="Hyperlink"/>
@@ -7253,7 +7253,7 @@
         </w:rPr>
         <w:t xml:space="preserve">111　</w:t>
       </w:r>
-      <w:hyperlink w:history="1" r:id="rIdumkio1p-zv6hvylwakh4_">
+      <w:hyperlink w:history="1" r:id="rIdi82b7ht6f-f4m65bjoqmc">
         <w:r>
           <w:rPr>
             <w:rStyle w:val="Hyperlink"/>
@@ -7279,7 +7279,7 @@
         </w:rPr>
         <w:t xml:space="preserve">112　</w:t>
       </w:r>
-      <w:hyperlink w:history="1" r:id="rIdmhfpffwomwywsih-djv6z">
+      <w:hyperlink w:history="1" r:id="rIdmxrdfiiy2ueoraubizpzw">
         <w:r>
           <w:rPr>
             <w:rStyle w:val="Hyperlink"/>
@@ -7305,7 +7305,7 @@
         </w:rPr>
         <w:t xml:space="preserve">113　</w:t>
       </w:r>
-      <w:hyperlink w:history="1" r:id="rIducva32seofcuwybtatamb">
+      <w:hyperlink w:history="1" r:id="rId6rxdwn8bd3xks5fdrsg9-">
         <w:r>
           <w:rPr>
             <w:rStyle w:val="Hyperlink"/>
@@ -7331,7 +7331,7 @@
         </w:rPr>
         <w:t xml:space="preserve">114　</w:t>
       </w:r>
-      <w:hyperlink w:history="1" r:id="rIdpcwsqatiawkwijqg1c0np">
+      <w:hyperlink w:history="1" r:id="rIdd9wpw64k0-z1qrid-q_gl">
         <w:r>
           <w:rPr>
             <w:rStyle w:val="Hyperlink"/>
@@ -7357,7 +7357,7 @@
         </w:rPr>
         <w:t xml:space="preserve">115　</w:t>
       </w:r>
-      <w:hyperlink w:history="1" r:id="rIdzpifqgoxisytqsydqvri_">
+      <w:hyperlink w:history="1" r:id="rIdzcbif722tclhrfljunarv">
         <w:r>
           <w:rPr>
             <w:rStyle w:val="Hyperlink"/>
@@ -7383,7 +7383,7 @@
         </w:rPr>
         <w:t xml:space="preserve">116　</w:t>
       </w:r>
-      <w:hyperlink w:history="1" r:id="rId8y6dghkw9f1idib7tgcs5">
+      <w:hyperlink w:history="1" r:id="rIdj7o2a4su6co0cjvjpp3a1">
         <w:r>
           <w:rPr>
             <w:rStyle w:val="Hyperlink"/>
@@ -7409,7 +7409,7 @@
         </w:rPr>
         <w:t xml:space="preserve">117　</w:t>
       </w:r>
-      <w:hyperlink w:history="1" r:id="rIdhye34fswmkozx8arozsgo">
+      <w:hyperlink w:history="1" r:id="rId_6baxxz8c5z8b3wseeseg">
         <w:r>
           <w:rPr>
             <w:rStyle w:val="Hyperlink"/>
@@ -7435,7 +7435,7 @@
         </w:rPr>
         <w:t xml:space="preserve">119　</w:t>
       </w:r>
-      <w:hyperlink w:history="1" r:id="rIdvnuio5mlaiw5dmax0bwuy">
+      <w:hyperlink w:history="1" r:id="rId43tuimccdetelpgfrcyyu">
         <w:r>
           <w:rPr>
             <w:rStyle w:val="Hyperlink"/>
@@ -7461,7 +7461,7 @@
         </w:rPr>
         <w:t xml:space="preserve">120　</w:t>
       </w:r>
-      <w:hyperlink w:history="1" r:id="rIdy67_g4ueuhuwoomqu7gij">
+      <w:hyperlink w:history="1" r:id="rIdygjdhfyavk-brw21veooz">
         <w:r>
           <w:rPr>
             <w:rStyle w:val="Hyperlink"/>
@@ -7487,7 +7487,7 @@
         </w:rPr>
         <w:t xml:space="preserve">121　</w:t>
       </w:r>
-      <w:hyperlink w:history="1" r:id="rIdikw-opyiysd-mfhpxaaf0">
+      <w:hyperlink w:history="1" r:id="rIdemvvabjngevggxph8-whh">
         <w:r>
           <w:rPr>
             <w:rStyle w:val="Hyperlink"/>
@@ -7513,7 +7513,7 @@
         </w:rPr>
         <w:t xml:space="preserve">122　</w:t>
       </w:r>
-      <w:hyperlink w:history="1" r:id="rIdcvf7l5egwhzjumkgxqnvo">
+      <w:hyperlink w:history="1" r:id="rId1q3tx_v8nxqmmpbbudwuo">
         <w:r>
           <w:rPr>
             <w:rStyle w:val="Hyperlink"/>
@@ -7539,7 +7539,7 @@
         </w:rPr>
         <w:t xml:space="preserve">123　</w:t>
       </w:r>
-      <w:hyperlink w:history="1" r:id="rIdfqhymckpb64qfnho7ye8c">
+      <w:hyperlink w:history="1" r:id="rIdi7ernazer08ezcfb3cvne">
         <w:r>
           <w:rPr>
             <w:rStyle w:val="Hyperlink"/>
@@ -7565,7 +7565,7 @@
         </w:rPr>
         <w:t xml:space="preserve">124　</w:t>
       </w:r>
-      <w:hyperlink w:history="1" r:id="rIdsprhtyyxfev0k7o7corg6">
+      <w:hyperlink w:history="1" r:id="rIda-q9mdtj4kjwz9qsozcsp">
         <w:r>
           <w:rPr>
             <w:rStyle w:val="Hyperlink"/>
@@ -7591,7 +7591,7 @@
         </w:rPr>
         <w:t xml:space="preserve">125　</w:t>
       </w:r>
-      <w:hyperlink w:history="1" r:id="rIdperxd61tldyffwuytcyz5">
+      <w:hyperlink w:history="1" r:id="rIdgdrmuprpoqpqzbyhbvxto">
         <w:r>
           <w:rPr>
             <w:rStyle w:val="Hyperlink"/>
@@ -7617,7 +7617,7 @@
         </w:rPr>
         <w:t xml:space="preserve">127　</w:t>
       </w:r>
-      <w:hyperlink w:history="1" r:id="rIdr7i1zbfghfddyjnr8azin">
+      <w:hyperlink w:history="1" r:id="rIdgfxuy6znzskrgoe5j_4ro">
         <w:r>
           <w:rPr>
             <w:rStyle w:val="Hyperlink"/>
@@ -7643,7 +7643,7 @@
         </w:rPr>
         <w:t xml:space="preserve">128　</w:t>
       </w:r>
-      <w:hyperlink w:history="1" r:id="rIdsefpt3gfp5ctimdzbw0pm">
+      <w:hyperlink w:history="1" r:id="rIdqspl10cg6t8xwd5nyfvcq">
         <w:r>
           <w:rPr>
             <w:rStyle w:val="Hyperlink"/>
@@ -7669,7 +7669,7 @@
         </w:rPr>
         <w:t xml:space="preserve">129　</w:t>
       </w:r>
-      <w:hyperlink w:history="1" r:id="rIdln-1mynvsm96h9nkxckig">
+      <w:hyperlink w:history="1" r:id="rIdlpv5kdcxxfar0kybmoxk_">
         <w:r>
           <w:rPr>
             <w:rStyle w:val="Hyperlink"/>
@@ -7695,7 +7695,7 @@
         </w:rPr>
         <w:t xml:space="preserve">130　</w:t>
       </w:r>
-      <w:hyperlink w:history="1" r:id="rId_7izykxcjouoc2vezoa4w">
+      <w:hyperlink w:history="1" r:id="rId511bzcztwwts1r69sm60g">
         <w:r>
           <w:rPr>
             <w:rStyle w:val="Hyperlink"/>
@@ -7721,7 +7721,7 @@
         </w:rPr>
         <w:t xml:space="preserve">131　</w:t>
       </w:r>
-      <w:hyperlink w:history="1" r:id="rIdtmeeptylaqkqbuoc4dtuc">
+      <w:hyperlink w:history="1" r:id="rIdquyfw6vb4jhjnsgg3piq8">
         <w:r>
           <w:rPr>
             <w:rStyle w:val="Hyperlink"/>
@@ -7747,7 +7747,7 @@
         </w:rPr>
         <w:t xml:space="preserve">132　</w:t>
       </w:r>
-      <w:hyperlink w:history="1" r:id="rIdtctiqh90rhgo4fen7cdow">
+      <w:hyperlink w:history="1" r:id="rIdbxaqxruwzszy5nujqrka9">
         <w:r>
           <w:rPr>
             <w:rStyle w:val="Hyperlink"/>
@@ -7773,7 +7773,7 @@
         </w:rPr>
         <w:t xml:space="preserve">133　</w:t>
       </w:r>
-      <w:hyperlink w:history="1" r:id="rIdr44kv8fqd2leer-mus65j">
+      <w:hyperlink w:history="1" r:id="rIdybyo5iwlih4dghj8b48lf">
         <w:r>
           <w:rPr>
             <w:rStyle w:val="Hyperlink"/>
@@ -7799,7 +7799,7 @@
         </w:rPr>
         <w:t xml:space="preserve">134, 144　</w:t>
       </w:r>
-      <w:hyperlink w:history="1" r:id="rIde9qmlxtsl0njdtnxi-gwh">
+      <w:hyperlink w:history="1" r:id="rIdhfwkfablqx1n1ad3dyd6e">
         <w:r>
           <w:rPr>
             <w:rStyle w:val="Hyperlink"/>
@@ -7825,7 +7825,7 @@
         </w:rPr>
         <w:t xml:space="preserve">135　</w:t>
       </w:r>
-      <w:hyperlink w:history="1" r:id="rIdfw05hnpuwf9cky9lznvra">
+      <w:hyperlink w:history="1" r:id="rIdckm3u2kjml4wdvl5gdwts">
         <w:r>
           <w:rPr>
             <w:rStyle w:val="Hyperlink"/>
@@ -7851,7 +7851,7 @@
         </w:rPr>
         <w:t xml:space="preserve">136　</w:t>
       </w:r>
-      <w:hyperlink w:history="1" r:id="rIdc355wevlgno3qikaoldmf">
+      <w:hyperlink w:history="1" r:id="rIdneosoqmiliatgt_srdjwl">
         <w:r>
           <w:rPr>
             <w:rStyle w:val="Hyperlink"/>
@@ -7877,7 +7877,7 @@
         </w:rPr>
         <w:t xml:space="preserve">137　</w:t>
       </w:r>
-      <w:hyperlink w:history="1" r:id="rIdg-qg-crl2ekd3iazqk309">
+      <w:hyperlink w:history="1" r:id="rIdlohy2xrkm5vztcgealk67">
         <w:r>
           <w:rPr>
             <w:rStyle w:val="Hyperlink"/>
@@ -7903,7 +7903,7 @@
         </w:rPr>
         <w:t xml:space="preserve">138　</w:t>
       </w:r>
-      <w:hyperlink w:history="1" r:id="rIdqkcul1w-vkouhx70ot8xl">
+      <w:hyperlink w:history="1" r:id="rIdzjtdhhyxojcjgbmveqkow">
         <w:r>
           <w:rPr>
             <w:rStyle w:val="Hyperlink"/>
@@ -7929,7 +7929,7 @@
         </w:rPr>
         <w:t xml:space="preserve">139　</w:t>
       </w:r>
-      <w:hyperlink w:history="1" r:id="rIdorsybezacsyqigumzoz9m">
+      <w:hyperlink w:history="1" r:id="rId7tvg_32zz6whfe6e6a-t9">
         <w:r>
           <w:rPr>
             <w:rStyle w:val="Hyperlink"/>
@@ -7955,7 +7955,7 @@
         </w:rPr>
         <w:t xml:space="preserve">140　</w:t>
       </w:r>
-      <w:hyperlink w:history="1" r:id="rIdkovftaxm5xweu9uegyk8r">
+      <w:hyperlink w:history="1" r:id="rIds2wtga0zwpbqzne-l39ez">
         <w:r>
           <w:rPr>
             <w:rStyle w:val="Hyperlink"/>
@@ -7981,7 +7981,7 @@
         </w:rPr>
         <w:t xml:space="preserve">141　</w:t>
       </w:r>
-      <w:hyperlink w:history="1" r:id="rIdz4srcooiin6ucso_trn1f">
+      <w:hyperlink w:history="1" r:id="rIdmqpl9rs5jmucb9yxhmuxh">
         <w:r>
           <w:rPr>
             <w:rStyle w:val="Hyperlink"/>
@@ -8007,7 +8007,7 @@
         </w:rPr>
         <w:t xml:space="preserve">143　</w:t>
       </w:r>
-      <w:hyperlink w:history="1" r:id="rIdt7jfouzzsw70s0qzcsgrr">
+      <w:hyperlink w:history="1" r:id="rIdq788uzilwmzapft8bk_uc">
         <w:r>
           <w:rPr>
             <w:rStyle w:val="Hyperlink"/>
@@ -8033,7 +8033,7 @@
         </w:rPr>
         <w:t xml:space="preserve">145　</w:t>
       </w:r>
-      <w:hyperlink w:history="1" r:id="rIdqr2_p6w3caqrvdaz4vgr4">
+      <w:hyperlink w:history="1" r:id="rIdwd6v7ow-jysxviut4ty_3">
         <w:r>
           <w:rPr>
             <w:rStyle w:val="Hyperlink"/>
@@ -8059,7 +8059,7 @@
         </w:rPr>
         <w:t xml:space="preserve">146　</w:t>
       </w:r>
-      <w:hyperlink w:history="1" r:id="rIdhb1o4e0a_gbvusnckeqjv">
+      <w:hyperlink w:history="1" r:id="rIdzx7rlo1nwfq3rcebgacm5">
         <w:r>
           <w:rPr>
             <w:rStyle w:val="Hyperlink"/>
@@ -8085,7 +8085,7 @@
         </w:rPr>
         <w:t xml:space="preserve">149　</w:t>
       </w:r>
-      <w:hyperlink w:history="1" r:id="rIdxoefi77pqx85380gn94ft">
+      <w:hyperlink w:history="1" r:id="rIdqoks8fr4-hwb4_eo4-r7b">
         <w:r>
           <w:rPr>
             <w:rStyle w:val="Hyperlink"/>
@@ -8111,7 +8111,7 @@
         </w:rPr>
         <w:t xml:space="preserve">150　</w:t>
       </w:r>
-      <w:hyperlink w:history="1" r:id="rId0ewzj9vxjbfpxzl8zcwvz">
+      <w:hyperlink w:history="1" r:id="rIdjp_-s93rm38eiztom5ttj">
         <w:r>
           <w:rPr>
             <w:rStyle w:val="Hyperlink"/>
@@ -8137,7 +8137,7 @@
         </w:rPr>
         <w:t xml:space="preserve">151　</w:t>
       </w:r>
-      <w:hyperlink w:history="1" r:id="rIdbos7rjuntjcoqh0dil-es">
+      <w:hyperlink w:history="1" r:id="rIdx6lc3wovsh8zu8mf2bbkk">
         <w:r>
           <w:rPr>
             <w:rStyle w:val="Hyperlink"/>
@@ -8163,7 +8163,7 @@
         </w:rPr>
         <w:t xml:space="preserve">152　</w:t>
       </w:r>
-      <w:hyperlink w:history="1" r:id="rIdvxrayeiger9n8zgvbwoyt">
+      <w:hyperlink w:history="1" r:id="rIdneaidxnoopzud0cr-zopg">
         <w:r>
           <w:rPr>
             <w:rStyle w:val="Hyperlink"/>
@@ -8189,7 +8189,7 @@
         </w:rPr>
         <w:t xml:space="preserve">154　</w:t>
       </w:r>
-      <w:hyperlink w:history="1" r:id="rIdibvueh3lu08-vxavvdrmw">
+      <w:hyperlink w:history="1" r:id="rIdhdlty5iimja2kmkdsajan">
         <w:r>
           <w:rPr>
             <w:rStyle w:val="Hyperlink"/>
@@ -8215,7 +8215,7 @@
         </w:rPr>
         <w:t xml:space="preserve">155　</w:t>
       </w:r>
-      <w:hyperlink w:history="1" r:id="rIdwqb24r4gzjcc8ehmu4mll">
+      <w:hyperlink w:history="1" r:id="rIdqk2m80ohsy_vawjtakhbl">
         <w:r>
           <w:rPr>
             <w:rStyle w:val="Hyperlink"/>
@@ -8241,7 +8241,7 @@
         </w:rPr>
         <w:t xml:space="preserve">156　</w:t>
       </w:r>
-      <w:hyperlink w:history="1" r:id="rId_tilb4ccdyrdah99vomkm">
+      <w:hyperlink w:history="1" r:id="rIdwkwhw_sp3ft1b6se4yhtn">
         <w:r>
           <w:rPr>
             <w:rStyle w:val="Hyperlink"/>
@@ -8267,7 +8267,7 @@
         </w:rPr>
         <w:t xml:space="preserve">157　</w:t>
       </w:r>
-      <w:hyperlink w:history="1" r:id="rId4fe4adiuqmwla6qprwubp">
+      <w:hyperlink w:history="1" r:id="rIdioxxqztb_lvbwvs0oyhap">
         <w:r>
           <w:rPr>
             <w:rStyle w:val="Hyperlink"/>
@@ -8293,7 +8293,7 @@
         </w:rPr>
         <w:t xml:space="preserve">158　</w:t>
       </w:r>
-      <w:hyperlink w:history="1" r:id="rIdspwan7u-ska6sg4umeyli">
+      <w:hyperlink w:history="1" r:id="rIdmt1dcj438vvcstb6dxaku">
         <w:r>
           <w:rPr>
             <w:rStyle w:val="Hyperlink"/>
@@ -8319,7 +8319,7 @@
         </w:rPr>
         <w:t xml:space="preserve">159　</w:t>
       </w:r>
-      <w:hyperlink w:history="1" r:id="rIdb7r0uln3muip1jpog052t">
+      <w:hyperlink w:history="1" r:id="rId8aga81y_adn9_dvkza6lk">
         <w:r>
           <w:rPr>
             <w:rStyle w:val="Hyperlink"/>
@@ -8345,7 +8345,7 @@
         </w:rPr>
         <w:t xml:space="preserve">160　</w:t>
       </w:r>
-      <w:hyperlink w:history="1" r:id="rIdxa59zdsv3vl1_zpmoownw">
+      <w:hyperlink w:history="1" r:id="rIdaj4uzygmif1mhoxgwrne-">
         <w:r>
           <w:rPr>
             <w:rStyle w:val="Hyperlink"/>
@@ -11403,7 +11403,7 @@
         </w:rPr>
         <w:t xml:space="preserve">1, 5, 23　</w:t>
       </w:r>
-      <w:hyperlink w:history="1" r:id="rIdr4cnar2ukxtdlqenbrwdm">
+      <w:hyperlink w:history="1" r:id="rIdbfpr3w_oed9igoyht8jvf">
         <w:r>
           <w:rPr>
             <w:rStyle w:val="Hyperlink"/>
@@ -11429,7 +11429,7 @@
         </w:rPr>
         <w:t xml:space="preserve">2, 3　</w:t>
       </w:r>
-      <w:hyperlink w:history="1" r:id="rIdifppu174noei3ox5wukmn">
+      <w:hyperlink w:history="1" r:id="rIdym-i3eyiy6qxkrl5zfpfk">
         <w:r>
           <w:rPr>
             <w:rStyle w:val="Hyperlink"/>
@@ -11455,7 +11455,7 @@
         </w:rPr>
         <w:t xml:space="preserve">4, 6　</w:t>
       </w:r>
-      <w:hyperlink w:history="1" r:id="rIdsgb3mwicph9v0jegwfp9d">
+      <w:hyperlink w:history="1" r:id="rIdsrqcfoqazqdsxaaup7tex">
         <w:r>
           <w:rPr>
             <w:rStyle w:val="Hyperlink"/>
@@ -11481,7 +11481,7 @@
         </w:rPr>
         <w:t xml:space="preserve">7　</w:t>
       </w:r>
-      <w:hyperlink w:history="1" r:id="rIdcmr3s5dkyg-k6yyfsoequ">
+      <w:hyperlink w:history="1" r:id="rIdaejryp8e9q_v0dgria-f7">
         <w:r>
           <w:rPr>
             <w:rStyle w:val="Hyperlink"/>
@@ -11507,7 +11507,7 @@
         </w:rPr>
         <w:t xml:space="preserve">8, 16　</w:t>
       </w:r>
-      <w:hyperlink w:history="1" r:id="rIdkuferpllnjffrksxvn7ma">
+      <w:hyperlink w:history="1" r:id="rIdwb6bgdytovx2ng4mxmpyy">
         <w:r>
           <w:rPr>
             <w:rStyle w:val="Hyperlink"/>
@@ -11533,7 +11533,7 @@
         </w:rPr>
         <w:t xml:space="preserve">9, 17　</w:t>
       </w:r>
-      <w:hyperlink w:history="1" r:id="rIdhunog-vngyeooxjdxs8qw">
+      <w:hyperlink w:history="1" r:id="rIdfr4llhxbbutephdq9hoz4">
         <w:r>
           <w:rPr>
             <w:rStyle w:val="Hyperlink"/>
@@ -11559,7 +11559,7 @@
         </w:rPr>
         <w:t xml:space="preserve">10　</w:t>
       </w:r>
-      <w:hyperlink w:history="1" r:id="rId4dlb1lv6_dvtowvwjhupp">
+      <w:hyperlink w:history="1" r:id="rIdvvvndmkwo3druqimgujdh">
         <w:r>
           <w:rPr>
             <w:rStyle w:val="Hyperlink"/>
@@ -11585,7 +11585,7 @@
         </w:rPr>
         <w:t xml:space="preserve">11　</w:t>
       </w:r>
-      <w:hyperlink w:history="1" r:id="rIdpx7xw-lsux75l60zu8cx9">
+      <w:hyperlink w:history="1" r:id="rIdnl7jjrfjuxzohfrp0y3hm">
         <w:r>
           <w:rPr>
             <w:rStyle w:val="Hyperlink"/>
@@ -11611,7 +11611,7 @@
         </w:rPr>
         <w:t xml:space="preserve">12　</w:t>
       </w:r>
-      <w:hyperlink w:history="1" r:id="rIdktbrd9ozuwdezqqxc3o5n">
+      <w:hyperlink w:history="1" r:id="rIdf16oumr2-5w78phmzko2c">
         <w:r>
           <w:rPr>
             <w:rStyle w:val="Hyperlink"/>
@@ -11637,7 +11637,7 @@
         </w:rPr>
         <w:t xml:space="preserve">13　</w:t>
       </w:r>
-      <w:hyperlink w:history="1" r:id="rIdfgrvlktpw8ruqibylppjn">
+      <w:hyperlink w:history="1" r:id="rIdwh3erpmq77ijmkvuy8t77">
         <w:r>
           <w:rPr>
             <w:rStyle w:val="Hyperlink"/>
@@ -11663,7 +11663,7 @@
         </w:rPr>
         <w:t xml:space="preserve">14　</w:t>
       </w:r>
-      <w:hyperlink w:history="1" r:id="rIdkzjvlnff1d8gv5ox0r3nj">
+      <w:hyperlink w:history="1" r:id="rIdltxpw3vczrdnq4xqssm1y">
         <w:r>
           <w:rPr>
             <w:rStyle w:val="Hyperlink"/>
@@ -11689,7 +11689,7 @@
         </w:rPr>
         <w:t xml:space="preserve">15　</w:t>
       </w:r>
-      <w:hyperlink w:history="1" r:id="rIdeqquvknch1povjxu137pr">
+      <w:hyperlink w:history="1" r:id="rIdtdvhary0fomzqopaznumb">
         <w:r>
           <w:rPr>
             <w:rStyle w:val="Hyperlink"/>
@@ -11715,7 +11715,7 @@
         </w:rPr>
         <w:t xml:space="preserve">18　</w:t>
       </w:r>
-      <w:hyperlink w:history="1" r:id="rIdme13nxwqgszvp2w6abbur">
+      <w:hyperlink w:history="1" r:id="rIdpnju1shomwr6vdopyzons">
         <w:r>
           <w:rPr>
             <w:rStyle w:val="Hyperlink"/>
@@ -11741,7 +11741,7 @@
         </w:rPr>
         <w:t xml:space="preserve">19　</w:t>
       </w:r>
-      <w:hyperlink w:history="1" r:id="rIduhuy4hawhcdf3yhveup0n">
+      <w:hyperlink w:history="1" r:id="rIdkku4je_cckygvzmygfq7x">
         <w:r>
           <w:rPr>
             <w:rStyle w:val="Hyperlink"/>
@@ -11767,7 +11767,7 @@
         </w:rPr>
         <w:t xml:space="preserve">20, 29　</w:t>
       </w:r>
-      <w:hyperlink w:history="1" r:id="rIdv_vqvmst__i1yp0cxz35_">
+      <w:hyperlink w:history="1" r:id="rId6lzslqmhsi06fxblcrrti">
         <w:r>
           <w:rPr>
             <w:rStyle w:val="Hyperlink"/>
@@ -11793,7 +11793,7 @@
         </w:rPr>
         <w:t xml:space="preserve">21　</w:t>
       </w:r>
-      <w:hyperlink w:history="1" r:id="rIdylc-dbycomc2o3xh3o9xf">
+      <w:hyperlink w:history="1" r:id="rIdge35qo0apmaly8cc7crb4">
         <w:r>
           <w:rPr>
             <w:rStyle w:val="Hyperlink"/>
@@ -11819,7 +11819,7 @@
         </w:rPr>
         <w:t xml:space="preserve">22　</w:t>
       </w:r>
-      <w:hyperlink w:history="1" r:id="rIdjtfccgidpojzh0ii2vv46">
+      <w:hyperlink w:history="1" r:id="rIdgqcsiau_1galjbhvhni3q">
         <w:r>
           <w:rPr>
             <w:rStyle w:val="Hyperlink"/>
@@ -11845,7 +11845,7 @@
         </w:rPr>
         <w:t xml:space="preserve">24　</w:t>
       </w:r>
-      <w:hyperlink w:history="1" r:id="rId8tdjiptswtnxazbi4y3rr">
+      <w:hyperlink w:history="1" r:id="rId6ggjpefj5pkupeq2_jeap">
         <w:r>
           <w:rPr>
             <w:rStyle w:val="Hyperlink"/>
@@ -11871,7 +11871,7 @@
         </w:rPr>
         <w:t xml:space="preserve">25, 26　</w:t>
       </w:r>
-      <w:hyperlink w:history="1" r:id="rIdfrul3xkbm8hulsih4bztz">
+      <w:hyperlink w:history="1" r:id="rIdsnhv6agsxs0akbrsjr-22">
         <w:r>
           <w:rPr>
             <w:rStyle w:val="Hyperlink"/>
@@ -11897,7 +11897,7 @@
         </w:rPr>
         <w:t xml:space="preserve">27　</w:t>
       </w:r>
-      <w:hyperlink w:history="1" r:id="rIdbz9vnjpvguf1qnlw_htl3">
+      <w:hyperlink w:history="1" r:id="rIdft1ng0gpfhsqlmpmcgj8x">
         <w:r>
           <w:rPr>
             <w:rStyle w:val="Hyperlink"/>
@@ -11923,7 +11923,7 @@
         </w:rPr>
         <w:t xml:space="preserve">28　</w:t>
       </w:r>
-      <w:hyperlink w:history="1" r:id="rIdwqe-tfsbo-7iq12fcqqef">
+      <w:hyperlink w:history="1" r:id="rIdiv9deu3ph2-lgidhqbqzc">
         <w:r>
           <w:rPr>
             <w:rStyle w:val="Hyperlink"/>
@@ -11949,7 +11949,7 @@
         </w:rPr>
         <w:t xml:space="preserve">30, 34　</w:t>
       </w:r>
-      <w:hyperlink w:history="1" r:id="rIdqbdd11b_ivktlx4o-ecwk">
+      <w:hyperlink w:history="1" r:id="rIdfro3v39j0el-ffvhcnzma">
         <w:r>
           <w:rPr>
             <w:rStyle w:val="Hyperlink"/>
@@ -11975,7 +11975,7 @@
         </w:rPr>
         <w:t xml:space="preserve">31　</w:t>
       </w:r>
-      <w:hyperlink w:history="1" r:id="rIdchetwsyyvyt_tkfmz-fah">
+      <w:hyperlink w:history="1" r:id="rId7rgtbjgsruklfmffjmi1z">
         <w:r>
           <w:rPr>
             <w:rStyle w:val="Hyperlink"/>
@@ -12001,7 +12001,7 @@
         </w:rPr>
         <w:t xml:space="preserve">32　</w:t>
       </w:r>
-      <w:hyperlink w:history="1" r:id="rIdndsms5wvphv4izlggr5q1">
+      <w:hyperlink w:history="1" r:id="rIdnyaax3n0-lmpcicf7_uno">
         <w:r>
           <w:rPr>
             <w:rStyle w:val="Hyperlink"/>
@@ -12027,7 +12027,7 @@
         </w:rPr>
         <w:t xml:space="preserve">33　</w:t>
       </w:r>
-      <w:hyperlink w:history="1" r:id="rIdhpob-ltxp2motxnaqb1k3">
+      <w:hyperlink w:history="1" r:id="rIdvlo6vqizbdds3j0pw7kys">
         <w:r>
           <w:rPr>
             <w:rStyle w:val="Hyperlink"/>
@@ -12053,7 +12053,7 @@
         </w:rPr>
         <w:t xml:space="preserve">35　</w:t>
       </w:r>
-      <w:hyperlink w:history="1" r:id="rIdzmo7s5ad4rjbowqtnxo3u">
+      <w:hyperlink w:history="1" r:id="rId-ag7lgtj9sqqulbywstbi">
         <w:r>
           <w:rPr>
             <w:rStyle w:val="Hyperlink"/>
@@ -12079,7 +12079,7 @@
         </w:rPr>
         <w:t xml:space="preserve">36　</w:t>
       </w:r>
-      <w:hyperlink w:history="1" r:id="rIdlw2qrwa57wjac05zbgwcv">
+      <w:hyperlink w:history="1" r:id="rIdobx2x4kl6fsk5sewoyy4h">
         <w:r>
           <w:rPr>
             <w:rStyle w:val="Hyperlink"/>
@@ -12105,7 +12105,7 @@
         </w:rPr>
         <w:t xml:space="preserve">37　</w:t>
       </w:r>
-      <w:hyperlink w:history="1" r:id="rIdzw-fxedqthan1s9peofqu">
+      <w:hyperlink w:history="1" r:id="rIdelqdbj9vhfbazmhili4hf">
         <w:r>
           <w:rPr>
             <w:rStyle w:val="Hyperlink"/>
@@ -12131,7 +12131,7 @@
         </w:rPr>
         <w:t xml:space="preserve">38　</w:t>
       </w:r>
-      <w:hyperlink w:history="1" r:id="rIdgetxjmlkf0eoxuezpmv8k">
+      <w:hyperlink w:history="1" r:id="rIdwflym1g52zaieghcylnfo">
         <w:r>
           <w:rPr>
             <w:rStyle w:val="Hyperlink"/>
@@ -12157,7 +12157,7 @@
         </w:rPr>
         <w:t xml:space="preserve">39　</w:t>
       </w:r>
-      <w:hyperlink w:history="1" r:id="rIdxux-yrcwwdqfv9xpxyhyh">
+      <w:hyperlink w:history="1" r:id="rIdnbfuudm5zkbxzjr_zitov">
         <w:r>
           <w:rPr>
             <w:rStyle w:val="Hyperlink"/>
@@ -12183,7 +12183,7 @@
         </w:rPr>
         <w:t xml:space="preserve">40, 41　</w:t>
       </w:r>
-      <w:hyperlink w:history="1" r:id="rId3vv5ae8jn-kg7_8q7hws9">
+      <w:hyperlink w:history="1" r:id="rId0tysvytbfqibc4xgarvzc">
         <w:r>
           <w:rPr>
             <w:rStyle w:val="Hyperlink"/>
@@ -12209,7 +12209,7 @@
         </w:rPr>
         <w:t xml:space="preserve">42　</w:t>
       </w:r>
-      <w:hyperlink w:history="1" r:id="rIdyha5ycuomchg0jvp-y7ar">
+      <w:hyperlink w:history="1" r:id="rIdfzq8t9bsdytvywsqkafbe">
         <w:r>
           <w:rPr>
             <w:rStyle w:val="Hyperlink"/>
@@ -12884,7 +12884,7 @@
         </w:rPr>
         <w:t xml:space="preserve">1, 4　</w:t>
       </w:r>
-      <w:hyperlink w:history="1" r:id="rId5chmxtd71ll5z5df_a3oz">
+      <w:hyperlink w:history="1" r:id="rIdtijjk_xx6-sg_1ivhzfc8">
         <w:r>
           <w:rPr>
             <w:rStyle w:val="Hyperlink"/>
@@ -12910,7 +12910,7 @@
         </w:rPr>
         <w:t xml:space="preserve">2, 9　</w:t>
       </w:r>
-      <w:hyperlink w:history="1" r:id="rIdwzynt3vxmwtbkooivts1e">
+      <w:hyperlink w:history="1" r:id="rIdwglbe6yv7yprup9bnxfoe">
         <w:r>
           <w:rPr>
             <w:rStyle w:val="Hyperlink"/>
@@ -12936,7 +12936,7 @@
         </w:rPr>
         <w:t xml:space="preserve">3　</w:t>
       </w:r>
-      <w:hyperlink w:history="1" r:id="rIdnci9ti5je1amjtlcxodjp">
+      <w:hyperlink w:history="1" r:id="rId-bmeosyuthbvzwedxwdzs">
         <w:r>
           <w:rPr>
             <w:rStyle w:val="Hyperlink"/>
@@ -12962,7 +12962,7 @@
         </w:rPr>
         <w:t xml:space="preserve">5　</w:t>
       </w:r>
-      <w:hyperlink w:history="1" r:id="rIdoto1dkf3zw-ag9ggomlto">
+      <w:hyperlink w:history="1" r:id="rIdwqbvzul_fqr2xvxmjaayu">
         <w:r>
           <w:rPr>
             <w:rStyle w:val="Hyperlink"/>
@@ -12988,7 +12988,7 @@
         </w:rPr>
         <w:t xml:space="preserve">6　</w:t>
       </w:r>
-      <w:hyperlink w:history="1" r:id="rIdelper4qehjgpieaxwb4gx">
+      <w:hyperlink w:history="1" r:id="rIdr-d_hr5pvtosbdtgbkqqf">
         <w:r>
           <w:rPr>
             <w:rStyle w:val="Hyperlink"/>
@@ -13014,7 +13014,7 @@
         </w:rPr>
         <w:t xml:space="preserve">7　</w:t>
       </w:r>
-      <w:hyperlink w:history="1" r:id="rIdncninbgkl7nt4gkas0ypa">
+      <w:hyperlink w:history="1" r:id="rIdlp0in-r2eq2quhbix5tag">
         <w:r>
           <w:rPr>
             <w:rStyle w:val="Hyperlink"/>
@@ -13040,7 +13040,7 @@
         </w:rPr>
         <w:t xml:space="preserve">8　</w:t>
       </w:r>
-      <w:hyperlink w:history="1" r:id="rIduzkbmhticu77pfrw46xcz">
+      <w:hyperlink w:history="1" r:id="rId_i0v7ibpftpor59wgyumg">
         <w:r>
           <w:rPr>
             <w:rStyle w:val="Hyperlink"/>
@@ -13210,6 +13210,24 @@
         </w:rPr>
         <w:t xml:space="preserve">7</w:t>
       </w:r>
+      <w:r>
+        <w:rPr>
+          <w:rFonts w:ascii="Microsoft JhengHei" w:cs="Microsoft JhengHei" w:eastAsia="Microsoft JhengHei" w:hAnsi="Microsoft JhengHei"/>
+          <w:sz w:val="22"/>
+          <w:szCs w:val="22"/>
+        </w:rPr>
+        <w:t xml:space="preserve"> </w:t>
+      </w:r>
+      <w:r>
+        <w:rPr>
+          <w:rFonts w:ascii="Microsoft JhengHei" w:cs="Microsoft JhengHei" w:eastAsia="Microsoft JhengHei" w:hAnsi="Microsoft JhengHei"/>
+          <w:color w:val="1F4E36"/>
+          <w:sz w:val="16"/>
+          <w:szCs w:val="16"/>
+          <w:vertAlign w:val="superscript"/>
+        </w:rPr>
+        <w:t xml:space="preserve">8</w:t>
+      </w:r>
     </w:p>
     <w:p>
       <w:pPr>
@@ -13242,7 +13260,7 @@
           <w:szCs w:val="16"/>
           <w:vertAlign w:val="superscript"/>
         </w:rPr>
-        <w:t xml:space="preserve">8</w:t>
+        <w:t xml:space="preserve">9</w:t>
       </w:r>
     </w:p>
     <w:p>
@@ -13276,24 +13294,6 @@
           <w:szCs w:val="16"/>
           <w:vertAlign w:val="superscript"/>
         </w:rPr>
-        <w:t xml:space="preserve">9</w:t>
-      </w:r>
-      <w:r>
-        <w:rPr>
-          <w:rFonts w:ascii="Microsoft JhengHei" w:cs="Microsoft JhengHei" w:eastAsia="Microsoft JhengHei" w:hAnsi="Microsoft JhengHei"/>
-          <w:sz w:val="22"/>
-          <w:szCs w:val="22"/>
-        </w:rPr>
-        <w:t xml:space="preserve"> </w:t>
-      </w:r>
-      <w:r>
-        <w:rPr>
-          <w:rFonts w:ascii="Microsoft JhengHei" w:cs="Microsoft JhengHei" w:eastAsia="Microsoft JhengHei" w:hAnsi="Microsoft JhengHei"/>
-          <w:color w:val="1F4E36"/>
-          <w:sz w:val="16"/>
-          <w:szCs w:val="16"/>
-          <w:vertAlign w:val="superscript"/>
-        </w:rPr>
         <w:t xml:space="preserve">10</w:t>
       </w:r>
       <w:r>
@@ -13313,6 +13313,42 @@
           <w:vertAlign w:val="superscript"/>
         </w:rPr>
         <w:t xml:space="preserve">11</w:t>
+      </w:r>
+      <w:r>
+        <w:rPr>
+          <w:rFonts w:ascii="Microsoft JhengHei" w:cs="Microsoft JhengHei" w:eastAsia="Microsoft JhengHei" w:hAnsi="Microsoft JhengHei"/>
+          <w:sz w:val="22"/>
+          <w:szCs w:val="22"/>
+        </w:rPr>
+        <w:t xml:space="preserve"> </w:t>
+      </w:r>
+      <w:r>
+        <w:rPr>
+          <w:rFonts w:ascii="Microsoft JhengHei" w:cs="Microsoft JhengHei" w:eastAsia="Microsoft JhengHei" w:hAnsi="Microsoft JhengHei"/>
+          <w:color w:val="1F4E36"/>
+          <w:sz w:val="16"/>
+          <w:szCs w:val="16"/>
+          <w:vertAlign w:val="superscript"/>
+        </w:rPr>
+        <w:t xml:space="preserve">12</w:t>
+      </w:r>
+      <w:r>
+        <w:rPr>
+          <w:rFonts w:ascii="Microsoft JhengHei" w:cs="Microsoft JhengHei" w:eastAsia="Microsoft JhengHei" w:hAnsi="Microsoft JhengHei"/>
+          <w:sz w:val="22"/>
+          <w:szCs w:val="22"/>
+        </w:rPr>
+        <w:t xml:space="preserve"> </w:t>
+      </w:r>
+      <w:r>
+        <w:rPr>
+          <w:rFonts w:ascii="Microsoft JhengHei" w:cs="Microsoft JhengHei" w:eastAsia="Microsoft JhengHei" w:hAnsi="Microsoft JhengHei"/>
+          <w:color w:val="1F4E36"/>
+          <w:sz w:val="16"/>
+          <w:szCs w:val="16"/>
+          <w:vertAlign w:val="superscript"/>
+        </w:rPr>
+        <w:t xml:space="preserve">13</w:t>
       </w:r>
     </w:p>
     <w:tbl>
@@ -13774,25 +13810,43 @@
           <w:szCs w:val="16"/>
           <w:vertAlign w:val="superscript"/>
         </w:rPr>
-        <w:t xml:space="preserve">12</w:t>
-      </w:r>
-      <w:r>
-        <w:rPr>
-          <w:rFonts w:ascii="Microsoft JhengHei" w:cs="Microsoft JhengHei" w:eastAsia="Microsoft JhengHei" w:hAnsi="Microsoft JhengHei"/>
-          <w:sz w:val="22"/>
-          <w:szCs w:val="22"/>
-        </w:rPr>
-        <w:t xml:space="preserve"> </w:t>
-      </w:r>
-      <w:r>
-        <w:rPr>
-          <w:rFonts w:ascii="Microsoft JhengHei" w:cs="Microsoft JhengHei" w:eastAsia="Microsoft JhengHei" w:hAnsi="Microsoft JhengHei"/>
-          <w:color w:val="1F4E36"/>
-          <w:sz w:val="16"/>
-          <w:szCs w:val="16"/>
-          <w:vertAlign w:val="superscript"/>
-        </w:rPr>
-        <w:t xml:space="preserve">13</w:t>
+        <w:t xml:space="preserve">14</w:t>
+      </w:r>
+      <w:r>
+        <w:rPr>
+          <w:rFonts w:ascii="Microsoft JhengHei" w:cs="Microsoft JhengHei" w:eastAsia="Microsoft JhengHei" w:hAnsi="Microsoft JhengHei"/>
+          <w:sz w:val="22"/>
+          <w:szCs w:val="22"/>
+        </w:rPr>
+        <w:t xml:space="preserve"> </w:t>
+      </w:r>
+      <w:r>
+        <w:rPr>
+          <w:rFonts w:ascii="Microsoft JhengHei" w:cs="Microsoft JhengHei" w:eastAsia="Microsoft JhengHei" w:hAnsi="Microsoft JhengHei"/>
+          <w:color w:val="1F4E36"/>
+          <w:sz w:val="16"/>
+          <w:szCs w:val="16"/>
+          <w:vertAlign w:val="superscript"/>
+        </w:rPr>
+        <w:t xml:space="preserve">15</w:t>
+      </w:r>
+      <w:r>
+        <w:rPr>
+          <w:rFonts w:ascii="Microsoft JhengHei" w:cs="Microsoft JhengHei" w:eastAsia="Microsoft JhengHei" w:hAnsi="Microsoft JhengHei"/>
+          <w:sz w:val="22"/>
+          <w:szCs w:val="22"/>
+        </w:rPr>
+        <w:t xml:space="preserve"> </w:t>
+      </w:r>
+      <w:r>
+        <w:rPr>
+          <w:rFonts w:ascii="Microsoft JhengHei" w:cs="Microsoft JhengHei" w:eastAsia="Microsoft JhengHei" w:hAnsi="Microsoft JhengHei"/>
+          <w:color w:val="1F4E36"/>
+          <w:sz w:val="16"/>
+          <w:szCs w:val="16"/>
+          <w:vertAlign w:val="superscript"/>
+        </w:rPr>
+        <w:t xml:space="preserve">16</w:t>
       </w:r>
     </w:p>
     <w:p>
@@ -13826,43 +13880,43 @@
           <w:szCs w:val="16"/>
           <w:vertAlign w:val="superscript"/>
         </w:rPr>
-        <w:t xml:space="preserve">14</w:t>
-      </w:r>
-      <w:r>
-        <w:rPr>
-          <w:rFonts w:ascii="Microsoft JhengHei" w:cs="Microsoft JhengHei" w:eastAsia="Microsoft JhengHei" w:hAnsi="Microsoft JhengHei"/>
-          <w:sz w:val="22"/>
-          <w:szCs w:val="22"/>
-        </w:rPr>
-        <w:t xml:space="preserve"> </w:t>
-      </w:r>
-      <w:r>
-        <w:rPr>
-          <w:rFonts w:ascii="Microsoft JhengHei" w:cs="Microsoft JhengHei" w:eastAsia="Microsoft JhengHei" w:hAnsi="Microsoft JhengHei"/>
-          <w:color w:val="1F4E36"/>
-          <w:sz w:val="16"/>
-          <w:szCs w:val="16"/>
-          <w:vertAlign w:val="superscript"/>
-        </w:rPr>
-        <w:t xml:space="preserve">15</w:t>
-      </w:r>
-      <w:r>
-        <w:rPr>
-          <w:rFonts w:ascii="Microsoft JhengHei" w:cs="Microsoft JhengHei" w:eastAsia="Microsoft JhengHei" w:hAnsi="Microsoft JhengHei"/>
-          <w:sz w:val="22"/>
-          <w:szCs w:val="22"/>
-        </w:rPr>
-        <w:t xml:space="preserve"> </w:t>
-      </w:r>
-      <w:r>
-        <w:rPr>
-          <w:rFonts w:ascii="Microsoft JhengHei" w:cs="Microsoft JhengHei" w:eastAsia="Microsoft JhengHei" w:hAnsi="Microsoft JhengHei"/>
-          <w:color w:val="1F4E36"/>
-          <w:sz w:val="16"/>
-          <w:szCs w:val="16"/>
-          <w:vertAlign w:val="superscript"/>
-        </w:rPr>
-        <w:t xml:space="preserve">16</w:t>
+        <w:t xml:space="preserve">17</w:t>
+      </w:r>
+      <w:r>
+        <w:rPr>
+          <w:rFonts w:ascii="Microsoft JhengHei" w:cs="Microsoft JhengHei" w:eastAsia="Microsoft JhengHei" w:hAnsi="Microsoft JhengHei"/>
+          <w:sz w:val="22"/>
+          <w:szCs w:val="22"/>
+        </w:rPr>
+        <w:t xml:space="preserve"> </w:t>
+      </w:r>
+      <w:r>
+        <w:rPr>
+          <w:rFonts w:ascii="Microsoft JhengHei" w:cs="Microsoft JhengHei" w:eastAsia="Microsoft JhengHei" w:hAnsi="Microsoft JhengHei"/>
+          <w:color w:val="1F4E36"/>
+          <w:sz w:val="16"/>
+          <w:szCs w:val="16"/>
+          <w:vertAlign w:val="superscript"/>
+        </w:rPr>
+        <w:t xml:space="preserve">18</w:t>
+      </w:r>
+      <w:r>
+        <w:rPr>
+          <w:rFonts w:ascii="Microsoft JhengHei" w:cs="Microsoft JhengHei" w:eastAsia="Microsoft JhengHei" w:hAnsi="Microsoft JhengHei"/>
+          <w:sz w:val="22"/>
+          <w:szCs w:val="22"/>
+        </w:rPr>
+        <w:t xml:space="preserve"> </w:t>
+      </w:r>
+      <w:r>
+        <w:rPr>
+          <w:rFonts w:ascii="Microsoft JhengHei" w:cs="Microsoft JhengHei" w:eastAsia="Microsoft JhengHei" w:hAnsi="Microsoft JhengHei"/>
+          <w:color w:val="1F4E36"/>
+          <w:sz w:val="16"/>
+          <w:szCs w:val="16"/>
+          <w:vertAlign w:val="superscript"/>
+        </w:rPr>
+        <w:t xml:space="preserve">19</w:t>
       </w:r>
     </w:p>
     <w:p>
@@ -13896,7 +13950,25 @@
           <w:szCs w:val="16"/>
           <w:vertAlign w:val="superscript"/>
         </w:rPr>
-        <w:t xml:space="preserve">17</w:t>
+        <w:t xml:space="preserve">20</w:t>
+      </w:r>
+      <w:r>
+        <w:rPr>
+          <w:rFonts w:ascii="Microsoft JhengHei" w:cs="Microsoft JhengHei" w:eastAsia="Microsoft JhengHei" w:hAnsi="Microsoft JhengHei"/>
+          <w:sz w:val="22"/>
+          <w:szCs w:val="22"/>
+        </w:rPr>
+        <w:t xml:space="preserve"> </w:t>
+      </w:r>
+      <w:r>
+        <w:rPr>
+          <w:rFonts w:ascii="Microsoft JhengHei" w:cs="Microsoft JhengHei" w:eastAsia="Microsoft JhengHei" w:hAnsi="Microsoft JhengHei"/>
+          <w:color w:val="1F4E36"/>
+          <w:sz w:val="16"/>
+          <w:szCs w:val="16"/>
+          <w:vertAlign w:val="superscript"/>
+        </w:rPr>
+        <w:t xml:space="preserve">21</w:t>
       </w:r>
     </w:p>
     <w:p>
@@ -13930,25 +14002,43 @@
           <w:szCs w:val="16"/>
           <w:vertAlign w:val="superscript"/>
         </w:rPr>
-        <w:t xml:space="preserve">18</w:t>
-      </w:r>
-      <w:r>
-        <w:rPr>
-          <w:rFonts w:ascii="Microsoft JhengHei" w:cs="Microsoft JhengHei" w:eastAsia="Microsoft JhengHei" w:hAnsi="Microsoft JhengHei"/>
-          <w:sz w:val="22"/>
-          <w:szCs w:val="22"/>
-        </w:rPr>
-        <w:t xml:space="preserve"> </w:t>
-      </w:r>
-      <w:r>
-        <w:rPr>
-          <w:rFonts w:ascii="Microsoft JhengHei" w:cs="Microsoft JhengHei" w:eastAsia="Microsoft JhengHei" w:hAnsi="Microsoft JhengHei"/>
-          <w:color w:val="1F4E36"/>
-          <w:sz w:val="16"/>
-          <w:szCs w:val="16"/>
-          <w:vertAlign w:val="superscript"/>
-        </w:rPr>
-        <w:t xml:space="preserve">19</w:t>
+        <w:t xml:space="preserve">22</w:t>
+      </w:r>
+      <w:r>
+        <w:rPr>
+          <w:rFonts w:ascii="Microsoft JhengHei" w:cs="Microsoft JhengHei" w:eastAsia="Microsoft JhengHei" w:hAnsi="Microsoft JhengHei"/>
+          <w:sz w:val="22"/>
+          <w:szCs w:val="22"/>
+        </w:rPr>
+        <w:t xml:space="preserve"> </w:t>
+      </w:r>
+      <w:r>
+        <w:rPr>
+          <w:rFonts w:ascii="Microsoft JhengHei" w:cs="Microsoft JhengHei" w:eastAsia="Microsoft JhengHei" w:hAnsi="Microsoft JhengHei"/>
+          <w:color w:val="1F4E36"/>
+          <w:sz w:val="16"/>
+          <w:szCs w:val="16"/>
+          <w:vertAlign w:val="superscript"/>
+        </w:rPr>
+        <w:t xml:space="preserve">23</w:t>
+      </w:r>
+      <w:r>
+        <w:rPr>
+          <w:rFonts w:ascii="Microsoft JhengHei" w:cs="Microsoft JhengHei" w:eastAsia="Microsoft JhengHei" w:hAnsi="Microsoft JhengHei"/>
+          <w:sz w:val="22"/>
+          <w:szCs w:val="22"/>
+        </w:rPr>
+        <w:t xml:space="preserve"> </w:t>
+      </w:r>
+      <w:r>
+        <w:rPr>
+          <w:rFonts w:ascii="Microsoft JhengHei" w:cs="Microsoft JhengHei" w:eastAsia="Microsoft JhengHei" w:hAnsi="Microsoft JhengHei"/>
+          <w:color w:val="1F4E36"/>
+          <w:sz w:val="16"/>
+          <w:szCs w:val="16"/>
+          <w:vertAlign w:val="superscript"/>
+        </w:rPr>
+        <w:t xml:space="preserve">24</w:t>
       </w:r>
     </w:p>
     <w:p>
@@ -13982,25 +14072,43 @@
           <w:szCs w:val="16"/>
           <w:vertAlign w:val="superscript"/>
         </w:rPr>
-        <w:t xml:space="preserve">20</w:t>
-      </w:r>
-      <w:r>
-        <w:rPr>
-          <w:rFonts w:ascii="Microsoft JhengHei" w:cs="Microsoft JhengHei" w:eastAsia="Microsoft JhengHei" w:hAnsi="Microsoft JhengHei"/>
-          <w:sz w:val="22"/>
-          <w:szCs w:val="22"/>
-        </w:rPr>
-        <w:t xml:space="preserve"> </w:t>
-      </w:r>
-      <w:r>
-        <w:rPr>
-          <w:rFonts w:ascii="Microsoft JhengHei" w:cs="Microsoft JhengHei" w:eastAsia="Microsoft JhengHei" w:hAnsi="Microsoft JhengHei"/>
-          <w:color w:val="1F4E36"/>
-          <w:sz w:val="16"/>
-          <w:szCs w:val="16"/>
-          <w:vertAlign w:val="superscript"/>
-        </w:rPr>
-        <w:t xml:space="preserve">21</w:t>
+        <w:t xml:space="preserve">25</w:t>
+      </w:r>
+      <w:r>
+        <w:rPr>
+          <w:rFonts w:ascii="Microsoft JhengHei" w:cs="Microsoft JhengHei" w:eastAsia="Microsoft JhengHei" w:hAnsi="Microsoft JhengHei"/>
+          <w:sz w:val="22"/>
+          <w:szCs w:val="22"/>
+        </w:rPr>
+        <w:t xml:space="preserve"> </w:t>
+      </w:r>
+      <w:r>
+        <w:rPr>
+          <w:rFonts w:ascii="Microsoft JhengHei" w:cs="Microsoft JhengHei" w:eastAsia="Microsoft JhengHei" w:hAnsi="Microsoft JhengHei"/>
+          <w:color w:val="1F4E36"/>
+          <w:sz w:val="16"/>
+          <w:szCs w:val="16"/>
+          <w:vertAlign w:val="superscript"/>
+        </w:rPr>
+        <w:t xml:space="preserve">26</w:t>
+      </w:r>
+      <w:r>
+        <w:rPr>
+          <w:rFonts w:ascii="Microsoft JhengHei" w:cs="Microsoft JhengHei" w:eastAsia="Microsoft JhengHei" w:hAnsi="Microsoft JhengHei"/>
+          <w:sz w:val="22"/>
+          <w:szCs w:val="22"/>
+        </w:rPr>
+        <w:t xml:space="preserve"> </w:t>
+      </w:r>
+      <w:r>
+        <w:rPr>
+          <w:rFonts w:ascii="Microsoft JhengHei" w:cs="Microsoft JhengHei" w:eastAsia="Microsoft JhengHei" w:hAnsi="Microsoft JhengHei"/>
+          <w:color w:val="1F4E36"/>
+          <w:sz w:val="16"/>
+          <w:szCs w:val="16"/>
+          <w:vertAlign w:val="superscript"/>
+        </w:rPr>
+        <w:t xml:space="preserve">27</w:t>
       </w:r>
     </w:p>
     <w:p>
@@ -14034,7 +14142,7 @@
           <w:szCs w:val="16"/>
           <w:vertAlign w:val="superscript"/>
         </w:rPr>
-        <w:t xml:space="preserve">22</w:t>
+        <w:t xml:space="preserve">28</w:t>
       </w:r>
     </w:p>
     <w:p>
@@ -14058,53 +14166,35 @@
           <w:sz w:val="22"/>
           <w:szCs w:val="22"/>
         </w:rPr>
-        <w:t xml:space="preserve">本校應積極支持教師參與教育局提供之專業培訓，以確保具備推行兩科所需的專業能力。各培訓課程的要求如下表：</w:t>
-      </w:r>
-      <w:r>
-        <w:rPr>
-          <w:rFonts w:ascii="Microsoft JhengHei" w:cs="Microsoft JhengHei" w:eastAsia="Microsoft JhengHei" w:hAnsi="Microsoft JhengHei"/>
-          <w:color w:val="1F4E36"/>
-          <w:sz w:val="16"/>
-          <w:szCs w:val="16"/>
-          <w:vertAlign w:val="superscript"/>
-        </w:rPr>
-        <w:t xml:space="preserve">23</w:t>
-      </w:r>
-      <w:r>
-        <w:rPr>
-          <w:rFonts w:ascii="Microsoft JhengHei" w:cs="Microsoft JhengHei" w:eastAsia="Microsoft JhengHei" w:hAnsi="Microsoft JhengHei"/>
-          <w:sz w:val="22"/>
-          <w:szCs w:val="22"/>
-        </w:rPr>
-        <w:t xml:space="preserve"> </w:t>
-      </w:r>
-      <w:r>
-        <w:rPr>
-          <w:rFonts w:ascii="Microsoft JhengHei" w:cs="Microsoft JhengHei" w:eastAsia="Microsoft JhengHei" w:hAnsi="Microsoft JhengHei"/>
-          <w:color w:val="1F4E36"/>
-          <w:sz w:val="16"/>
-          <w:szCs w:val="16"/>
-          <w:vertAlign w:val="superscript"/>
-        </w:rPr>
-        <w:t xml:space="preserve">24</w:t>
-      </w:r>
-      <w:r>
-        <w:rPr>
-          <w:rFonts w:ascii="Microsoft JhengHei" w:cs="Microsoft JhengHei" w:eastAsia="Microsoft JhengHei" w:hAnsi="Microsoft JhengHei"/>
-          <w:sz w:val="22"/>
-          <w:szCs w:val="22"/>
-        </w:rPr>
-        <w:t xml:space="preserve"> </w:t>
-      </w:r>
-      <w:r>
-        <w:rPr>
-          <w:rFonts w:ascii="Microsoft JhengHei" w:cs="Microsoft JhengHei" w:eastAsia="Microsoft JhengHei" w:hAnsi="Microsoft JhengHei"/>
-          <w:color w:val="1F4E36"/>
-          <w:sz w:val="16"/>
-          <w:szCs w:val="16"/>
-          <w:vertAlign w:val="superscript"/>
-        </w:rPr>
-        <w:t xml:space="preserve">25</w:t>
+        <w:t xml:space="preserve">本校應積極支持教師參與教育局提供之專業培訓，以確保具備推行兩科所需的專業能力。</w:t>
+      </w:r>
+      <w:r>
+        <w:rPr>
+          <w:rFonts w:ascii="Microsoft JhengHei" w:cs="Microsoft JhengHei" w:eastAsia="Microsoft JhengHei" w:hAnsi="Microsoft JhengHei"/>
+          <w:color w:val="1F4E36"/>
+          <w:sz w:val="16"/>
+          <w:szCs w:val="16"/>
+          <w:vertAlign w:val="superscript"/>
+        </w:rPr>
+        <w:t xml:space="preserve">29</w:t>
+      </w:r>
+      <w:r>
+        <w:rPr>
+          <w:rFonts w:ascii="Microsoft JhengHei" w:cs="Microsoft JhengHei" w:eastAsia="Microsoft JhengHei" w:hAnsi="Microsoft JhengHei"/>
+          <w:sz w:val="22"/>
+          <w:szCs w:val="22"/>
+        </w:rPr>
+        <w:t xml:space="preserve"> </w:t>
+      </w:r>
+      <w:r>
+        <w:rPr>
+          <w:rFonts w:ascii="Microsoft JhengHei" w:cs="Microsoft JhengHei" w:eastAsia="Microsoft JhengHei" w:hAnsi="Microsoft JhengHei"/>
+          <w:color w:val="1F4E36"/>
+          <w:sz w:val="16"/>
+          <w:szCs w:val="16"/>
+          <w:vertAlign w:val="superscript"/>
+        </w:rPr>
+        <w:t xml:space="preserve">30</w:t>
       </w:r>
     </w:p>
     <w:tbl>
@@ -14357,336 +14447,6 @@
           </w:p>
         </w:tc>
       </w:tr>
-      <w:tr>
-        <w:tc>
-          <w:tcPr>
-            <w:tcW w:type="dxa" w:w="2256"/>
-            <w:tcBorders>
-              <w:top w:val="single" w:color="BBBBBB" w:sz="1"/>
-              <w:left w:val="single" w:color="BBBBBB" w:sz="1"/>
-              <w:bottom w:val="single" w:color="BBBBBB" w:sz="1"/>
-              <w:right w:val="single" w:color="BBBBBB" w:sz="1"/>
-            </w:tcBorders>
-            <w:tcMar>
-              <w:top w:type="dxa" w:w="80"/>
-              <w:left w:type="dxa" w:w="120"/>
-              <w:bottom w:type="dxa" w:w="80"/>
-              <w:right w:type="dxa" w:w="120"/>
-            </w:tcMar>
-          </w:tcPr>
-          <w:p>
-            <w:r>
-              <w:rPr>
-                <w:rFonts w:ascii="Microsoft JhengHei" w:cs="Microsoft JhengHei" w:eastAsia="Microsoft JhengHei" w:hAnsi="Microsoft JhengHei"/>
-                <w:sz w:val="20"/>
-                <w:szCs w:val="20"/>
-              </w:rPr>
-              <w:t xml:space="preserve">小學人文科</w:t>
-            </w:r>
-          </w:p>
-        </w:tc>
-        <w:tc>
-          <w:tcPr>
-            <w:tcW w:type="dxa" w:w="2256"/>
-            <w:tcBorders>
-              <w:top w:val="single" w:color="BBBBBB" w:sz="1"/>
-              <w:left w:val="single" w:color="BBBBBB" w:sz="1"/>
-              <w:bottom w:val="single" w:color="BBBBBB" w:sz="1"/>
-              <w:right w:val="single" w:color="BBBBBB" w:sz="1"/>
-            </w:tcBorders>
-            <w:tcMar>
-              <w:top w:type="dxa" w:w="80"/>
-              <w:left w:type="dxa" w:w="120"/>
-              <w:bottom w:type="dxa" w:w="80"/>
-              <w:right w:type="dxa" w:w="120"/>
-            </w:tcMar>
-          </w:tcPr>
-          <w:p>
-            <w:r>
-              <w:rPr>
-                <w:rFonts w:ascii="Microsoft JhengHei" w:cs="Microsoft JhengHei" w:eastAsia="Microsoft JhengHei" w:hAnsi="Microsoft JhengHei"/>
-                <w:sz w:val="20"/>
-                <w:szCs w:val="20"/>
-              </w:rPr>
-              <w:t xml:space="preserve">小學人文科課程領導專業培訓證書課程</w:t>
-            </w:r>
-          </w:p>
-        </w:tc>
-        <w:tc>
-          <w:tcPr>
-            <w:tcW w:type="dxa" w:w="2256"/>
-            <w:tcBorders>
-              <w:top w:val="single" w:color="BBBBBB" w:sz="1"/>
-              <w:left w:val="single" w:color="BBBBBB" w:sz="1"/>
-              <w:bottom w:val="single" w:color="BBBBBB" w:sz="1"/>
-              <w:right w:val="single" w:color="BBBBBB" w:sz="1"/>
-            </w:tcBorders>
-            <w:tcMar>
-              <w:top w:type="dxa" w:w="80"/>
-              <w:left w:type="dxa" w:w="120"/>
-              <w:bottom w:type="dxa" w:w="80"/>
-              <w:right w:type="dxa" w:w="120"/>
-            </w:tcMar>
-          </w:tcPr>
-          <w:p>
-            <w:r>
-              <w:rPr>
-                <w:rFonts w:ascii="Microsoft JhengHei" w:cs="Microsoft JhengHei" w:eastAsia="Microsoft JhengHei" w:hAnsi="Microsoft JhengHei"/>
-                <w:sz w:val="20"/>
-                <w:szCs w:val="20"/>
-              </w:rPr>
-              <w:t xml:space="preserve">30小時</w:t>
-            </w:r>
-          </w:p>
-        </w:tc>
-        <w:tc>
-          <w:tcPr>
-            <w:tcW w:type="dxa" w:w="2256"/>
-            <w:tcBorders>
-              <w:top w:val="single" w:color="BBBBBB" w:sz="1"/>
-              <w:left w:val="single" w:color="BBBBBB" w:sz="1"/>
-              <w:bottom w:val="single" w:color="BBBBBB" w:sz="1"/>
-              <w:right w:val="single" w:color="BBBBBB" w:sz="1"/>
-            </w:tcBorders>
-            <w:tcMar>
-              <w:top w:type="dxa" w:w="80"/>
-              <w:left w:type="dxa" w:w="120"/>
-              <w:bottom w:type="dxa" w:w="80"/>
-              <w:right w:type="dxa" w:w="120"/>
-            </w:tcMar>
-          </w:tcPr>
-          <w:p>
-            <w:r>
-              <w:rPr>
-                <w:rFonts w:ascii="Microsoft JhengHei" w:cs="Microsoft JhengHei" w:eastAsia="Microsoft JhengHei" w:hAnsi="Microsoft JhengHei"/>
-                <w:sz w:val="20"/>
-                <w:szCs w:val="20"/>
-              </w:rPr>
-              <w:t xml:space="preserve">教育局於2025/26學年推出；本校應鼓勵人文科科主任報名</w:t>
-            </w:r>
-          </w:p>
-        </w:tc>
-      </w:tr>
-      <w:tr>
-        <w:tc>
-          <w:tcPr>
-            <w:tcW w:type="dxa" w:w="2256"/>
-            <w:tcBorders>
-              <w:top w:val="single" w:color="BBBBBB" w:sz="1"/>
-              <w:left w:val="single" w:color="BBBBBB" w:sz="1"/>
-              <w:bottom w:val="single" w:color="BBBBBB" w:sz="1"/>
-              <w:right w:val="single" w:color="BBBBBB" w:sz="1"/>
-            </w:tcBorders>
-            <w:tcMar>
-              <w:top w:type="dxa" w:w="80"/>
-              <w:left w:type="dxa" w:w="120"/>
-              <w:bottom w:type="dxa" w:w="80"/>
-              <w:right w:type="dxa" w:w="120"/>
-            </w:tcMar>
-          </w:tcPr>
-          <w:p>
-            <w:r>
-              <w:rPr>
-                <w:rFonts w:ascii="Microsoft JhengHei" w:cs="Microsoft JhengHei" w:eastAsia="Microsoft JhengHei" w:hAnsi="Microsoft JhengHei"/>
-                <w:sz w:val="20"/>
-                <w:szCs w:val="20"/>
-              </w:rPr>
-              <w:t xml:space="preserve">小學科學科</w:t>
-            </w:r>
-          </w:p>
-        </w:tc>
-        <w:tc>
-          <w:tcPr>
-            <w:tcW w:type="dxa" w:w="2256"/>
-            <w:tcBorders>
-              <w:top w:val="single" w:color="BBBBBB" w:sz="1"/>
-              <w:left w:val="single" w:color="BBBBBB" w:sz="1"/>
-              <w:bottom w:val="single" w:color="BBBBBB" w:sz="1"/>
-              <w:right w:val="single" w:color="BBBBBB" w:sz="1"/>
-            </w:tcBorders>
-            <w:tcMar>
-              <w:top w:type="dxa" w:w="80"/>
-              <w:left w:type="dxa" w:w="120"/>
-              <w:bottom w:type="dxa" w:w="80"/>
-              <w:right w:type="dxa" w:w="120"/>
-            </w:tcMar>
-          </w:tcPr>
-          <w:p>
-            <w:r>
-              <w:rPr>
-                <w:rFonts w:ascii="Microsoft JhengHei" w:cs="Microsoft JhengHei" w:eastAsia="Microsoft JhengHei" w:hAnsi="Microsoft JhengHei"/>
-                <w:sz w:val="20"/>
-                <w:szCs w:val="20"/>
-              </w:rPr>
-              <w:t xml:space="preserve">小學科學教師專業培訓證書課程</w:t>
-            </w:r>
-          </w:p>
-        </w:tc>
-        <w:tc>
-          <w:tcPr>
-            <w:tcW w:type="dxa" w:w="2256"/>
-            <w:tcBorders>
-              <w:top w:val="single" w:color="BBBBBB" w:sz="1"/>
-              <w:left w:val="single" w:color="BBBBBB" w:sz="1"/>
-              <w:bottom w:val="single" w:color="BBBBBB" w:sz="1"/>
-              <w:right w:val="single" w:color="BBBBBB" w:sz="1"/>
-            </w:tcBorders>
-            <w:tcMar>
-              <w:top w:type="dxa" w:w="80"/>
-              <w:left w:type="dxa" w:w="120"/>
-              <w:bottom w:type="dxa" w:w="80"/>
-              <w:right w:type="dxa" w:w="120"/>
-            </w:tcMar>
-          </w:tcPr>
-          <w:p>
-            <w:r>
-              <w:rPr>
-                <w:rFonts w:ascii="Microsoft JhengHei" w:cs="Microsoft JhengHei" w:eastAsia="Microsoft JhengHei" w:hAnsi="Microsoft JhengHei"/>
-                <w:sz w:val="20"/>
-                <w:szCs w:val="20"/>
-              </w:rPr>
-              <w:t xml:space="preserve">30小時（其中選擇性必修課程須修讀最少兩個課程，共12小時）</w:t>
-            </w:r>
-          </w:p>
-        </w:tc>
-        <w:tc>
-          <w:tcPr>
-            <w:tcW w:type="dxa" w:w="2256"/>
-            <w:tcBorders>
-              <w:top w:val="single" w:color="BBBBBB" w:sz="1"/>
-              <w:left w:val="single" w:color="BBBBBB" w:sz="1"/>
-              <w:bottom w:val="single" w:color="BBBBBB" w:sz="1"/>
-              <w:right w:val="single" w:color="BBBBBB" w:sz="1"/>
-            </w:tcBorders>
-            <w:tcMar>
-              <w:top w:type="dxa" w:w="80"/>
-              <w:left w:type="dxa" w:w="120"/>
-              <w:bottom w:type="dxa" w:w="80"/>
-              <w:right w:type="dxa" w:w="120"/>
-            </w:tcMar>
-          </w:tcPr>
-          <w:p>
-            <w:r>
-              <w:rPr>
-                <w:rFonts w:ascii="Microsoft JhengHei" w:cs="Microsoft JhengHei" w:eastAsia="Microsoft JhengHei" w:hAnsi="Microsoft JhengHei"/>
-                <w:sz w:val="20"/>
-                <w:szCs w:val="20"/>
-              </w:rPr>
-              <w:t xml:space="preserve">完成後方可申請課程領導培訓</w:t>
-            </w:r>
-          </w:p>
-        </w:tc>
-      </w:tr>
-      <w:tr>
-        <w:tc>
-          <w:tcPr>
-            <w:tcW w:type="dxa" w:w="2256"/>
-            <w:tcBorders>
-              <w:top w:val="single" w:color="BBBBBB" w:sz="1"/>
-              <w:left w:val="single" w:color="BBBBBB" w:sz="1"/>
-              <w:bottom w:val="single" w:color="BBBBBB" w:sz="1"/>
-              <w:right w:val="single" w:color="BBBBBB" w:sz="1"/>
-            </w:tcBorders>
-            <w:tcMar>
-              <w:top w:type="dxa" w:w="80"/>
-              <w:left w:type="dxa" w:w="120"/>
-              <w:bottom w:type="dxa" w:w="80"/>
-              <w:right w:type="dxa" w:w="120"/>
-            </w:tcMar>
-          </w:tcPr>
-          <w:p>
-            <w:r>
-              <w:rPr>
-                <w:rFonts w:ascii="Microsoft JhengHei" w:cs="Microsoft JhengHei" w:eastAsia="Microsoft JhengHei" w:hAnsi="Microsoft JhengHei"/>
-                <w:sz w:val="20"/>
-                <w:szCs w:val="20"/>
-              </w:rPr>
-              <w:t xml:space="preserve">小學科學科</w:t>
-            </w:r>
-          </w:p>
-        </w:tc>
-        <w:tc>
-          <w:tcPr>
-            <w:tcW w:type="dxa" w:w="2256"/>
-            <w:tcBorders>
-              <w:top w:val="single" w:color="BBBBBB" w:sz="1"/>
-              <w:left w:val="single" w:color="BBBBBB" w:sz="1"/>
-              <w:bottom w:val="single" w:color="BBBBBB" w:sz="1"/>
-              <w:right w:val="single" w:color="BBBBBB" w:sz="1"/>
-            </w:tcBorders>
-            <w:tcMar>
-              <w:top w:type="dxa" w:w="80"/>
-              <w:left w:type="dxa" w:w="120"/>
-              <w:bottom w:type="dxa" w:w="80"/>
-              <w:right w:type="dxa" w:w="120"/>
-            </w:tcMar>
-          </w:tcPr>
-          <w:p>
-            <w:r>
-              <w:rPr>
-                <w:rFonts w:ascii="Microsoft JhengHei" w:cs="Microsoft JhengHei" w:eastAsia="Microsoft JhengHei" w:hAnsi="Microsoft JhengHei"/>
-                <w:sz w:val="20"/>
-                <w:szCs w:val="20"/>
-              </w:rPr>
-              <w:t xml:space="preserve">小學科學課程領導專業培訓證書課程</w:t>
-            </w:r>
-          </w:p>
-        </w:tc>
-        <w:tc>
-          <w:tcPr>
-            <w:tcW w:type="dxa" w:w="2256"/>
-            <w:tcBorders>
-              <w:top w:val="single" w:color="BBBBBB" w:sz="1"/>
-              <w:left w:val="single" w:color="BBBBBB" w:sz="1"/>
-              <w:bottom w:val="single" w:color="BBBBBB" w:sz="1"/>
-              <w:right w:val="single" w:color="BBBBBB" w:sz="1"/>
-            </w:tcBorders>
-            <w:tcMar>
-              <w:top w:type="dxa" w:w="80"/>
-              <w:left w:type="dxa" w:w="120"/>
-              <w:bottom w:type="dxa" w:w="80"/>
-              <w:right w:type="dxa" w:w="120"/>
-            </w:tcMar>
-          </w:tcPr>
-          <w:p>
-            <w:r>
-              <w:rPr>
-                <w:rFonts w:ascii="Microsoft JhengHei" w:cs="Microsoft JhengHei" w:eastAsia="Microsoft JhengHei" w:hAnsi="Microsoft JhengHei"/>
-                <w:sz w:val="20"/>
-                <w:szCs w:val="20"/>
-              </w:rPr>
-              <w:t xml:space="preserve">15小時</w:t>
-            </w:r>
-          </w:p>
-        </w:tc>
-        <w:tc>
-          <w:tcPr>
-            <w:tcW w:type="dxa" w:w="2256"/>
-            <w:tcBorders>
-              <w:top w:val="single" w:color="BBBBBB" w:sz="1"/>
-              <w:left w:val="single" w:color="BBBBBB" w:sz="1"/>
-              <w:bottom w:val="single" w:color="BBBBBB" w:sz="1"/>
-              <w:right w:val="single" w:color="BBBBBB" w:sz="1"/>
-            </w:tcBorders>
-            <w:tcMar>
-              <w:top w:type="dxa" w:w="80"/>
-              <w:left w:type="dxa" w:w="120"/>
-              <w:bottom w:type="dxa" w:w="80"/>
-              <w:right w:type="dxa" w:w="120"/>
-            </w:tcMar>
-          </w:tcPr>
-          <w:p>
-            <w:r>
-              <w:rPr>
-                <w:rFonts w:ascii="Microsoft JhengHei" w:cs="Microsoft JhengHei" w:eastAsia="Microsoft JhengHei" w:hAnsi="Microsoft JhengHei"/>
-                <w:sz w:val="20"/>
-                <w:szCs w:val="20"/>
-              </w:rPr>
-              <w:t xml:space="preserve">申請者須先完成並獲得「小學科學教師專業培訓證書」（30小時）</w:t>
-            </w:r>
-          </w:p>
-        </w:tc>
-      </w:tr>
     </w:tbl>
     <w:p>
       <w:pPr>
@@ -14749,7 +14509,7 @@
           <w:szCs w:val="16"/>
           <w:vertAlign w:val="superscript"/>
         </w:rPr>
-        <w:t xml:space="preserve">26</w:t>
+        <w:t xml:space="preserve">31</w:t>
       </w:r>
     </w:p>
     <w:p>
@@ -14782,7 +14542,7 @@
         </w:rPr>
         <w:t xml:space="preserve">1　</w:t>
       </w:r>
-      <w:hyperlink w:history="1" r:id="rId1tbu4s6it8ps0l5wc4tpo">
+      <w:hyperlink w:history="1" r:id="rIdpzoc4rwl9oyrjjqxwou1n">
         <w:r>
           <w:rPr>
             <w:rStyle w:val="Hyperlink"/>
@@ -14808,7 +14568,7 @@
         </w:rPr>
         <w:t xml:space="preserve">2　</w:t>
       </w:r>
-      <w:hyperlink w:history="1" r:id="rId_yhdwxkzwyw79h0o6g0tk">
+      <w:hyperlink w:history="1" r:id="rIdumppnuhrffqcpdgdlehvx">
         <w:r>
           <w:rPr>
             <w:rStyle w:val="Hyperlink"/>
@@ -14832,9 +14592,9 @@
           <w:sz w:val="18"/>
           <w:szCs w:val="18"/>
         </w:rPr>
-        <w:t xml:space="preserve">3, 23　</w:t>
-      </w:r>
-      <w:hyperlink w:history="1" r:id="rId6lwhssvqn5khpew5hrr-f">
+        <w:t xml:space="preserve">3, 29　</w:t>
+      </w:r>
+      <w:hyperlink w:history="1" r:id="rIdog3kqqtlz3sankmmcm_8o">
         <w:r>
           <w:rPr>
             <w:rStyle w:val="Hyperlink"/>
@@ -14860,7 +14620,7 @@
         </w:rPr>
         <w:t xml:space="preserve">4　</w:t>
       </w:r>
-      <w:hyperlink w:history="1" r:id="rIdxxcbb0vigagctknuf37vq">
+      <w:hyperlink w:history="1" r:id="rIdfh_o7htooekeab6zfq7gj">
         <w:r>
           <w:rPr>
             <w:rStyle w:val="Hyperlink"/>
@@ -14884,9 +14644,9 @@
           <w:sz w:val="18"/>
           <w:szCs w:val="18"/>
         </w:rPr>
-        <w:t xml:space="preserve">5, 13, 17, 19, 24　</w:t>
-      </w:r>
-      <w:hyperlink w:history="1" r:id="rIdojmov-2k4-wwafglzw7se">
+        <w:t xml:space="preserve">5, 15, 20, 23　</w:t>
+      </w:r>
+      <w:hyperlink w:history="1" r:id="rIdiwicg8wa_x71clv0xswie">
         <w:r>
           <w:rPr>
             <w:rStyle w:val="Hyperlink"/>
@@ -14910,9 +14670,9 @@
           <w:sz w:val="18"/>
           <w:szCs w:val="18"/>
         </w:rPr>
-        <w:t xml:space="preserve">6, 10, 22　</w:t>
-      </w:r>
-      <w:hyperlink w:history="1" r:id="rIdgp4prrqsnhoxjrbkfk1tq">
+        <w:t xml:space="preserve">6, 11, 28　</w:t>
+      </w:r>
+      <w:hyperlink w:history="1" r:id="rIdti-qgi9i77-83ae-grzpg">
         <w:r>
           <w:rPr>
             <w:rStyle w:val="Hyperlink"/>
@@ -14938,7 +14698,7 @@
         </w:rPr>
         <w:t xml:space="preserve">7　</w:t>
       </w:r>
-      <w:hyperlink w:history="1" r:id="rId_mipqmq32b-gexupuunzy">
+      <w:hyperlink w:history="1" r:id="rId8pjgwyqratcf2ukmb0pqg">
         <w:r>
           <w:rPr>
             <w:rStyle w:val="Hyperlink"/>
@@ -14964,7 +14724,33 @@
         </w:rPr>
         <w:t xml:space="preserve">8　</w:t>
       </w:r>
-      <w:hyperlink w:history="1" r:id="rIdpgxcfbgtwy_jo1bv-x_pz">
+      <w:hyperlink w:history="1" r:id="rIdncrmhoywkwqvhhkhg8mlp">
+        <w:r>
+          <w:rPr>
+            <w:rStyle w:val="Hyperlink"/>
+            <w:rFonts w:ascii="Microsoft JhengHei" w:cs="Microsoft JhengHei" w:eastAsia="Microsoft JhengHei" w:hAnsi="Microsoft JhengHei"/>
+            <w:sz w:val="18"/>
+            <w:szCs w:val="18"/>
+          </w:rPr>
+          <w:t xml:space="preserve">《小學人文科課程指引（2025）》第 8 頁</w:t>
+        </w:r>
+      </w:hyperlink>
+    </w:p>
+    <w:p>
+      <w:pPr>
+        <w:spacing w:after="20"/>
+        <w:ind w:left="420" w:hanging="420"/>
+      </w:pPr>
+      <w:r>
+        <w:rPr>
+          <w:rFonts w:ascii="Microsoft JhengHei" w:cs="Microsoft JhengHei" w:eastAsia="Microsoft JhengHei" w:hAnsi="Microsoft JhengHei"/>
+          <w:color w:val="555555"/>
+          <w:sz w:val="18"/>
+          <w:szCs w:val="18"/>
+        </w:rPr>
+        <w:t xml:space="preserve">9　</w:t>
+      </w:r>
+      <w:hyperlink w:history="1" r:id="rIdci_sadec4bfuqqwlvt60y">
         <w:r>
           <w:rPr>
             <w:rStyle w:val="Hyperlink"/>
@@ -14988,9 +14774,9 @@
           <w:sz w:val="18"/>
           <w:szCs w:val="18"/>
         </w:rPr>
-        <w:t xml:space="preserve">9　</w:t>
-      </w:r>
-      <w:hyperlink w:history="1" r:id="rIdzoalsllmlsjcykazs_paz">
+        <w:t xml:space="preserve">10　</w:t>
+      </w:r>
+      <w:hyperlink w:history="1" r:id="rIdcwrkdppa-smlan5sghkct">
         <w:r>
           <w:rPr>
             <w:rStyle w:val="Hyperlink"/>
@@ -15014,9 +14800,9 @@
           <w:sz w:val="18"/>
           <w:szCs w:val="18"/>
         </w:rPr>
-        <w:t xml:space="preserve">11, 12, 20　</w:t>
-      </w:r>
-      <w:hyperlink w:history="1" r:id="rIddp-5z3fptnjw2aowk0z9m">
+        <w:t xml:space="preserve">12, 14, 25　</w:t>
+      </w:r>
+      <w:hyperlink w:history="1" r:id="rIdyplac2ix4djzqpnyykxqd">
         <w:r>
           <w:rPr>
             <w:rStyle w:val="Hyperlink"/>
@@ -15040,9 +14826,61 @@
           <w:sz w:val="18"/>
           <w:szCs w:val="18"/>
         </w:rPr>
-        <w:t xml:space="preserve">14　</w:t>
-      </w:r>
-      <w:hyperlink w:history="1" r:id="rIdck2gtern7xyg8dn4arlp8">
+        <w:t xml:space="preserve">13　</w:t>
+      </w:r>
+      <w:hyperlink w:history="1" r:id="rIdc1-wa1ulj3aws58mkglux">
+        <w:r>
+          <w:rPr>
+            <w:rStyle w:val="Hyperlink"/>
+            <w:rFonts w:ascii="Microsoft JhengHei" w:cs="Microsoft JhengHei" w:eastAsia="Microsoft JhengHei" w:hAnsi="Microsoft JhengHei"/>
+            <w:sz w:val="18"/>
+            <w:szCs w:val="18"/>
+          </w:rPr>
+          <w:t xml:space="preserve">《小學人文科課程指引（2025）》第 19 頁</w:t>
+        </w:r>
+      </w:hyperlink>
+    </w:p>
+    <w:p>
+      <w:pPr>
+        <w:spacing w:after="20"/>
+        <w:ind w:left="420" w:hanging="420"/>
+      </w:pPr>
+      <w:r>
+        <w:rPr>
+          <w:rFonts w:ascii="Microsoft JhengHei" w:cs="Microsoft JhengHei" w:eastAsia="Microsoft JhengHei" w:hAnsi="Microsoft JhengHei"/>
+          <w:color w:val="555555"/>
+          <w:sz w:val="18"/>
+          <w:szCs w:val="18"/>
+        </w:rPr>
+        <w:t xml:space="preserve">16　</w:t>
+      </w:r>
+      <w:hyperlink w:history="1" r:id="rId3lubqdswqc1qalw6iluyz">
+        <w:r>
+          <w:rPr>
+            <w:rStyle w:val="Hyperlink"/>
+            <w:rFonts w:ascii="Microsoft JhengHei" w:cs="Microsoft JhengHei" w:eastAsia="Microsoft JhengHei" w:hAnsi="Microsoft JhengHei"/>
+            <w:sz w:val="18"/>
+            <w:szCs w:val="18"/>
+          </w:rPr>
+          <w:t xml:space="preserve">《小學人文科課程指引（2025）》第 123 頁</w:t>
+        </w:r>
+      </w:hyperlink>
+    </w:p>
+    <w:p>
+      <w:pPr>
+        <w:spacing w:after="20"/>
+        <w:ind w:left="420" w:hanging="420"/>
+      </w:pPr>
+      <w:r>
+        <w:rPr>
+          <w:rFonts w:ascii="Microsoft JhengHei" w:cs="Microsoft JhengHei" w:eastAsia="Microsoft JhengHei" w:hAnsi="Microsoft JhengHei"/>
+          <w:color w:val="555555"/>
+          <w:sz w:val="18"/>
+          <w:szCs w:val="18"/>
+        </w:rPr>
+        <w:t xml:space="preserve">17　</w:t>
+      </w:r>
+      <w:hyperlink w:history="1" r:id="rIdi4uryi9hgrnsrvhy55ekt">
         <w:r>
           <w:rPr>
             <w:rStyle w:val="Hyperlink"/>
@@ -15066,9 +14904,9 @@
           <w:sz w:val="18"/>
           <w:szCs w:val="18"/>
         </w:rPr>
-        <w:t xml:space="preserve">15　</w:t>
-      </w:r>
-      <w:hyperlink w:history="1" r:id="rIdmedtpmufuttzvqjenx8ga">
+        <w:t xml:space="preserve">18　</w:t>
+      </w:r>
+      <w:hyperlink w:history="1" r:id="rIdvm_ykawbmtorsbexcgtj-">
         <w:r>
           <w:rPr>
             <w:rStyle w:val="Hyperlink"/>
@@ -15092,9 +14930,9 @@
           <w:sz w:val="18"/>
           <w:szCs w:val="18"/>
         </w:rPr>
-        <w:t xml:space="preserve">16, 18　</w:t>
-      </w:r>
-      <w:hyperlink w:history="1" r:id="rIdu1zchstmfm1piwzvj-pba">
+        <w:t xml:space="preserve">19, 22　</w:t>
+      </w:r>
+      <w:hyperlink w:history="1" r:id="rId7btqo_8hrj5bex3nuqgim">
         <w:r>
           <w:rPr>
             <w:rStyle w:val="Hyperlink"/>
@@ -15120,7 +14958,59 @@
         </w:rPr>
         <w:t xml:space="preserve">21　</w:t>
       </w:r>
-      <w:hyperlink w:history="1" r:id="rIdi-3cvngha1uljxexuiw7r">
+      <w:hyperlink w:history="1" r:id="rIdl4_tr_h5qciv1bes7stgh">
+        <w:r>
+          <w:rPr>
+            <w:rStyle w:val="Hyperlink"/>
+            <w:rFonts w:ascii="Microsoft JhengHei" w:cs="Microsoft JhengHei" w:eastAsia="Microsoft JhengHei" w:hAnsi="Microsoft JhengHei"/>
+            <w:sz w:val="18"/>
+            <w:szCs w:val="18"/>
+          </w:rPr>
+          <w:t xml:space="preserve">《小學人文科課程指引（2025）》第 245 頁</w:t>
+        </w:r>
+      </w:hyperlink>
+    </w:p>
+    <w:p>
+      <w:pPr>
+        <w:spacing w:after="20"/>
+        <w:ind w:left="420" w:hanging="420"/>
+      </w:pPr>
+      <w:r>
+        <w:rPr>
+          <w:rFonts w:ascii="Microsoft JhengHei" w:cs="Microsoft JhengHei" w:eastAsia="Microsoft JhengHei" w:hAnsi="Microsoft JhengHei"/>
+          <w:color w:val="555555"/>
+          <w:sz w:val="18"/>
+          <w:szCs w:val="18"/>
+        </w:rPr>
+        <w:t xml:space="preserve">24　</w:t>
+      </w:r>
+      <w:hyperlink w:history="1" r:id="rId4yi5qdg77ver_pvtgiy75">
+        <w:r>
+          <w:rPr>
+            <w:rStyle w:val="Hyperlink"/>
+            <w:rFonts w:ascii="Microsoft JhengHei" w:cs="Microsoft JhengHei" w:eastAsia="Microsoft JhengHei" w:hAnsi="Microsoft JhengHei"/>
+            <w:sz w:val="18"/>
+            <w:szCs w:val="18"/>
+          </w:rPr>
+          <w:t xml:space="preserve">《小學人文科課程指引（2025）》第 11 頁</w:t>
+        </w:r>
+      </w:hyperlink>
+    </w:p>
+    <w:p>
+      <w:pPr>
+        <w:spacing w:after="20"/>
+        <w:ind w:left="420" w:hanging="420"/>
+      </w:pPr>
+      <w:r>
+        <w:rPr>
+          <w:rFonts w:ascii="Microsoft JhengHei" w:cs="Microsoft JhengHei" w:eastAsia="Microsoft JhengHei" w:hAnsi="Microsoft JhengHei"/>
+          <w:color w:val="555555"/>
+          <w:sz w:val="18"/>
+          <w:szCs w:val="18"/>
+        </w:rPr>
+        <w:t xml:space="preserve">26　</w:t>
+      </w:r>
+      <w:hyperlink w:history="1" r:id="rIdhcxibjmwf9y8-ml3bx9yx">
         <w:r>
           <w:rPr>
             <w:rStyle w:val="Hyperlink"/>
@@ -15144,9 +15034,35 @@
           <w:sz w:val="18"/>
           <w:szCs w:val="18"/>
         </w:rPr>
-        <w:t xml:space="preserve">25　</w:t>
-      </w:r>
-      <w:hyperlink w:history="1" r:id="rIdmtyzmj7mxjkrspz2munmt">
+        <w:t xml:space="preserve">27　</w:t>
+      </w:r>
+      <w:hyperlink w:history="1" r:id="rIdirnv5p05ojl3pbhclacuo">
+        <w:r>
+          <w:rPr>
+            <w:rStyle w:val="Hyperlink"/>
+            <w:rFonts w:ascii="Microsoft JhengHei" w:cs="Microsoft JhengHei" w:eastAsia="Microsoft JhengHei" w:hAnsi="Microsoft JhengHei"/>
+            <w:sz w:val="18"/>
+            <w:szCs w:val="18"/>
+          </w:rPr>
+          <w:t xml:space="preserve">《小學人文科課程指引（2025）》第 196 頁</w:t>
+        </w:r>
+      </w:hyperlink>
+    </w:p>
+    <w:p>
+      <w:pPr>
+        <w:spacing w:after="20"/>
+        <w:ind w:left="420" w:hanging="420"/>
+      </w:pPr>
+      <w:r>
+        <w:rPr>
+          <w:rFonts w:ascii="Microsoft JhengHei" w:cs="Microsoft JhengHei" w:eastAsia="Microsoft JhengHei" w:hAnsi="Microsoft JhengHei"/>
+          <w:color w:val="555555"/>
+          <w:sz w:val="18"/>
+          <w:szCs w:val="18"/>
+        </w:rPr>
+        <w:t xml:space="preserve">30　</w:t>
+      </w:r>
+      <w:hyperlink w:history="1" r:id="rIdve2urwri81fyhunzoww7q">
         <w:r>
           <w:rPr>
             <w:rStyle w:val="Hyperlink"/>
@@ -15170,9 +15086,9 @@
           <w:sz w:val="18"/>
           <w:szCs w:val="18"/>
         </w:rPr>
-        <w:t xml:space="preserve">26　</w:t>
-      </w:r>
-      <w:hyperlink w:history="1" r:id="rIdvz06ajf_licmwpjd5ai8q">
+        <w:t xml:space="preserve">31　</w:t>
+      </w:r>
+      <w:hyperlink w:history="1" r:id="rIdxwwcmnohojn1sillojfpx">
         <w:r>
           <w:rPr>
             <w:rStyle w:val="Hyperlink"/>
@@ -16202,7 +16118,7 @@
         </w:rPr>
         <w:t xml:space="preserve">1　</w:t>
       </w:r>
-      <w:hyperlink w:history="1" r:id="rId-sx-j8nsb6nj7nc7m-t4k">
+      <w:hyperlink w:history="1" r:id="rIdowei5dh_lo9609hqk1lhf">
         <w:r>
           <w:rPr>
             <w:rStyle w:val="Hyperlink"/>
@@ -16228,7 +16144,7 @@
         </w:rPr>
         <w:t xml:space="preserve">2, 17　</w:t>
       </w:r>
-      <w:hyperlink w:history="1" r:id="rIdjpuu2ae8hf3slwpxuq-p3">
+      <w:hyperlink w:history="1" r:id="rIdcymxqhebtux-a_b8nwm3x">
         <w:r>
           <w:rPr>
             <w:rStyle w:val="Hyperlink"/>
@@ -16254,7 +16170,7 @@
         </w:rPr>
         <w:t xml:space="preserve">3　</w:t>
       </w:r>
-      <w:hyperlink w:history="1" r:id="rId8rqmvfyf5-8-g0jutry1m">
+      <w:hyperlink w:history="1" r:id="rIdcuqni3eerpfomhznwndj9">
         <w:r>
           <w:rPr>
             <w:rStyle w:val="Hyperlink"/>
@@ -16280,7 +16196,7 @@
         </w:rPr>
         <w:t xml:space="preserve">4, 8, 11, 12　</w:t>
       </w:r>
-      <w:hyperlink w:history="1" r:id="rIdpa4qn6hwrvzpdzidlyybv">
+      <w:hyperlink w:history="1" r:id="rIdkrsijhhtlwzgg9bkwmcyp">
         <w:r>
           <w:rPr>
             <w:rStyle w:val="Hyperlink"/>
@@ -16306,7 +16222,7 @@
         </w:rPr>
         <w:t xml:space="preserve">5, 9, 10　</w:t>
       </w:r>
-      <w:hyperlink w:history="1" r:id="rIdqkeje9vutusj3jjelsgwv">
+      <w:hyperlink w:history="1" r:id="rIdbm_zm8idnzmcci6muwjy5">
         <w:r>
           <w:rPr>
             <w:rStyle w:val="Hyperlink"/>
@@ -16332,7 +16248,7 @@
         </w:rPr>
         <w:t xml:space="preserve">6　</w:t>
       </w:r>
-      <w:hyperlink w:history="1" r:id="rIdbwwzkzakjljwmimeedezv">
+      <w:hyperlink w:history="1" r:id="rIdgyzv2jrvo4k5x3tghevx2">
         <w:r>
           <w:rPr>
             <w:rStyle w:val="Hyperlink"/>
@@ -16358,7 +16274,7 @@
         </w:rPr>
         <w:t xml:space="preserve">7　</w:t>
       </w:r>
-      <w:hyperlink w:history="1" r:id="rIda1mmgwvwf5v9z2jwmavgb">
+      <w:hyperlink w:history="1" r:id="rIdlxa4p-iayvcg7wxzfjq31">
         <w:r>
           <w:rPr>
             <w:rStyle w:val="Hyperlink"/>
@@ -16384,7 +16300,7 @@
         </w:rPr>
         <w:t xml:space="preserve">13, 14, 15　</w:t>
       </w:r>
-      <w:hyperlink w:history="1" r:id="rIdd_pmdct5ooc5blf1xzyp1">
+      <w:hyperlink w:history="1" r:id="rIdmgrqbtlnhl0qt1qidpvab">
         <w:r>
           <w:rPr>
             <w:rStyle w:val="Hyperlink"/>
@@ -16410,7 +16326,7 @@
         </w:rPr>
         <w:t xml:space="preserve">16　</w:t>
       </w:r>
-      <w:hyperlink w:history="1" r:id="rIdo0ln0ra8v_pokfvoc4a3g">
+      <w:hyperlink w:history="1" r:id="rIdcikzja6lfhmw0xtvdtsuc">
         <w:r>
           <w:rPr>
             <w:rStyle w:val="Hyperlink"/>
@@ -16436,7 +16352,7 @@
         </w:rPr>
         <w:t xml:space="preserve">18　</w:t>
       </w:r>
-      <w:hyperlink w:history="1" r:id="rIdwu46wqg9ovpebugd1k2bg">
+      <w:hyperlink w:history="1" r:id="rIdfibhjwm08_flmuihzbo9t">
         <w:r>
           <w:rPr>
             <w:rStyle w:val="Hyperlink"/>
@@ -16462,7 +16378,7 @@
         </w:rPr>
         <w:t xml:space="preserve">19, 20　</w:t>
       </w:r>
-      <w:hyperlink w:history="1" r:id="rIdcrc8fe31ukva-bctelfl_">
+      <w:hyperlink w:history="1" r:id="rIdlmckgz4vxvutbbpdygw5c">
         <w:r>
           <w:rPr>
             <w:rStyle w:val="Hyperlink"/>
@@ -16488,7 +16404,7 @@
         </w:rPr>
         <w:t xml:space="preserve">21　</w:t>
       </w:r>
-      <w:hyperlink w:history="1" r:id="rId66qkthk_31iq3qp9j4bhy">
+      <w:hyperlink w:history="1" r:id="rIdq6f9unhknkufyuoguhwu_">
         <w:r>
           <w:rPr>
             <w:rStyle w:val="Hyperlink"/>
@@ -16514,7 +16430,7 @@
         </w:rPr>
         <w:t xml:space="preserve">22　</w:t>
       </w:r>
-      <w:hyperlink w:history="1" r:id="rIda_trrvhxxyprbnkcvbcgt">
+      <w:hyperlink w:history="1" r:id="rIdyyzjxpph7as-tqisedvvw">
         <w:r>
           <w:rPr>
             <w:rStyle w:val="Hyperlink"/>
@@ -17422,7 +17338,7 @@
         </w:rPr>
         <w:t xml:space="preserve">1　</w:t>
       </w:r>
-      <w:hyperlink w:history="1" r:id="rIdj4h1ghafmkt0xlhscgebi">
+      <w:hyperlink w:history="1" r:id="rId-1m997zqoonep-bcimobd">
         <w:r>
           <w:rPr>
             <w:rStyle w:val="Hyperlink"/>
@@ -17448,7 +17364,7 @@
         </w:rPr>
         <w:t xml:space="preserve">2, 6　</w:t>
       </w:r>
-      <w:hyperlink w:history="1" r:id="rIdof5fx-qxc3cw8u6feqgcp">
+      <w:hyperlink w:history="1" r:id="rIdzm7eheuu3andijlgex9ja">
         <w:r>
           <w:rPr>
             <w:rStyle w:val="Hyperlink"/>
@@ -17474,7 +17390,7 @@
         </w:rPr>
         <w:t xml:space="preserve">3, 4, 7　</w:t>
       </w:r>
-      <w:hyperlink w:history="1" r:id="rIdt_wchoxn6kui9vr6ttqdk">
+      <w:hyperlink w:history="1" r:id="rIdr4yh0l7wzy8brew1srfml">
         <w:r>
           <w:rPr>
             <w:rStyle w:val="Hyperlink"/>
@@ -17500,7 +17416,7 @@
         </w:rPr>
         <w:t xml:space="preserve">5　</w:t>
       </w:r>
-      <w:hyperlink w:history="1" r:id="rIda4xgnsgmx3vakt4n1y3yg">
+      <w:hyperlink w:history="1" r:id="rIdv1p6syuye3n1kpzfvm9fu">
         <w:r>
           <w:rPr>
             <w:rStyle w:val="Hyperlink"/>
@@ -17526,7 +17442,7 @@
         </w:rPr>
         <w:t xml:space="preserve">8　</w:t>
       </w:r>
-      <w:hyperlink w:history="1" r:id="rIdpofcufnvudexgst1ttqal">
+      <w:hyperlink w:history="1" r:id="rId45gockuhz9gxbuobwhc7j">
         <w:r>
           <w:rPr>
             <w:rStyle w:val="Hyperlink"/>
@@ -17552,7 +17468,7 @@
         </w:rPr>
         <w:t xml:space="preserve">9　</w:t>
       </w:r>
-      <w:hyperlink w:history="1" r:id="rIdgauzjufcfotmfhuvf2mk5">
+      <w:hyperlink w:history="1" r:id="rIdstrzeixgftofm3zne02jw">
         <w:r>
           <w:rPr>
             <w:rStyle w:val="Hyperlink"/>
@@ -17578,7 +17494,7 @@
         </w:rPr>
         <w:t xml:space="preserve">10　</w:t>
       </w:r>
-      <w:hyperlink w:history="1" r:id="rIdgtrtetlxx-j7f72ig4s9h">
+      <w:hyperlink w:history="1" r:id="rIdko8prqxvslc_gztyzhzoi">
         <w:r>
           <w:rPr>
             <w:rStyle w:val="Hyperlink"/>
@@ -17604,7 +17520,7 @@
         </w:rPr>
         <w:t xml:space="preserve">11　</w:t>
       </w:r>
-      <w:hyperlink w:history="1" r:id="rIddmwzyizxf3eyc3r8aa93y">
+      <w:hyperlink w:history="1" r:id="rIddyei1djbmulcpq3m9huaw">
         <w:r>
           <w:rPr>
             <w:rStyle w:val="Hyperlink"/>
@@ -17630,7 +17546,7 @@
         </w:rPr>
         <w:t xml:space="preserve">12　</w:t>
       </w:r>
-      <w:hyperlink w:history="1" r:id="rIdacm2isk7ydoggekmguctw">
+      <w:hyperlink w:history="1" r:id="rIdluvhl1p5jvy0miewqwphk">
         <w:r>
           <w:rPr>
             <w:rStyle w:val="Hyperlink"/>
@@ -17656,7 +17572,7 @@
         </w:rPr>
         <w:t xml:space="preserve">13　</w:t>
       </w:r>
-      <w:hyperlink w:history="1" r:id="rIdhrkatytcbi7vmm8anz1uu">
+      <w:hyperlink w:history="1" r:id="rId_wzub5rw2hvn7cia24vsl">
         <w:r>
           <w:rPr>
             <w:rStyle w:val="Hyperlink"/>
@@ -17682,7 +17598,7 @@
         </w:rPr>
         <w:t xml:space="preserve">14　</w:t>
       </w:r>
-      <w:hyperlink w:history="1" r:id="rIdsktkxdzqw9q2bxt-yfvm7">
+      <w:hyperlink w:history="1" r:id="rIdcjwysiv1eild7jyiw86o6">
         <w:r>
           <w:rPr>
             <w:rStyle w:val="Hyperlink"/>
@@ -20322,7 +20238,7 @@
         </w:rPr>
         <w:t xml:space="preserve">1　</w:t>
       </w:r>
-      <w:hyperlink w:history="1" r:id="rIdp3nd24pyvymxoquz0n_wg">
+      <w:hyperlink w:history="1" r:id="rIdd8gbmu-zyc43o9vr0xihr">
         <w:r>
           <w:rPr>
             <w:rStyle w:val="Hyperlink"/>
@@ -20348,7 +20264,7 @@
         </w:rPr>
         <w:t xml:space="preserve">2　</w:t>
       </w:r>
-      <w:hyperlink w:history="1" r:id="rIdc0exqcasg0o_ceusx20yt">
+      <w:hyperlink w:history="1" r:id="rIdhkzl7cr2bhpbuijycnrej">
         <w:r>
           <w:rPr>
             <w:rStyle w:val="Hyperlink"/>
@@ -20374,7 +20290,7 @@
         </w:rPr>
         <w:t xml:space="preserve">3, 15, 60　</w:t>
       </w:r>
-      <w:hyperlink w:history="1" r:id="rId27q-xwtak2vsvkrebytde">
+      <w:hyperlink w:history="1" r:id="rIdjwhveysblhwmsk1pxhf-d">
         <w:r>
           <w:rPr>
             <w:rStyle w:val="Hyperlink"/>
@@ -20400,7 +20316,7 @@
         </w:rPr>
         <w:t xml:space="preserve">4, 24, 55, 84　</w:t>
       </w:r>
-      <w:hyperlink w:history="1" r:id="rId0o19fkec1ftjyac2vaqed">
+      <w:hyperlink w:history="1" r:id="rId7n4yuri-zgtrta9x3qqaq">
         <w:r>
           <w:rPr>
             <w:rStyle w:val="Hyperlink"/>
@@ -20426,7 +20342,7 @@
         </w:rPr>
         <w:t xml:space="preserve">5, 18, 73　</w:t>
       </w:r>
-      <w:hyperlink w:history="1" r:id="rIde5tqvaqiymzi877wvruvb">
+      <w:hyperlink w:history="1" r:id="rIdtq4tteqm4gbmowhxo8zap">
         <w:r>
           <w:rPr>
             <w:rStyle w:val="Hyperlink"/>
@@ -20452,7 +20368,7 @@
         </w:rPr>
         <w:t xml:space="preserve">6　</w:t>
       </w:r>
-      <w:hyperlink w:history="1" r:id="rIdhobnbmm1y2hi5mwamjqxd">
+      <w:hyperlink w:history="1" r:id="rIdeqduafprjdshvl4vzbxry">
         <w:r>
           <w:rPr>
             <w:rStyle w:val="Hyperlink"/>
@@ -20478,7 +20394,7 @@
         </w:rPr>
         <w:t xml:space="preserve">7　</w:t>
       </w:r>
-      <w:hyperlink w:history="1" r:id="rIdcb5zkvzsx-ecksfuz-1om">
+      <w:hyperlink w:history="1" r:id="rIdvmwgipvywj3f3xbu0usbg">
         <w:r>
           <w:rPr>
             <w:rStyle w:val="Hyperlink"/>
@@ -20504,7 +20420,7 @@
         </w:rPr>
         <w:t xml:space="preserve">8　</w:t>
       </w:r>
-      <w:hyperlink w:history="1" r:id="rId4zaqlrtaflc5zkw2gua2_">
+      <w:hyperlink w:history="1" r:id="rId1dg8vr0y0shkizxwfjgwh">
         <w:r>
           <w:rPr>
             <w:rStyle w:val="Hyperlink"/>
@@ -20530,7 +20446,7 @@
         </w:rPr>
         <w:t xml:space="preserve">9　</w:t>
       </w:r>
-      <w:hyperlink w:history="1" r:id="rIdb1bqyg6-af81vz9x_qhed">
+      <w:hyperlink w:history="1" r:id="rId7ldtd8nuceqfwv8wdjg2t">
         <w:r>
           <w:rPr>
             <w:rStyle w:val="Hyperlink"/>
@@ -20556,7 +20472,7 @@
         </w:rPr>
         <w:t xml:space="preserve">10　</w:t>
       </w:r>
-      <w:hyperlink w:history="1" r:id="rIdqrwks1rjyvzjd3yalmxkz">
+      <w:hyperlink w:history="1" r:id="rIdk1ig61qntca-wqudmflr2">
         <w:r>
           <w:rPr>
             <w:rStyle w:val="Hyperlink"/>
@@ -20582,7 +20498,7 @@
         </w:rPr>
         <w:t xml:space="preserve">11　</w:t>
       </w:r>
-      <w:hyperlink w:history="1" r:id="rId7ldxvjeiqmsgirldbbcbc">
+      <w:hyperlink w:history="1" r:id="rIdwenfo0bhcfjlosg-rmfh_">
         <w:r>
           <w:rPr>
             <w:rStyle w:val="Hyperlink"/>
@@ -20608,7 +20524,7 @@
         </w:rPr>
         <w:t xml:space="preserve">12, 63　</w:t>
       </w:r>
-      <w:hyperlink w:history="1" r:id="rIdducpe40cxcdboxhusd_kk">
+      <w:hyperlink w:history="1" r:id="rId9ltrzxlwm9091sfy1fqmu">
         <w:r>
           <w:rPr>
             <w:rStyle w:val="Hyperlink"/>
@@ -20634,7 +20550,7 @@
         </w:rPr>
         <w:t xml:space="preserve">13　</w:t>
       </w:r>
-      <w:hyperlink w:history="1" r:id="rIdx8u6hznhakmnf8z2lemsm">
+      <w:hyperlink w:history="1" r:id="rIdlgcbaoif-lgtjy2omrgqa">
         <w:r>
           <w:rPr>
             <w:rStyle w:val="Hyperlink"/>
@@ -20660,7 +20576,7 @@
         </w:rPr>
         <w:t xml:space="preserve">14, 20　</w:t>
       </w:r>
-      <w:hyperlink w:history="1" r:id="rId-rsqjuvh10lceuhy-nok5">
+      <w:hyperlink w:history="1" r:id="rIdxzwtkyzj79zlc3ljh9ebc">
         <w:r>
           <w:rPr>
             <w:rStyle w:val="Hyperlink"/>
@@ -20686,7 +20602,7 @@
         </w:rPr>
         <w:t xml:space="preserve">16　</w:t>
       </w:r>
-      <w:hyperlink w:history="1" r:id="rIdyts6hryudkkuqvpasa8oy">
+      <w:hyperlink w:history="1" r:id="rIdjpha0kerb2ppbjbfumiab">
         <w:r>
           <w:rPr>
             <w:rStyle w:val="Hyperlink"/>
@@ -20712,7 +20628,7 @@
         </w:rPr>
         <w:t xml:space="preserve">17　</w:t>
       </w:r>
-      <w:hyperlink w:history="1" r:id="rIdcqnayt8nws-yybsfqr1mg">
+      <w:hyperlink w:history="1" r:id="rIdi4d-7prs-aluwxpd58anw">
         <w:r>
           <w:rPr>
             <w:rStyle w:val="Hyperlink"/>
@@ -20738,7 +20654,7 @@
         </w:rPr>
         <w:t xml:space="preserve">19　</w:t>
       </w:r>
-      <w:hyperlink w:history="1" r:id="rId6qip7vzhfufyy6mo9diq5">
+      <w:hyperlink w:history="1" r:id="rIdi_ccpsh1pqgxlkvahu-8l">
         <w:r>
           <w:rPr>
             <w:rStyle w:val="Hyperlink"/>
@@ -20764,7 +20680,7 @@
         </w:rPr>
         <w:t xml:space="preserve">21　</w:t>
       </w:r>
-      <w:hyperlink w:history="1" r:id="rIdb38dwkessocghxpeb2q4b">
+      <w:hyperlink w:history="1" r:id="rIdiolnmzxg1qxuitf65w9le">
         <w:r>
           <w:rPr>
             <w:rStyle w:val="Hyperlink"/>
@@ -20790,7 +20706,7 @@
         </w:rPr>
         <w:t xml:space="preserve">22, 81　</w:t>
       </w:r>
-      <w:hyperlink w:history="1" r:id="rIdfaxfeqi3fsijujb-loq4c">
+      <w:hyperlink w:history="1" r:id="rIdic0yzkccbrmmhwwvch2x3">
         <w:r>
           <w:rPr>
             <w:rStyle w:val="Hyperlink"/>
@@ -20816,7 +20732,7 @@
         </w:rPr>
         <w:t xml:space="preserve">23, 38　</w:t>
       </w:r>
-      <w:hyperlink w:history="1" r:id="rId7u61mq-tl95oyotaoset3">
+      <w:hyperlink w:history="1" r:id="rIdgbvthtyk1vanvdfwwgk5i">
         <w:r>
           <w:rPr>
             <w:rStyle w:val="Hyperlink"/>
@@ -20842,7 +20758,7 @@
         </w:rPr>
         <w:t xml:space="preserve">25　</w:t>
       </w:r>
-      <w:hyperlink w:history="1" r:id="rId4tnuo4tm_on7mxkkp35od">
+      <w:hyperlink w:history="1" r:id="rIdxyclim_br-dkfpyc0gcpw">
         <w:r>
           <w:rPr>
             <w:rStyle w:val="Hyperlink"/>
@@ -20868,7 +20784,7 @@
         </w:rPr>
         <w:t xml:space="preserve">26, 57　</w:t>
       </w:r>
-      <w:hyperlink w:history="1" r:id="rIdnsmziqy23qeqektwxtrmy">
+      <w:hyperlink w:history="1" r:id="rIdzdbzrlu4dvff96snrun4i">
         <w:r>
           <w:rPr>
             <w:rStyle w:val="Hyperlink"/>
@@ -20894,7 +20810,7 @@
         </w:rPr>
         <w:t xml:space="preserve">27　</w:t>
       </w:r>
-      <w:hyperlink w:history="1" r:id="rIdn5dl6a_cfxgbawdiwref0">
+      <w:hyperlink w:history="1" r:id="rId3f1oiuqjgw2t9cqlhjjsm">
         <w:r>
           <w:rPr>
             <w:rStyle w:val="Hyperlink"/>
@@ -20920,7 +20836,7 @@
         </w:rPr>
         <w:t xml:space="preserve">28　</w:t>
       </w:r>
-      <w:hyperlink w:history="1" r:id="rIdrz9vp2hzw3bsunvyber-d">
+      <w:hyperlink w:history="1" r:id="rIdyzdbwshxzebxct3-5cxr4">
         <w:r>
           <w:rPr>
             <w:rStyle w:val="Hyperlink"/>
@@ -20946,7 +20862,7 @@
         </w:rPr>
         <w:t xml:space="preserve">29, 54, 79　</w:t>
       </w:r>
-      <w:hyperlink w:history="1" r:id="rId08lggll876e09zxhhyqus">
+      <w:hyperlink w:history="1" r:id="rIdx3b_zpi2usy48hbs7wcw4">
         <w:r>
           <w:rPr>
             <w:rStyle w:val="Hyperlink"/>
@@ -20972,7 +20888,7 @@
         </w:rPr>
         <w:t xml:space="preserve">30　</w:t>
       </w:r>
-      <w:hyperlink w:history="1" r:id="rIdd4uxxztfbkdce0qjecrax">
+      <w:hyperlink w:history="1" r:id="rIdjig-7lmx0rgqd7rqjyalg">
         <w:r>
           <w:rPr>
             <w:rStyle w:val="Hyperlink"/>
@@ -20998,7 +20914,7 @@
         </w:rPr>
         <w:t xml:space="preserve">31　</w:t>
       </w:r>
-      <w:hyperlink w:history="1" r:id="rIdfavpckw0xh3xb5sus34no">
+      <w:hyperlink w:history="1" r:id="rIdm3muo8fhbjviwizr5hx1p">
         <w:r>
           <w:rPr>
             <w:rStyle w:val="Hyperlink"/>
@@ -21024,7 +20940,7 @@
         </w:rPr>
         <w:t xml:space="preserve">32, 40　</w:t>
       </w:r>
-      <w:hyperlink w:history="1" r:id="rId-k6okl-ncxau7hxle5zwg">
+      <w:hyperlink w:history="1" r:id="rId9lgvyfnfu26mr__lcx-os">
         <w:r>
           <w:rPr>
             <w:rStyle w:val="Hyperlink"/>
@@ -21050,7 +20966,7 @@
         </w:rPr>
         <w:t xml:space="preserve">33, 48, 74　</w:t>
       </w:r>
-      <w:hyperlink w:history="1" r:id="rId_gnrn4c4bjw03kprrd9pn">
+      <w:hyperlink w:history="1" r:id="rIdnesbywxi36ns2zh4allcb">
         <w:r>
           <w:rPr>
             <w:rStyle w:val="Hyperlink"/>
@@ -21076,7 +20992,7 @@
         </w:rPr>
         <w:t xml:space="preserve">34　</w:t>
       </w:r>
-      <w:hyperlink w:history="1" r:id="rIdtomjuwsyfbenykdzzky_4">
+      <w:hyperlink w:history="1" r:id="rId0qyr6xbwj4kenw__cisre">
         <w:r>
           <w:rPr>
             <w:rStyle w:val="Hyperlink"/>
@@ -21102,7 +21018,7 @@
         </w:rPr>
         <w:t xml:space="preserve">35　</w:t>
       </w:r>
-      <w:hyperlink w:history="1" r:id="rIdn3r2ndoemliaiaftxi0di">
+      <w:hyperlink w:history="1" r:id="rIdki6kybytyv-7ersaf8i7u">
         <w:r>
           <w:rPr>
             <w:rStyle w:val="Hyperlink"/>
@@ -21128,7 +21044,7 @@
         </w:rPr>
         <w:t xml:space="preserve">36　</w:t>
       </w:r>
-      <w:hyperlink w:history="1" r:id="rIds7ygwbb6ithxwap52_xhx">
+      <w:hyperlink w:history="1" r:id="rIdmncqfn4wo7p7p0casfh9e">
         <w:r>
           <w:rPr>
             <w:rStyle w:val="Hyperlink"/>
@@ -21154,7 +21070,7 @@
         </w:rPr>
         <w:t xml:space="preserve">37　</w:t>
       </w:r>
-      <w:hyperlink w:history="1" r:id="rIdzb1-bmj7z2vhmz9gsjklr">
+      <w:hyperlink w:history="1" r:id="rIdttqrniz69i2stubr2lbdb">
         <w:r>
           <w:rPr>
             <w:rStyle w:val="Hyperlink"/>
@@ -21180,7 +21096,7 @@
         </w:rPr>
         <w:t xml:space="preserve">39, 61　</w:t>
       </w:r>
-      <w:hyperlink w:history="1" r:id="rIdz8bocdvipeclfvy0zp4jn">
+      <w:hyperlink w:history="1" r:id="rIdfkrtjz6ly4bry2ycp_d4c">
         <w:r>
           <w:rPr>
             <w:rStyle w:val="Hyperlink"/>
@@ -21206,7 +21122,7 @@
         </w:rPr>
         <w:t xml:space="preserve">41　</w:t>
       </w:r>
-      <w:hyperlink w:history="1" r:id="rIdcramthxu379o1-jkzdjbp">
+      <w:hyperlink w:history="1" r:id="rIdeielcdf9fm2u9dpyhcjf4">
         <w:r>
           <w:rPr>
             <w:rStyle w:val="Hyperlink"/>
@@ -21232,7 +21148,7 @@
         </w:rPr>
         <w:t xml:space="preserve">42　</w:t>
       </w:r>
-      <w:hyperlink w:history="1" r:id="rIdytnybs0aaffojmp54wxby">
+      <w:hyperlink w:history="1" r:id="rIdq48groyzvl8ixcqj0ihne">
         <w:r>
           <w:rPr>
             <w:rStyle w:val="Hyperlink"/>
@@ -21258,7 +21174,7 @@
         </w:rPr>
         <w:t xml:space="preserve">43, 69　</w:t>
       </w:r>
-      <w:hyperlink w:history="1" r:id="rId4beodypqn7q0og02_p7_1">
+      <w:hyperlink w:history="1" r:id="rIdduzdfk84vkxvlb804dad4">
         <w:r>
           <w:rPr>
             <w:rStyle w:val="Hyperlink"/>
@@ -21284,7 +21200,7 @@
         </w:rPr>
         <w:t xml:space="preserve">44, 51　</w:t>
       </w:r>
-      <w:hyperlink w:history="1" r:id="rIdmdcd9e5ru-snccycjgvv9">
+      <w:hyperlink w:history="1" r:id="rIdlw2p74-zfcpfakmsqbgf_">
         <w:r>
           <w:rPr>
             <w:rStyle w:val="Hyperlink"/>
@@ -21310,7 +21226,7 @@
         </w:rPr>
         <w:t xml:space="preserve">45　</w:t>
       </w:r>
-      <w:hyperlink w:history="1" r:id="rId05lnd4bnkdpzi80xbpxrz">
+      <w:hyperlink w:history="1" r:id="rIdpnrxeo9jl8qziucr3hexs">
         <w:r>
           <w:rPr>
             <w:rStyle w:val="Hyperlink"/>
@@ -21336,7 +21252,7 @@
         </w:rPr>
         <w:t xml:space="preserve">46　</w:t>
       </w:r>
-      <w:hyperlink w:history="1" r:id="rIdc6mkj-ivcyriuji9youo_">
+      <w:hyperlink w:history="1" r:id="rIdpii1srabih1nk-mzvjvfz">
         <w:r>
           <w:rPr>
             <w:rStyle w:val="Hyperlink"/>
@@ -21362,7 +21278,7 @@
         </w:rPr>
         <w:t xml:space="preserve">47　</w:t>
       </w:r>
-      <w:hyperlink w:history="1" r:id="rId6cx8_0et9xxcpkpe9ko09">
+      <w:hyperlink w:history="1" r:id="rIdpqz5idltabay-lbrhajok">
         <w:r>
           <w:rPr>
             <w:rStyle w:val="Hyperlink"/>
@@ -21388,7 +21304,7 @@
         </w:rPr>
         <w:t xml:space="preserve">49, 78　</w:t>
       </w:r>
-      <w:hyperlink w:history="1" r:id="rIddkabygn4ke9ddn1zj2wfz">
+      <w:hyperlink w:history="1" r:id="rId2nv-yvexvbmydomxfshun">
         <w:r>
           <w:rPr>
             <w:rStyle w:val="Hyperlink"/>
@@ -21414,7 +21330,7 @@
         </w:rPr>
         <w:t xml:space="preserve">50　</w:t>
       </w:r>
-      <w:hyperlink w:history="1" r:id="rIdeayj1opve2mc0di-_x-fi">
+      <w:hyperlink w:history="1" r:id="rIdin_ctpuuhsidq5eozmong">
         <w:r>
           <w:rPr>
             <w:rStyle w:val="Hyperlink"/>
@@ -21440,7 +21356,7 @@
         </w:rPr>
         <w:t xml:space="preserve">52　</w:t>
       </w:r>
-      <w:hyperlink w:history="1" r:id="rId8twy155p7iy5mw15anu1h">
+      <w:hyperlink w:history="1" r:id="rIdhbvxwkjlixa7t_cgykzeu">
         <w:r>
           <w:rPr>
             <w:rStyle w:val="Hyperlink"/>
@@ -21466,7 +21382,7 @@
         </w:rPr>
         <w:t xml:space="preserve">53　</w:t>
       </w:r>
-      <w:hyperlink w:history="1" r:id="rIdbk3uac7w7zg9qncaf8ndb">
+      <w:hyperlink w:history="1" r:id="rId7xcbanlhrct7dgprps-sr">
         <w:r>
           <w:rPr>
             <w:rStyle w:val="Hyperlink"/>
@@ -21492,7 +21408,7 @@
         </w:rPr>
         <w:t xml:space="preserve">56　</w:t>
       </w:r>
-      <w:hyperlink w:history="1" r:id="rIdplyr5gqcazw7err9dlcyb">
+      <w:hyperlink w:history="1" r:id="rIdtg8-i6ckcgww4viachxwg">
         <w:r>
           <w:rPr>
             <w:rStyle w:val="Hyperlink"/>
@@ -21518,7 +21434,7 @@
         </w:rPr>
         <w:t xml:space="preserve">58　</w:t>
       </w:r>
-      <w:hyperlink w:history="1" r:id="rId3l3nzz5xycplqjaylv_r4">
+      <w:hyperlink w:history="1" r:id="rId5otjdym3cjq-ymezbeiyc">
         <w:r>
           <w:rPr>
             <w:rStyle w:val="Hyperlink"/>
@@ -21544,7 +21460,7 @@
         </w:rPr>
         <w:t xml:space="preserve">59　</w:t>
       </w:r>
-      <w:hyperlink w:history="1" r:id="rIdrnzbhusootxlkafdh0b4l">
+      <w:hyperlink w:history="1" r:id="rIdz_hurpe4ujjssw9vf7cb9">
         <w:r>
           <w:rPr>
             <w:rStyle w:val="Hyperlink"/>
@@ -21570,7 +21486,7 @@
         </w:rPr>
         <w:t xml:space="preserve">62　</w:t>
       </w:r>
-      <w:hyperlink w:history="1" r:id="rIdq4qpvvkudcvrtopxibijs">
+      <w:hyperlink w:history="1" r:id="rIdaaj34ygixpdgzmvge2gcy">
         <w:r>
           <w:rPr>
             <w:rStyle w:val="Hyperlink"/>
@@ -21596,7 +21512,7 @@
         </w:rPr>
         <w:t xml:space="preserve">64　</w:t>
       </w:r>
-      <w:hyperlink w:history="1" r:id="rIdeje28ua19amxzmypw3ski">
+      <w:hyperlink w:history="1" r:id="rIdz9haiye1aeis4hqt-99jt">
         <w:r>
           <w:rPr>
             <w:rStyle w:val="Hyperlink"/>
@@ -21622,7 +21538,7 @@
         </w:rPr>
         <w:t xml:space="preserve">65　</w:t>
       </w:r>
-      <w:hyperlink w:history="1" r:id="rIdslfhtifhz-i2pi_mky02s">
+      <w:hyperlink w:history="1" r:id="rIdk64ipbrr-gdp_wshamsrq">
         <w:r>
           <w:rPr>
             <w:rStyle w:val="Hyperlink"/>
@@ -21648,7 +21564,7 @@
         </w:rPr>
         <w:t xml:space="preserve">66　</w:t>
       </w:r>
-      <w:hyperlink w:history="1" r:id="rIdzxcvm4ujmap5x59olwoxk">
+      <w:hyperlink w:history="1" r:id="rIdjr9_dricaoeqjv6-k-qyh">
         <w:r>
           <w:rPr>
             <w:rStyle w:val="Hyperlink"/>
@@ -21674,7 +21590,7 @@
         </w:rPr>
         <w:t xml:space="preserve">67　</w:t>
       </w:r>
-      <w:hyperlink w:history="1" r:id="rIddhlez5arwphwsy8daooit">
+      <w:hyperlink w:history="1" r:id="rId-puams6ksgcflugonkrfp">
         <w:r>
           <w:rPr>
             <w:rStyle w:val="Hyperlink"/>
@@ -21700,7 +21616,7 @@
         </w:rPr>
         <w:t xml:space="preserve">68, 80, 85　</w:t>
       </w:r>
-      <w:hyperlink w:history="1" r:id="rIdggszuui0jec1xhg6lubpi">
+      <w:hyperlink w:history="1" r:id="rIdssloxokpwln9yk6pd69vq">
         <w:r>
           <w:rPr>
             <w:rStyle w:val="Hyperlink"/>
@@ -21726,7 +21642,7 @@
         </w:rPr>
         <w:t xml:space="preserve">70　</w:t>
       </w:r>
-      <w:hyperlink w:history="1" r:id="rIdynqayeyb003qfhw3fiplj">
+      <w:hyperlink w:history="1" r:id="rIddcnvhcqgud76ht-p3k2p4">
         <w:r>
           <w:rPr>
             <w:rStyle w:val="Hyperlink"/>
@@ -21752,7 +21668,7 @@
         </w:rPr>
         <w:t xml:space="preserve">71　</w:t>
       </w:r>
-      <w:hyperlink w:history="1" r:id="rIdz12sl7vmgvvl5ydgdmi5k">
+      <w:hyperlink w:history="1" r:id="rIdpcgczpq1dfw0edawq-q6l">
         <w:r>
           <w:rPr>
             <w:rStyle w:val="Hyperlink"/>
@@ -21778,7 +21694,7 @@
         </w:rPr>
         <w:t xml:space="preserve">72　</w:t>
       </w:r>
-      <w:hyperlink w:history="1" r:id="rIdji483tsvn0t-ia8r45yyo">
+      <w:hyperlink w:history="1" r:id="rIdlwq1e73s-rsift5kn5jg_">
         <w:r>
           <w:rPr>
             <w:rStyle w:val="Hyperlink"/>
@@ -21804,7 +21720,7 @@
         </w:rPr>
         <w:t xml:space="preserve">75　</w:t>
       </w:r>
-      <w:hyperlink w:history="1" r:id="rIdrvpepqqxtogockf_rerqu">
+      <w:hyperlink w:history="1" r:id="rIdu3y5-o8dynmr7q4wiswzq">
         <w:r>
           <w:rPr>
             <w:rStyle w:val="Hyperlink"/>
@@ -21830,7 +21746,7 @@
         </w:rPr>
         <w:t xml:space="preserve">76　</w:t>
       </w:r>
-      <w:hyperlink w:history="1" r:id="rIdumzobtznm3acyx_573s8a">
+      <w:hyperlink w:history="1" r:id="rId-w9vmwkmgywxcioltr0-u">
         <w:r>
           <w:rPr>
             <w:rStyle w:val="Hyperlink"/>
@@ -21856,7 +21772,7 @@
         </w:rPr>
         <w:t xml:space="preserve">77　</w:t>
       </w:r>
-      <w:hyperlink w:history="1" r:id="rIdvkwoha5qte9s8as0gm8tl">
+      <w:hyperlink w:history="1" r:id="rIdyxxoxmh1bbg2hmxvpqrod">
         <w:r>
           <w:rPr>
             <w:rStyle w:val="Hyperlink"/>
@@ -21882,7 +21798,7 @@
         </w:rPr>
         <w:t xml:space="preserve">82　</w:t>
       </w:r>
-      <w:hyperlink w:history="1" r:id="rIdko2mzxbb7tmsfqmzrjvyr">
+      <w:hyperlink w:history="1" r:id="rIdesbt_l7d_d1mhhn7ru4ei">
         <w:r>
           <w:rPr>
             <w:rStyle w:val="Hyperlink"/>
@@ -21908,7 +21824,7 @@
         </w:rPr>
         <w:t xml:space="preserve">83　</w:t>
       </w:r>
-      <w:hyperlink w:history="1" r:id="rIdfaopp1xo4mpfnjflnoyzv">
+      <w:hyperlink w:history="1" r:id="rIdfuxscibnpzpzcokinkcs0">
         <w:r>
           <w:rPr>
             <w:rStyle w:val="Hyperlink"/>
@@ -21934,7 +21850,7 @@
         </w:rPr>
         <w:t xml:space="preserve">86　</w:t>
       </w:r>
-      <w:hyperlink w:history="1" r:id="rIda7akw-7cy2lksnxguw3_o">
+      <w:hyperlink w:history="1" r:id="rIdxqfeej1aa2wee6118tje4">
         <w:r>
           <w:rPr>
             <w:rStyle w:val="Hyperlink"/>
@@ -21960,7 +21876,7 @@
         </w:rPr>
         <w:t xml:space="preserve">87, 88　</w:t>
       </w:r>
-      <w:hyperlink w:history="1" r:id="rIdphpijmk3vith0mt6ocq6j">
+      <w:hyperlink w:history="1" r:id="rIdvpx6ra_9bcg_msbd290ij">
         <w:r>
           <w:rPr>
             <w:rStyle w:val="Hyperlink"/>
@@ -21986,7 +21902,7 @@
         </w:rPr>
         <w:t xml:space="preserve">89　</w:t>
       </w:r>
-      <w:hyperlink w:history="1" r:id="rIda0rwt5ztrv1l6ao-g2bzg">
+      <w:hyperlink w:history="1" r:id="rId6pt4udbtrj3mnlttp2ren">
         <w:r>
           <w:rPr>
             <w:rStyle w:val="Hyperlink"/>
@@ -23446,7 +23362,7 @@
         </w:rPr>
         <w:t xml:space="preserve">1, 6, 8, 30　</w:t>
       </w:r>
-      <w:hyperlink w:history="1" r:id="rIdmeodl6tzsbxnzoqyw4ggf">
+      <w:hyperlink w:history="1" r:id="rIdcycgsw32bmimmccupopps">
         <w:r>
           <w:rPr>
             <w:rStyle w:val="Hyperlink"/>
@@ -23472,7 +23388,7 @@
         </w:rPr>
         <w:t xml:space="preserve">2　</w:t>
       </w:r>
-      <w:hyperlink w:history="1" r:id="rId-jftb_hzozpqf-tscxsy6">
+      <w:hyperlink w:history="1" r:id="rIdsqun-zsubsvxtxszsulnw">
         <w:r>
           <w:rPr>
             <w:rStyle w:val="Hyperlink"/>
@@ -23498,7 +23414,7 @@
         </w:rPr>
         <w:t xml:space="preserve">3　</w:t>
       </w:r>
-      <w:hyperlink w:history="1" r:id="rIddo_mcdaohtvjjcydhwcus">
+      <w:hyperlink w:history="1" r:id="rIdpt8xn2hw8cnvvrjwksuzu">
         <w:r>
           <w:rPr>
             <w:rStyle w:val="Hyperlink"/>
@@ -23524,7 +23440,7 @@
         </w:rPr>
         <w:t xml:space="preserve">4　</w:t>
       </w:r>
-      <w:hyperlink w:history="1" r:id="rIdmfbiwcirpgno37wqwzi6f">
+      <w:hyperlink w:history="1" r:id="rIdebxymxnewyejotjhn3hck">
         <w:r>
           <w:rPr>
             <w:rStyle w:val="Hyperlink"/>
@@ -23550,7 +23466,7 @@
         </w:rPr>
         <w:t xml:space="preserve">5　</w:t>
       </w:r>
-      <w:hyperlink w:history="1" r:id="rIdzojzbsiklrg_gwmjcsgvw">
+      <w:hyperlink w:history="1" r:id="rId0c9ds4jepp7g3ix0v4bas">
         <w:r>
           <w:rPr>
             <w:rStyle w:val="Hyperlink"/>
@@ -23576,7 +23492,7 @@
         </w:rPr>
         <w:t xml:space="preserve">7, 18　</w:t>
       </w:r>
-      <w:hyperlink w:history="1" r:id="rId9md5qiqy82uqsoohc4idq">
+      <w:hyperlink w:history="1" r:id="rIdgaijsweqbhyqt2bqewppx">
         <w:r>
           <w:rPr>
             <w:rStyle w:val="Hyperlink"/>
@@ -23602,7 +23518,7 @@
         </w:rPr>
         <w:t xml:space="preserve">9　</w:t>
       </w:r>
-      <w:hyperlink w:history="1" r:id="rIdsdo0lrlgmknduieqsxjfb">
+      <w:hyperlink w:history="1" r:id="rIdjb-2hnfrtnkddm8ti4iyy">
         <w:r>
           <w:rPr>
             <w:rStyle w:val="Hyperlink"/>
@@ -23628,7 +23544,7 @@
         </w:rPr>
         <w:t xml:space="preserve">10, 22　</w:t>
       </w:r>
-      <w:hyperlink w:history="1" r:id="rIdo7pbcvgwe_8ddfa47tqzb">
+      <w:hyperlink w:history="1" r:id="rIdauxdlew8xfltyezmajc0q">
         <w:r>
           <w:rPr>
             <w:rStyle w:val="Hyperlink"/>
@@ -23654,7 +23570,7 @@
         </w:rPr>
         <w:t xml:space="preserve">11, 24　</w:t>
       </w:r>
-      <w:hyperlink w:history="1" r:id="rIdvqixjabnwwm1bbmaqc2wd">
+      <w:hyperlink w:history="1" r:id="rId_t4_i5eztrolorbvdwk46">
         <w:r>
           <w:rPr>
             <w:rStyle w:val="Hyperlink"/>
@@ -23680,7 +23596,7 @@
         </w:rPr>
         <w:t xml:space="preserve">12, 13　</w:t>
       </w:r>
-      <w:hyperlink w:history="1" r:id="rId4o3gdw6wf5pwzsmows9_7">
+      <w:hyperlink w:history="1" r:id="rId0tzps15xl9f5p_koikshe">
         <w:r>
           <w:rPr>
             <w:rStyle w:val="Hyperlink"/>
@@ -23706,7 +23622,7 @@
         </w:rPr>
         <w:t xml:space="preserve">14　</w:t>
       </w:r>
-      <w:hyperlink w:history="1" r:id="rIdpe8-nhizdti8wzlb_e88c">
+      <w:hyperlink w:history="1" r:id="rIdegne-bkjh4ivf0c-wn-_v">
         <w:r>
           <w:rPr>
             <w:rStyle w:val="Hyperlink"/>
@@ -23732,7 +23648,7 @@
         </w:rPr>
         <w:t xml:space="preserve">15　</w:t>
       </w:r>
-      <w:hyperlink w:history="1" r:id="rId9btefm_x2niajsg-ujsyt">
+      <w:hyperlink w:history="1" r:id="rIdknqaurp0emi1rjcnjdrsb">
         <w:r>
           <w:rPr>
             <w:rStyle w:val="Hyperlink"/>
@@ -23758,7 +23674,7 @@
         </w:rPr>
         <w:t xml:space="preserve">16, 20　</w:t>
       </w:r>
-      <w:hyperlink w:history="1" r:id="rIdgj0hyfk9tg-gbxlnwnvsz">
+      <w:hyperlink w:history="1" r:id="rIdvxzxq45umzkwciprx1u4f">
         <w:r>
           <w:rPr>
             <w:rStyle w:val="Hyperlink"/>
@@ -23784,7 +23700,7 @@
         </w:rPr>
         <w:t xml:space="preserve">17　</w:t>
       </w:r>
-      <w:hyperlink w:history="1" r:id="rIdhwtbhxgjvehjbxnksosgf">
+      <w:hyperlink w:history="1" r:id="rIdrgwhd_rifctxprld5hvn6">
         <w:r>
           <w:rPr>
             <w:rStyle w:val="Hyperlink"/>
@@ -23810,7 +23726,7 @@
         </w:rPr>
         <w:t xml:space="preserve">19, 23　</w:t>
       </w:r>
-      <w:hyperlink w:history="1" r:id="rIdba-p51mhzglkllod19g3b">
+      <w:hyperlink w:history="1" r:id="rIds7camdhkiyq8sxocvcnhe">
         <w:r>
           <w:rPr>
             <w:rStyle w:val="Hyperlink"/>
@@ -23836,7 +23752,7 @@
         </w:rPr>
         <w:t xml:space="preserve">21　</w:t>
       </w:r>
-      <w:hyperlink w:history="1" r:id="rId_izhiq-jel-vh1hdpw4by">
+      <w:hyperlink w:history="1" r:id="rIdiuxohimh83f-fbbk2pasv">
         <w:r>
           <w:rPr>
             <w:rStyle w:val="Hyperlink"/>
@@ -23862,7 +23778,7 @@
         </w:rPr>
         <w:t xml:space="preserve">25　</w:t>
       </w:r>
-      <w:hyperlink w:history="1" r:id="rId6c9mx3pl9vlerz3b7nwgx">
+      <w:hyperlink w:history="1" r:id="rIdzjecpjovprhtpvjxvjqs8">
         <w:r>
           <w:rPr>
             <w:rStyle w:val="Hyperlink"/>
@@ -23888,7 +23804,7 @@
         </w:rPr>
         <w:t xml:space="preserve">26, 29　</w:t>
       </w:r>
-      <w:hyperlink w:history="1" r:id="rId3-kw8x6ndbem-odayw-s8">
+      <w:hyperlink w:history="1" r:id="rIdgq_jgqempdgolv2v9gpz-">
         <w:r>
           <w:rPr>
             <w:rStyle w:val="Hyperlink"/>
@@ -23914,7 +23830,7 @@
         </w:rPr>
         <w:t xml:space="preserve">27　</w:t>
       </w:r>
-      <w:hyperlink w:history="1" r:id="rIdsiy6ghaqiynolgy4a5e_i">
+      <w:hyperlink w:history="1" r:id="rIdzlh5kzbgixw3hvqd9ltm0">
         <w:r>
           <w:rPr>
             <w:rStyle w:val="Hyperlink"/>
@@ -23940,7 +23856,7 @@
         </w:rPr>
         <w:t xml:space="preserve">28　</w:t>
       </w:r>
-      <w:hyperlink w:history="1" r:id="rIdubwvjr4nhjxgf78lsxtl6">
+      <w:hyperlink w:history="1" r:id="rId0cis5vzdnjra4mzl-37uu">
         <w:r>
           <w:rPr>
             <w:rStyle w:val="Hyperlink"/>
@@ -23966,7 +23882,7 @@
         </w:rPr>
         <w:t xml:space="preserve">31　</w:t>
       </w:r>
-      <w:hyperlink w:history="1" r:id="rIdttaqhg-jdxh-2ujoyspzd">
+      <w:hyperlink w:history="1" r:id="rIdy9xq2qfl3qeczxd8vo2ai">
         <w:r>
           <w:rPr>
             <w:rStyle w:val="Hyperlink"/>
@@ -23992,7 +23908,7 @@
         </w:rPr>
         <w:t xml:space="preserve">32　</w:t>
       </w:r>
-      <w:hyperlink w:history="1" r:id="rIddi4ijsxlexjmigqw7fh-g">
+      <w:hyperlink w:history="1" r:id="rIdusmtawrihqt4hyqx6zqse">
         <w:r>
           <w:rPr>
             <w:rStyle w:val="Hyperlink"/>
@@ -26726,7 +26642,7 @@
         </w:rPr>
         <w:t xml:space="preserve">1, 7　</w:t>
       </w:r>
-      <w:hyperlink w:history="1" r:id="rIdx6fpzlribqtb-caxigqvr">
+      <w:hyperlink w:history="1" r:id="rIdzvbtcwxpisg8be-77gu9p">
         <w:r>
           <w:rPr>
             <w:rStyle w:val="Hyperlink"/>
@@ -26752,7 +26668,7 @@
         </w:rPr>
         <w:t xml:space="preserve">2　</w:t>
       </w:r>
-      <w:hyperlink w:history="1" r:id="rIdm47y_ts68pbplhq1pzs3g">
+      <w:hyperlink w:history="1" r:id="rId2vtumsyycc3fy9ugm2mso">
         <w:r>
           <w:rPr>
             <w:rStyle w:val="Hyperlink"/>
@@ -26778,7 +26694,7 @@
         </w:rPr>
         <w:t xml:space="preserve">3　</w:t>
       </w:r>
-      <w:hyperlink w:history="1" r:id="rIdomd4f-svxv7bervs4z-qk">
+      <w:hyperlink w:history="1" r:id="rIdm2qqswnrjbjzfkdyzj5c5">
         <w:r>
           <w:rPr>
             <w:rStyle w:val="Hyperlink"/>
@@ -26804,7 +26720,7 @@
         </w:rPr>
         <w:t xml:space="preserve">4　</w:t>
       </w:r>
-      <w:hyperlink w:history="1" r:id="rIdxc8c_jmjugarzvqz_qh2n">
+      <w:hyperlink w:history="1" r:id="rIdqysve6m_echvoo6lszafz">
         <w:r>
           <w:rPr>
             <w:rStyle w:val="Hyperlink"/>
@@ -26830,7 +26746,7 @@
         </w:rPr>
         <w:t xml:space="preserve">5　</w:t>
       </w:r>
-      <w:hyperlink w:history="1" r:id="rIdf8lclhstwg9gw7zykrn46">
+      <w:hyperlink w:history="1" r:id="rIdgee6z5r7v7axfbpyjnxfy">
         <w:r>
           <w:rPr>
             <w:rStyle w:val="Hyperlink"/>
@@ -26856,7 +26772,7 @@
         </w:rPr>
         <w:t xml:space="preserve">6　</w:t>
       </w:r>
-      <w:hyperlink w:history="1" r:id="rIdmerk0_qcfojevuz9fnktm">
+      <w:hyperlink w:history="1" r:id="rIdcrj5p7inurukmnjv5yx69">
         <w:r>
           <w:rPr>
             <w:rStyle w:val="Hyperlink"/>
@@ -26882,7 +26798,7 @@
         </w:rPr>
         <w:t xml:space="preserve">8　</w:t>
       </w:r>
-      <w:hyperlink w:history="1" r:id="rIdts9q2vdzfy61qtrevl9gb">
+      <w:hyperlink w:history="1" r:id="rIdjbajf38aj3y8n0jnq01pt">
         <w:r>
           <w:rPr>
             <w:rStyle w:val="Hyperlink"/>
@@ -26908,7 +26824,7 @@
         </w:rPr>
         <w:t xml:space="preserve">9　</w:t>
       </w:r>
-      <w:hyperlink w:history="1" r:id="rIdieuihxatzgw-kc9be4fqm">
+      <w:hyperlink w:history="1" r:id="rIdus0x9imnjqn7k92nbpkli">
         <w:r>
           <w:rPr>
             <w:rStyle w:val="Hyperlink"/>
@@ -26934,7 +26850,7 @@
         </w:rPr>
         <w:t xml:space="preserve">10　</w:t>
       </w:r>
-      <w:hyperlink w:history="1" r:id="rIdttb5j_i23wy4mbs6vvzhd">
+      <w:hyperlink w:history="1" r:id="rIdpinrmd7kt4vqaiciuaaff">
         <w:r>
           <w:rPr>
             <w:rStyle w:val="Hyperlink"/>
@@ -26960,7 +26876,7 @@
         </w:rPr>
         <w:t xml:space="preserve">11, 25　</w:t>
       </w:r>
-      <w:hyperlink w:history="1" r:id="rIdaomqcri_qvrbscw6nmudy">
+      <w:hyperlink w:history="1" r:id="rId3uuuyhms0euaqh6tkv_w-">
         <w:r>
           <w:rPr>
             <w:rStyle w:val="Hyperlink"/>
@@ -26986,7 +26902,7 @@
         </w:rPr>
         <w:t xml:space="preserve">12　</w:t>
       </w:r>
-      <w:hyperlink w:history="1" r:id="rIdugzynmdfcc8wni3wqf5_h">
+      <w:hyperlink w:history="1" r:id="rIdkumrzzrfqwkdzccfcn6zi">
         <w:r>
           <w:rPr>
             <w:rStyle w:val="Hyperlink"/>
@@ -27012,7 +26928,7 @@
         </w:rPr>
         <w:t xml:space="preserve">13, 59　</w:t>
       </w:r>
-      <w:hyperlink w:history="1" r:id="rIdowiid0pwri7pctrczqbj5">
+      <w:hyperlink w:history="1" r:id="rIduuhkhcvnd8gn3a4ekr_rn">
         <w:r>
           <w:rPr>
             <w:rStyle w:val="Hyperlink"/>
@@ -27038,7 +26954,7 @@
         </w:rPr>
         <w:t xml:space="preserve">14, 18, 46　</w:t>
       </w:r>
-      <w:hyperlink w:history="1" r:id="rIdx5b5lxrofuo1_ey9taxyi">
+      <w:hyperlink w:history="1" r:id="rIdg3mrkecrcc1zwilyp0cd3">
         <w:r>
           <w:rPr>
             <w:rStyle w:val="Hyperlink"/>
@@ -27064,7 +26980,7 @@
         </w:rPr>
         <w:t xml:space="preserve">15　</w:t>
       </w:r>
-      <w:hyperlink w:history="1" r:id="rIdexhbjse4-etbfvycvtk3r">
+      <w:hyperlink w:history="1" r:id="rIdtbasciesxbfv_5qp7vya5">
         <w:r>
           <w:rPr>
             <w:rStyle w:val="Hyperlink"/>
@@ -27090,7 +27006,7 @@
         </w:rPr>
         <w:t xml:space="preserve">16　</w:t>
       </w:r>
-      <w:hyperlink w:history="1" r:id="rId9-hqc0ld6mwyvlgyrw_o_">
+      <w:hyperlink w:history="1" r:id="rIdv93p3yutexmjxipfwaccl">
         <w:r>
           <w:rPr>
             <w:rStyle w:val="Hyperlink"/>
@@ -27116,7 +27032,7 @@
         </w:rPr>
         <w:t xml:space="preserve">17, 48　</w:t>
       </w:r>
-      <w:hyperlink w:history="1" r:id="rId04yxes253zcam3wx-nvqp">
+      <w:hyperlink w:history="1" r:id="rIdu_39umtf17w9bgn1fht-d">
         <w:r>
           <w:rPr>
             <w:rStyle w:val="Hyperlink"/>
@@ -27142,7 +27058,7 @@
         </w:rPr>
         <w:t xml:space="preserve">19　</w:t>
       </w:r>
-      <w:hyperlink w:history="1" r:id="rIdenbgix1igraeke0asjdot">
+      <w:hyperlink w:history="1" r:id="rIdgddlhj2u1vxyx9kqkfkqn">
         <w:r>
           <w:rPr>
             <w:rStyle w:val="Hyperlink"/>
@@ -27168,7 +27084,7 @@
         </w:rPr>
         <w:t xml:space="preserve">20　</w:t>
       </w:r>
-      <w:hyperlink w:history="1" r:id="rIdi4uncusisihoikg7rijhx">
+      <w:hyperlink w:history="1" r:id="rIdn_2ogihgb3rgbqd7xno2y">
         <w:r>
           <w:rPr>
             <w:rStyle w:val="Hyperlink"/>
@@ -27194,7 +27110,7 @@
         </w:rPr>
         <w:t xml:space="preserve">21, 35　</w:t>
       </w:r>
-      <w:hyperlink w:history="1" r:id="rIdrm1tnvlwfoylwp1fcuwwy">
+      <w:hyperlink w:history="1" r:id="rIdqeydgenbfgsdz6wo26ttj">
         <w:r>
           <w:rPr>
             <w:rStyle w:val="Hyperlink"/>
@@ -27220,7 +27136,7 @@
         </w:rPr>
         <w:t xml:space="preserve">22　</w:t>
       </w:r>
-      <w:hyperlink w:history="1" r:id="rIdyurjuct4hdylw0rcfrggp">
+      <w:hyperlink w:history="1" r:id="rIdqjztxuxj15dttgsmonlal">
         <w:r>
           <w:rPr>
             <w:rStyle w:val="Hyperlink"/>
@@ -27246,7 +27162,7 @@
         </w:rPr>
         <w:t xml:space="preserve">23, 41　</w:t>
       </w:r>
-      <w:hyperlink w:history="1" r:id="rIdb-34xuls3giaje2tesp3u">
+      <w:hyperlink w:history="1" r:id="rId6tj7kxwpvpigz8sff0-ld">
         <w:r>
           <w:rPr>
             <w:rStyle w:val="Hyperlink"/>
@@ -27272,7 +27188,7 @@
         </w:rPr>
         <w:t xml:space="preserve">24　</w:t>
       </w:r>
-      <w:hyperlink w:history="1" r:id="rIdpnrctgvef-uy8ynbagrvi">
+      <w:hyperlink w:history="1" r:id="rIdu7emtemakeyewzdwcz0h7">
         <w:r>
           <w:rPr>
             <w:rStyle w:val="Hyperlink"/>
@@ -27298,7 +27214,7 @@
         </w:rPr>
         <w:t xml:space="preserve">26　</w:t>
       </w:r>
-      <w:hyperlink w:history="1" r:id="rIdhlpwq52hb-lww9jwpgt6c">
+      <w:hyperlink w:history="1" r:id="rIdtinlcf8o2cyfszt0umjpg">
         <w:r>
           <w:rPr>
             <w:rStyle w:val="Hyperlink"/>
@@ -27324,7 +27240,7 @@
         </w:rPr>
         <w:t xml:space="preserve">27　</w:t>
       </w:r>
-      <w:hyperlink w:history="1" r:id="rIdcdkdg-ipjjfto3djwss9a">
+      <w:hyperlink w:history="1" r:id="rId6vihz9tqbtaatnqqqe8w5">
         <w:r>
           <w:rPr>
             <w:rStyle w:val="Hyperlink"/>
@@ -27350,7 +27266,7 @@
         </w:rPr>
         <w:t xml:space="preserve">28　</w:t>
       </w:r>
-      <w:hyperlink w:history="1" r:id="rIduotmmssl6prf4omsniioa">
+      <w:hyperlink w:history="1" r:id="rIdk9ex9stdex0ozv686ra94">
         <w:r>
           <w:rPr>
             <w:rStyle w:val="Hyperlink"/>
@@ -27376,7 +27292,7 @@
         </w:rPr>
         <w:t xml:space="preserve">29　</w:t>
       </w:r>
-      <w:hyperlink w:history="1" r:id="rIdd4l1pukro4fhoe5g94fwr">
+      <w:hyperlink w:history="1" r:id="rIdqbax577pjs_vvgdju7sbq">
         <w:r>
           <w:rPr>
             <w:rStyle w:val="Hyperlink"/>
@@ -27402,7 +27318,7 @@
         </w:rPr>
         <w:t xml:space="preserve">30, 40　</w:t>
       </w:r>
-      <w:hyperlink w:history="1" r:id="rId4yzhxwhoc__bvqafo7uj7">
+      <w:hyperlink w:history="1" r:id="rIdyvxocfozet1rm2j7yei3v">
         <w:r>
           <w:rPr>
             <w:rStyle w:val="Hyperlink"/>
@@ -27428,7 +27344,7 @@
         </w:rPr>
         <w:t xml:space="preserve">31　</w:t>
       </w:r>
-      <w:hyperlink w:history="1" r:id="rIdm1kwbhetosh03gbqjbwdc">
+      <w:hyperlink w:history="1" r:id="rId7ljmlkanfoaplh5bzoa26">
         <w:r>
           <w:rPr>
             <w:rStyle w:val="Hyperlink"/>
@@ -27454,7 +27370,7 @@
         </w:rPr>
         <w:t xml:space="preserve">32　</w:t>
       </w:r>
-      <w:hyperlink w:history="1" r:id="rId5oogjojryzni9kvsyjvt4">
+      <w:hyperlink w:history="1" r:id="rIdzb3brkhnvd3txypgpcygn">
         <w:r>
           <w:rPr>
             <w:rStyle w:val="Hyperlink"/>
@@ -27480,7 +27396,7 @@
         </w:rPr>
         <w:t xml:space="preserve">33　</w:t>
       </w:r>
-      <w:hyperlink w:history="1" r:id="rIdw40vmj_tujn4cg3sgbtr_">
+      <w:hyperlink w:history="1" r:id="rId1d8on0msm-gzqxkchr4ux">
         <w:r>
           <w:rPr>
             <w:rStyle w:val="Hyperlink"/>
@@ -27506,7 +27422,7 @@
         </w:rPr>
         <w:t xml:space="preserve">34　</w:t>
       </w:r>
-      <w:hyperlink w:history="1" r:id="rIdtbknnhsakdvbx94a3xe6r">
+      <w:hyperlink w:history="1" r:id="rIdbkpxf1mrtzzxhnscsyq2-">
         <w:r>
           <w:rPr>
             <w:rStyle w:val="Hyperlink"/>
@@ -27532,7 +27448,7 @@
         </w:rPr>
         <w:t xml:space="preserve">36　</w:t>
       </w:r>
-      <w:hyperlink w:history="1" r:id="rId76eahrmigtkwaejj_co7q">
+      <w:hyperlink w:history="1" r:id="rId49fpjwhxpy4_uahloj_-k">
         <w:r>
           <w:rPr>
             <w:rStyle w:val="Hyperlink"/>
@@ -27558,7 +27474,7 @@
         </w:rPr>
         <w:t xml:space="preserve">37　</w:t>
       </w:r>
-      <w:hyperlink w:history="1" r:id="rIdn70mnb40t3rrfakz0v91t">
+      <w:hyperlink w:history="1" r:id="rIdfn9t3cp6a7gpuottseoqp">
         <w:r>
           <w:rPr>
             <w:rStyle w:val="Hyperlink"/>
@@ -27584,7 +27500,7 @@
         </w:rPr>
         <w:t xml:space="preserve">38　</w:t>
       </w:r>
-      <w:hyperlink w:history="1" r:id="rIdqajrizpy7a9zo_o9qpmdc">
+      <w:hyperlink w:history="1" r:id="rIdinixydymg8hwa1zy5r1dl">
         <w:r>
           <w:rPr>
             <w:rStyle w:val="Hyperlink"/>
@@ -27610,7 +27526,7 @@
         </w:rPr>
         <w:t xml:space="preserve">39　</w:t>
       </w:r>
-      <w:hyperlink w:history="1" r:id="rIdalnjqzrnvkf1p5p-_tntt">
+      <w:hyperlink w:history="1" r:id="rIdv7ttlgryyailx_o82o5ft">
         <w:r>
           <w:rPr>
             <w:rStyle w:val="Hyperlink"/>
@@ -27636,7 +27552,7 @@
         </w:rPr>
         <w:t xml:space="preserve">42　</w:t>
       </w:r>
-      <w:hyperlink w:history="1" r:id="rIdtq0mebcst9izj58eg_cgo">
+      <w:hyperlink w:history="1" r:id="rIdytmxr0dourezbvp_inemv">
         <w:r>
           <w:rPr>
             <w:rStyle w:val="Hyperlink"/>
@@ -27662,7 +27578,7 @@
         </w:rPr>
         <w:t xml:space="preserve">43　</w:t>
       </w:r>
-      <w:hyperlink w:history="1" r:id="rIdf1n3bkw45rig2wnxiavbl">
+      <w:hyperlink w:history="1" r:id="rIdhmmp5j2nxbrr5q05bu0cm">
         <w:r>
           <w:rPr>
             <w:rStyle w:val="Hyperlink"/>
@@ -27688,7 +27604,7 @@
         </w:rPr>
         <w:t xml:space="preserve">44, 52　</w:t>
       </w:r>
-      <w:hyperlink w:history="1" r:id="rId-q-8zn7fnu30lk-m8zs7w">
+      <w:hyperlink w:history="1" r:id="rIdjl1djchseb2fjckmmx4fs">
         <w:r>
           <w:rPr>
             <w:rStyle w:val="Hyperlink"/>
@@ -27714,7 +27630,7 @@
         </w:rPr>
         <w:t xml:space="preserve">45　</w:t>
       </w:r>
-      <w:hyperlink w:history="1" r:id="rIdyn-2kpdh-xx0r5axgxqpr">
+      <w:hyperlink w:history="1" r:id="rIdg1pgy-uxsmqb9ga6h48-p">
         <w:r>
           <w:rPr>
             <w:rStyle w:val="Hyperlink"/>
@@ -27740,7 +27656,7 @@
         </w:rPr>
         <w:t xml:space="preserve">47, 55　</w:t>
       </w:r>
-      <w:hyperlink w:history="1" r:id="rIdfumwio1x_nr8mymjlw-ox">
+      <w:hyperlink w:history="1" r:id="rIdb2sj_fqtshuvtjfinjwxa">
         <w:r>
           <w:rPr>
             <w:rStyle w:val="Hyperlink"/>
@@ -27766,7 +27682,7 @@
         </w:rPr>
         <w:t xml:space="preserve">49　</w:t>
       </w:r>
-      <w:hyperlink w:history="1" r:id="rIdlmjyr785ajcrwcstexfti">
+      <w:hyperlink w:history="1" r:id="rId1ibplnit1h4fjxzsiybmq">
         <w:r>
           <w:rPr>
             <w:rStyle w:val="Hyperlink"/>
@@ -27792,7 +27708,7 @@
         </w:rPr>
         <w:t xml:space="preserve">50　</w:t>
       </w:r>
-      <w:hyperlink w:history="1" r:id="rIde5etgpzorgvtmkvhiidpp">
+      <w:hyperlink w:history="1" r:id="rId42k0zkbo0nlpokqpqjx19">
         <w:r>
           <w:rPr>
             <w:rStyle w:val="Hyperlink"/>
@@ -27818,7 +27734,7 @@
         </w:rPr>
         <w:t xml:space="preserve">51　</w:t>
       </w:r>
-      <w:hyperlink w:history="1" r:id="rIdl9xr6wahcobkaouylhx0g">
+      <w:hyperlink w:history="1" r:id="rId3nh4hocts_1tfbrojcwqh">
         <w:r>
           <w:rPr>
             <w:rStyle w:val="Hyperlink"/>
@@ -27844,7 +27760,7 @@
         </w:rPr>
         <w:t xml:space="preserve">53　</w:t>
       </w:r>
-      <w:hyperlink w:history="1" r:id="rIdwnap9aslwep8uhh32jgkv">
+      <w:hyperlink w:history="1" r:id="rId91pa1a0mmtuip7w_ekhyz">
         <w:r>
           <w:rPr>
             <w:rStyle w:val="Hyperlink"/>
@@ -27870,7 +27786,7 @@
         </w:rPr>
         <w:t xml:space="preserve">54, 57　</w:t>
       </w:r>
-      <w:hyperlink w:history="1" r:id="rId2ly5lnlhif3r1lb1vmcc_">
+      <w:hyperlink w:history="1" r:id="rIdaerxohrupmt4_jplcuumt">
         <w:r>
           <w:rPr>
             <w:rStyle w:val="Hyperlink"/>
@@ -27896,7 +27812,7 @@
         </w:rPr>
         <w:t xml:space="preserve">56, 61　</w:t>
       </w:r>
-      <w:hyperlink w:history="1" r:id="rId8srxjfc3owozzg228jprf">
+      <w:hyperlink w:history="1" r:id="rIdsbjwx1xmfxxzeq2hsaq5i">
         <w:r>
           <w:rPr>
             <w:rStyle w:val="Hyperlink"/>
@@ -27922,7 +27838,7 @@
         </w:rPr>
         <w:t xml:space="preserve">58　</w:t>
       </w:r>
-      <w:hyperlink w:history="1" r:id="rId7bcd_b1d8dlvuappb_6om">
+      <w:hyperlink w:history="1" r:id="rIdid41ae7tigilb1ge6g35g">
         <w:r>
           <w:rPr>
             <w:rStyle w:val="Hyperlink"/>
@@ -27948,7 +27864,7 @@
         </w:rPr>
         <w:t xml:space="preserve">60　</w:t>
       </w:r>
-      <w:hyperlink w:history="1" r:id="rIdzsflrukeuh8mhaqra-xas">
+      <w:hyperlink w:history="1" r:id="rIda_uvbiibr9fjihw33yxsp">
         <w:r>
           <w:rPr>
             <w:rStyle w:val="Hyperlink"/>
@@ -27974,7 +27890,7 @@
         </w:rPr>
         <w:t xml:space="preserve">62　</w:t>
       </w:r>
-      <w:hyperlink w:history="1" r:id="rId_t2mavad0c41ybik8wysl">
+      <w:hyperlink w:history="1" r:id="rIdyisapoqhn6lj4wg2j-f0n">
         <w:r>
           <w:rPr>
             <w:rStyle w:val="Hyperlink"/>
@@ -28000,7 +27916,7 @@
         </w:rPr>
         <w:t xml:space="preserve">63, 64　</w:t>
       </w:r>
-      <w:hyperlink w:history="1" r:id="rIddgfovoyxmkqrsb8u1aaiv">
+      <w:hyperlink w:history="1" r:id="rIdm2uz7zlmcyffqudzbuhvm">
         <w:r>
           <w:rPr>
             <w:rStyle w:val="Hyperlink"/>
@@ -28026,7 +27942,7 @@
         </w:rPr>
         <w:t xml:space="preserve">65　</w:t>
       </w:r>
-      <w:hyperlink w:history="1" r:id="rId6jg5yvixwkg8y3h25sbod">
+      <w:hyperlink w:history="1" r:id="rId6ratjl1nu0pfyzmihud1l">
         <w:r>
           <w:rPr>
             <w:rStyle w:val="Hyperlink"/>
@@ -28052,7 +27968,7 @@
         </w:rPr>
         <w:t xml:space="preserve">66　</w:t>
       </w:r>
-      <w:hyperlink w:history="1" r:id="rIdbhtcorzq_46c1t6xj-hny">
+      <w:hyperlink w:history="1" r:id="rIdoc76xq8mscm2e1ixlaq_b">
         <w:r>
           <w:rPr>
             <w:rStyle w:val="Hyperlink"/>
@@ -28078,7 +27994,7 @@
         </w:rPr>
         <w:t xml:space="preserve">67　</w:t>
       </w:r>
-      <w:hyperlink w:history="1" r:id="rId6d64vwg6pz3-axxjpspq0">
+      <w:hyperlink w:history="1" r:id="rIdpivckvj6yakf7mt9339j_">
         <w:r>
           <w:rPr>
             <w:rStyle w:val="Hyperlink"/>
@@ -28104,7 +28020,7 @@
         </w:rPr>
         <w:t xml:space="preserve">68　</w:t>
       </w:r>
-      <w:hyperlink w:history="1" r:id="rId4gbvepnajdly3qmjlmjhm">
+      <w:hyperlink w:history="1" r:id="rIds2eendzlczchy2zjd6cfh">
         <w:r>
           <w:rPr>
             <w:rStyle w:val="Hyperlink"/>
@@ -28130,7 +28046,7 @@
         </w:rPr>
         <w:t xml:space="preserve">69　</w:t>
       </w:r>
-      <w:hyperlink w:history="1" r:id="rIdd2euq9u9_o0cn9rmcgt3l">
+      <w:hyperlink w:history="1" r:id="rIdsryer_dizrn0qddgx-zbc">
         <w:r>
           <w:rPr>
             <w:rStyle w:val="Hyperlink"/>
@@ -28156,7 +28072,7 @@
         </w:rPr>
         <w:t xml:space="preserve">70　</w:t>
       </w:r>
-      <w:hyperlink w:history="1" r:id="rIdrqyzrdxfld8ll_v2iiqqe">
+      <w:hyperlink w:history="1" r:id="rIde_8y7_6eu-bbfqmaes68u">
         <w:r>
           <w:rPr>
             <w:rStyle w:val="Hyperlink"/>
@@ -29649,7 +29565,7 @@
         </w:rPr>
         <w:t xml:space="preserve">1　</w:t>
       </w:r>
-      <w:hyperlink w:history="1" r:id="rIdzvklfllzz5qyzxkhkncgt">
+      <w:hyperlink w:history="1" r:id="rId6u8chwn1jnmxtbj_6cezw">
         <w:r>
           <w:rPr>
             <w:rStyle w:val="Hyperlink"/>
@@ -29675,7 +29591,7 @@
         </w:rPr>
         <w:t xml:space="preserve">2, 7, 15　</w:t>
       </w:r>
-      <w:hyperlink w:history="1" r:id="rId6uf3nrp7m21y1thdxyp-g">
+      <w:hyperlink w:history="1" r:id="rIdjs2z21xnmoo4zwqmyexm7">
         <w:r>
           <w:rPr>
             <w:rStyle w:val="Hyperlink"/>
@@ -29701,7 +29617,7 @@
         </w:rPr>
         <w:t xml:space="preserve">3　</w:t>
       </w:r>
-      <w:hyperlink w:history="1" r:id="rIdemoc7bhjft2ei-ladnrt2">
+      <w:hyperlink w:history="1" r:id="rIdpvs7n_o6xm__e3dwpesug">
         <w:r>
           <w:rPr>
             <w:rStyle w:val="Hyperlink"/>
@@ -29727,7 +29643,7 @@
         </w:rPr>
         <w:t xml:space="preserve">4　</w:t>
       </w:r>
-      <w:hyperlink w:history="1" r:id="rIdj3t214aizkxb3asbdgmtq">
+      <w:hyperlink w:history="1" r:id="rIdi3gr_-8moeuif60wgcqbv">
         <w:r>
           <w:rPr>
             <w:rStyle w:val="Hyperlink"/>
@@ -29753,7 +29669,7 @@
         </w:rPr>
         <w:t xml:space="preserve">5　</w:t>
       </w:r>
-      <w:hyperlink w:history="1" r:id="rIdjwd9joxuo-jcxrt1ot12g">
+      <w:hyperlink w:history="1" r:id="rIdppjecu1xo8hybzfwvrbaz">
         <w:r>
           <w:rPr>
             <w:rStyle w:val="Hyperlink"/>
@@ -29779,7 +29695,7 @@
         </w:rPr>
         <w:t xml:space="preserve">6　</w:t>
       </w:r>
-      <w:hyperlink w:history="1" r:id="rIdl7ua7pzwlfkf8sskycc_d">
+      <w:hyperlink w:history="1" r:id="rIdvo9w7a8ade4bi28naydhz">
         <w:r>
           <w:rPr>
             <w:rStyle w:val="Hyperlink"/>
@@ -29805,7 +29721,7 @@
         </w:rPr>
         <w:t xml:space="preserve">8　</w:t>
       </w:r>
-      <w:hyperlink w:history="1" r:id="rIdhjw3xtz8_mr16fvugynz3">
+      <w:hyperlink w:history="1" r:id="rId9nyy5gj2a0vargr7ti2bd">
         <w:r>
           <w:rPr>
             <w:rStyle w:val="Hyperlink"/>
@@ -29831,7 +29747,7 @@
         </w:rPr>
         <w:t xml:space="preserve">9　</w:t>
       </w:r>
-      <w:hyperlink w:history="1" r:id="rIdwzqklkm4lcpujlx4a7div">
+      <w:hyperlink w:history="1" r:id="rId4e3y1v7tgnnmstwdblj6i">
         <w:r>
           <w:rPr>
             <w:rStyle w:val="Hyperlink"/>
@@ -29857,7 +29773,7 @@
         </w:rPr>
         <w:t xml:space="preserve">10　</w:t>
       </w:r>
-      <w:hyperlink w:history="1" r:id="rIdk4k-zqlidpncwko-b2mfe">
+      <w:hyperlink w:history="1" r:id="rIdav1wexq5bb0rjtpugvsse">
         <w:r>
           <w:rPr>
             <w:rStyle w:val="Hyperlink"/>
@@ -29883,7 +29799,7 @@
         </w:rPr>
         <w:t xml:space="preserve">11　</w:t>
       </w:r>
-      <w:hyperlink w:history="1" r:id="rIdcgdsgegnw_a38wusm4qhf">
+      <w:hyperlink w:history="1" r:id="rIdg2vaea_le5s8mcendvdoz">
         <w:r>
           <w:rPr>
             <w:rStyle w:val="Hyperlink"/>
@@ -29909,7 +29825,7 @@
         </w:rPr>
         <w:t xml:space="preserve">12　</w:t>
       </w:r>
-      <w:hyperlink w:history="1" r:id="rIdrpsshn5knptixgg3jw2ar">
+      <w:hyperlink w:history="1" r:id="rIdjp9gc7bkkla4yjahseaae">
         <w:r>
           <w:rPr>
             <w:rStyle w:val="Hyperlink"/>
@@ -29935,7 +29851,7 @@
         </w:rPr>
         <w:t xml:space="preserve">13　</w:t>
       </w:r>
-      <w:hyperlink w:history="1" r:id="rIdphavywpcyuwyzhdqjt9g6">
+      <w:hyperlink w:history="1" r:id="rIdqkma0pvvoo49yz6gucsfx">
         <w:r>
           <w:rPr>
             <w:rStyle w:val="Hyperlink"/>
@@ -29961,7 +29877,7 @@
         </w:rPr>
         <w:t xml:space="preserve">14　</w:t>
       </w:r>
-      <w:hyperlink w:history="1" r:id="rId5kzyzfogvnam8i5_2qnt7">
+      <w:hyperlink w:history="1" r:id="rIdi5ojshlzvio2fiylchwcg">
         <w:r>
           <w:rPr>
             <w:rStyle w:val="Hyperlink"/>
@@ -29987,7 +29903,7 @@
         </w:rPr>
         <w:t xml:space="preserve">16　</w:t>
       </w:r>
-      <w:hyperlink w:history="1" r:id="rIdsw8zzpjas9wehomrpszoh">
+      <w:hyperlink w:history="1" r:id="rIdh37ay3nbgwq6crruue2co">
         <w:r>
           <w:rPr>
             <w:rStyle w:val="Hyperlink"/>
@@ -30013,7 +29929,7 @@
         </w:rPr>
         <w:t xml:space="preserve">17　</w:t>
       </w:r>
-      <w:hyperlink w:history="1" r:id="rId5utocmvk3jx-vpaeubzbv">
+      <w:hyperlink w:history="1" r:id="rIdetjkidq9649xgutqodcvh">
         <w:r>
           <w:rPr>
             <w:rStyle w:val="Hyperlink"/>
@@ -30039,7 +29955,7 @@
         </w:rPr>
         <w:t xml:space="preserve">18, 19　</w:t>
       </w:r>
-      <w:hyperlink w:history="1" r:id="rId5y4fqo5t5xdjwe5vmml9b">
+      <w:hyperlink w:history="1" r:id="rIdgajpvzxxgdkpgxvnpbcwu">
         <w:r>
           <w:rPr>
             <w:rStyle w:val="Hyperlink"/>
@@ -30698,7 +30614,7 @@
         </w:rPr>
         <w:t xml:space="preserve">1, 3　</w:t>
       </w:r>
-      <w:hyperlink w:history="1" r:id="rIdxv2-mzahdfxgi_4zb8rw-">
+      <w:hyperlink w:history="1" r:id="rIdtasyonm_jr84rwq2bbd0i">
         <w:r>
           <w:rPr>
             <w:rStyle w:val="Hyperlink"/>
@@ -30724,7 +30640,7 @@
         </w:rPr>
         <w:t xml:space="preserve">2　</w:t>
       </w:r>
-      <w:hyperlink w:history="1" r:id="rIdtdz5ofy4benjna5u5vavj">
+      <w:hyperlink w:history="1" r:id="rIdqahk4o7kjg-j29pfm8o3j">
         <w:r>
           <w:rPr>
             <w:rStyle w:val="Hyperlink"/>
@@ -30750,7 +30666,7 @@
         </w:rPr>
         <w:t xml:space="preserve">4　</w:t>
       </w:r>
-      <w:hyperlink w:history="1" r:id="rId8km6xbyxkg2bz6_c_zxux">
+      <w:hyperlink w:history="1" r:id="rId-imhtnhwfy4vni2yuxir5">
         <w:r>
           <w:rPr>
             <w:rStyle w:val="Hyperlink"/>
@@ -30776,7 +30692,7 @@
         </w:rPr>
         <w:t xml:space="preserve">5　</w:t>
       </w:r>
-      <w:hyperlink w:history="1" r:id="rIddm73qd3_pxvimqbwez0kc">
+      <w:hyperlink w:history="1" r:id="rIdupno-dganhodqdzlsnyqe">
         <w:r>
           <w:rPr>
             <w:rStyle w:val="Hyperlink"/>
@@ -30802,7 +30718,7 @@
         </w:rPr>
         <w:t xml:space="preserve">6　</w:t>
       </w:r>
-      <w:hyperlink w:history="1" r:id="rIdnzgnfjdtxpkg6woteefd1">
+      <w:hyperlink w:history="1" r:id="rIdrwaauf5j_fzjxyme5gvxx">
         <w:r>
           <w:rPr>
             <w:rStyle w:val="Hyperlink"/>
@@ -30828,7 +30744,7 @@
         </w:rPr>
         <w:t xml:space="preserve">7　</w:t>
       </w:r>
-      <w:hyperlink w:history="1" r:id="rId5h5ob5gk3sa0zdtlvdcgx">
+      <w:hyperlink w:history="1" r:id="rIdkducz-f4-aykxi4o8q6_b">
         <w:r>
           <w:rPr>
             <w:rStyle w:val="Hyperlink"/>
@@ -30854,7 +30770,7 @@
         </w:rPr>
         <w:t xml:space="preserve">8　</w:t>
       </w:r>
-      <w:hyperlink w:history="1" r:id="rIdjtx_3ukhfzhqdjycuddu8">
+      <w:hyperlink w:history="1" r:id="rId02u3wxthq2ezfi0kfhh0i">
         <w:r>
           <w:rPr>
             <w:rStyle w:val="Hyperlink"/>
@@ -30880,7 +30796,7 @@
         </w:rPr>
         <w:t xml:space="preserve">9　</w:t>
       </w:r>
-      <w:hyperlink w:history="1" r:id="rId0ak1b6i06zawrisjvieua">
+      <w:hyperlink w:history="1" r:id="rIdzhb7l03h2tj7l5s5fm_kt">
         <w:r>
           <w:rPr>
             <w:rStyle w:val="Hyperlink"/>
@@ -30906,7 +30822,7 @@
         </w:rPr>
         <w:t xml:space="preserve">10　</w:t>
       </w:r>
-      <w:hyperlink w:history="1" r:id="rIdh8hx_ouqj12axpn_oktuj">
+      <w:hyperlink w:history="1" r:id="rId3fbdughzusupv7ucs_vth">
         <w:r>
           <w:rPr>
             <w:rStyle w:val="Hyperlink"/>
@@ -31810,7 +31726,7 @@
         </w:rPr>
         <w:t xml:space="preserve">1　</w:t>
       </w:r>
-      <w:hyperlink w:history="1" r:id="rIdath8c8xhlapx4jkheeh3g">
+      <w:hyperlink w:history="1" r:id="rIdo3kt6b2yab_852npksu_h">
         <w:r>
           <w:rPr>
             <w:rStyle w:val="Hyperlink"/>
@@ -31836,7 +31752,7 @@
         </w:rPr>
         <w:t xml:space="preserve">2　</w:t>
       </w:r>
-      <w:hyperlink w:history="1" r:id="rId0jturhaahrq1lfazbmey6">
+      <w:hyperlink w:history="1" r:id="rId_t78xvuyqn5ctoeoxyrhi">
         <w:r>
           <w:rPr>
             <w:rStyle w:val="Hyperlink"/>
@@ -31862,7 +31778,7 @@
         </w:rPr>
         <w:t xml:space="preserve">3, 10　</w:t>
       </w:r>
-      <w:hyperlink w:history="1" r:id="rId5hqdm_hdk_gwomoiuzx85">
+      <w:hyperlink w:history="1" r:id="rIdkf-5wce3uwenetv-zogoz">
         <w:r>
           <w:rPr>
             <w:rStyle w:val="Hyperlink"/>
@@ -31888,7 +31804,7 @@
         </w:rPr>
         <w:t xml:space="preserve">4　</w:t>
       </w:r>
-      <w:hyperlink w:history="1" r:id="rIdaeccqvoo5tdduvnn0o-zf">
+      <w:hyperlink w:history="1" r:id="rIdh5csxj6h5plywdz6pyx1n">
         <w:r>
           <w:rPr>
             <w:rStyle w:val="Hyperlink"/>
@@ -31914,7 +31830,7 @@
         </w:rPr>
         <w:t xml:space="preserve">5　</w:t>
       </w:r>
-      <w:hyperlink w:history="1" r:id="rId6rq6vxx4zbsplbu2haqog">
+      <w:hyperlink w:history="1" r:id="rIdtee9e2nycvffstegzy1_f">
         <w:r>
           <w:rPr>
             <w:rStyle w:val="Hyperlink"/>
@@ -31940,7 +31856,7 @@
         </w:rPr>
         <w:t xml:space="preserve">6, 12　</w:t>
       </w:r>
-      <w:hyperlink w:history="1" r:id="rIdgvllqcb4hta2eu6ngb1yb">
+      <w:hyperlink w:history="1" r:id="rIdj-pd_4mqmko-cpa0otmow">
         <w:r>
           <w:rPr>
             <w:rStyle w:val="Hyperlink"/>
@@ -31966,7 +31882,7 @@
         </w:rPr>
         <w:t xml:space="preserve">7　</w:t>
       </w:r>
-      <w:hyperlink w:history="1" r:id="rIdzbc2tdgzakywsqjlroms3">
+      <w:hyperlink w:history="1" r:id="rIdy14vxe_xht1o7lwsc1mcq">
         <w:r>
           <w:rPr>
             <w:rStyle w:val="Hyperlink"/>
@@ -31992,7 +31908,7 @@
         </w:rPr>
         <w:t xml:space="preserve">8, 16　</w:t>
       </w:r>
-      <w:hyperlink w:history="1" r:id="rIdfahopg-bq8r58tt8k4hvk">
+      <w:hyperlink w:history="1" r:id="rIduuzvfhpo02crl4oj3hbfs">
         <w:r>
           <w:rPr>
             <w:rStyle w:val="Hyperlink"/>
@@ -32018,7 +31934,7 @@
         </w:rPr>
         <w:t xml:space="preserve">9　</w:t>
       </w:r>
-      <w:hyperlink w:history="1" r:id="rIddouaipexucgo1st_tupa8">
+      <w:hyperlink w:history="1" r:id="rIdz8v3wrg9iqvcj-jwkdo_z">
         <w:r>
           <w:rPr>
             <w:rStyle w:val="Hyperlink"/>
@@ -32044,7 +31960,7 @@
         </w:rPr>
         <w:t xml:space="preserve">11, 13　</w:t>
       </w:r>
-      <w:hyperlink w:history="1" r:id="rIdpzxuqkxlhxxnsm6jg3fzw">
+      <w:hyperlink w:history="1" r:id="rId5yj_pgr2gzzfq8gz0v-tq">
         <w:r>
           <w:rPr>
             <w:rStyle w:val="Hyperlink"/>
@@ -32070,7 +31986,7 @@
         </w:rPr>
         <w:t xml:space="preserve">14　</w:t>
       </w:r>
-      <w:hyperlink w:history="1" r:id="rIdksx2gsnmxnx4bipqxtwye">
+      <w:hyperlink w:history="1" r:id="rIdozpnud3nluw0p5aos3v8x">
         <w:r>
           <w:rPr>
             <w:rStyle w:val="Hyperlink"/>
@@ -32096,7 +32012,7 @@
         </w:rPr>
         <w:t xml:space="preserve">15　</w:t>
       </w:r>
-      <w:hyperlink w:history="1" r:id="rIdy0azgnnfjqhwedygg3ljz">
+      <w:hyperlink w:history="1" r:id="rIddqlpmpsht2ob15asticte">
         <w:r>
           <w:rPr>
             <w:rStyle w:val="Hyperlink"/>
@@ -32122,7 +32038,7 @@
         </w:rPr>
         <w:t xml:space="preserve">17　</w:t>
       </w:r>
-      <w:hyperlink w:history="1" r:id="rIdd92dbqssvsz6gb3tbhmz-">
+      <w:hyperlink w:history="1" r:id="rId218ppt1b2wx7neqsoz3gv">
         <w:r>
           <w:rPr>
             <w:rStyle w:val="Hyperlink"/>
@@ -32148,7 +32064,7 @@
         </w:rPr>
         <w:t xml:space="preserve">18　</w:t>
       </w:r>
-      <w:hyperlink w:history="1" r:id="rIdu79oee0ydpxdhexwqvyif">
+      <w:hyperlink w:history="1" r:id="rIdd_ihwcgeqhkvvbr2x7sfj">
         <w:r>
           <w:rPr>
             <w:rStyle w:val="Hyperlink"/>
@@ -32174,7 +32090,7 @@
         </w:rPr>
         <w:t xml:space="preserve">19　</w:t>
       </w:r>
-      <w:hyperlink w:history="1" r:id="rIdfut5pnvlbql5p0dyjrybv">
+      <w:hyperlink w:history="1" r:id="rIdl30w2km16chvauzjctcru">
         <w:r>
           <w:rPr>
             <w:rStyle w:val="Hyperlink"/>
@@ -32200,7 +32116,7 @@
         </w:rPr>
         <w:t xml:space="preserve">20　</w:t>
       </w:r>
-      <w:hyperlink w:history="1" r:id="rIdomxklq6t1er0zd6zw0ruq">
+      <w:hyperlink w:history="1" r:id="rIdlgkx7szmhxufcdw-uxjnc">
         <w:r>
           <w:rPr>
             <w:rStyle w:val="Hyperlink"/>
@@ -33586,7 +33502,7 @@
         </w:rPr>
         <w:t xml:space="preserve">1　</w:t>
       </w:r>
-      <w:hyperlink w:history="1" r:id="rIdinlpkke8qgfkjklp1d2xf">
+      <w:hyperlink w:history="1" r:id="rIdokzvsowbig5j2wwjdiiga">
         <w:r>
           <w:rPr>
             <w:rStyle w:val="Hyperlink"/>
@@ -33612,7 +33528,7 @@
         </w:rPr>
         <w:t xml:space="preserve">2　</w:t>
       </w:r>
-      <w:hyperlink w:history="1" r:id="rIdf9ion6xy5056dk8sslltm">
+      <w:hyperlink w:history="1" r:id="rIdmkh9urtx_5lwygzgt62cl">
         <w:r>
           <w:rPr>
             <w:rStyle w:val="Hyperlink"/>
@@ -33638,7 +33554,7 @@
         </w:rPr>
         <w:t xml:space="preserve">3　</w:t>
       </w:r>
-      <w:hyperlink w:history="1" r:id="rIdehwjnpgbvjfpah1bkdquh">
+      <w:hyperlink w:history="1" r:id="rIdo5oq6lhkkntkonuk9mjod">
         <w:r>
           <w:rPr>
             <w:rStyle w:val="Hyperlink"/>
@@ -33664,7 +33580,7 @@
         </w:rPr>
         <w:t xml:space="preserve">4　</w:t>
       </w:r>
-      <w:hyperlink w:history="1" r:id="rIdjwnc7qzbs_fzson7-wth0">
+      <w:hyperlink w:history="1" r:id="rIdmwrbxtumwiq3ibhsupaof">
         <w:r>
           <w:rPr>
             <w:rStyle w:val="Hyperlink"/>
@@ -33690,7 +33606,7 @@
         </w:rPr>
         <w:t xml:space="preserve">5　</w:t>
       </w:r>
-      <w:hyperlink w:history="1" r:id="rIdbevoqdmwke0hsvp0stsjo">
+      <w:hyperlink w:history="1" r:id="rIdfmxocrdrda7ortjdf-q4r">
         <w:r>
           <w:rPr>
             <w:rStyle w:val="Hyperlink"/>
@@ -33716,7 +33632,7 @@
         </w:rPr>
         <w:t xml:space="preserve">6, 15, 33　</w:t>
       </w:r>
-      <w:hyperlink w:history="1" r:id="rIdf_arfu3j9om4k23uhmdt-">
+      <w:hyperlink w:history="1" r:id="rId16lo25qtry9x4ouoi440z">
         <w:r>
           <w:rPr>
             <w:rStyle w:val="Hyperlink"/>
@@ -33742,7 +33658,7 @@
         </w:rPr>
         <w:t xml:space="preserve">7　</w:t>
       </w:r>
-      <w:hyperlink w:history="1" r:id="rIdta8nljkwv4wdhm0pmc_h0">
+      <w:hyperlink w:history="1" r:id="rIdmeitygphhfnglyx4bxxlz">
         <w:r>
           <w:rPr>
             <w:rStyle w:val="Hyperlink"/>
@@ -33768,7 +33684,7 @@
         </w:rPr>
         <w:t xml:space="preserve">8, 19　</w:t>
       </w:r>
-      <w:hyperlink w:history="1" r:id="rId5b_c637ex5mk0d4vwsses">
+      <w:hyperlink w:history="1" r:id="rId8uge1bo_alfcvd0_nafyf">
         <w:r>
           <w:rPr>
             <w:rStyle w:val="Hyperlink"/>
@@ -33794,7 +33710,7 @@
         </w:rPr>
         <w:t xml:space="preserve">9　</w:t>
       </w:r>
-      <w:hyperlink w:history="1" r:id="rIdcbddx8vix2ch5aejv5-po">
+      <w:hyperlink w:history="1" r:id="rIdovpf2ivbbulhyrbsgdj6s">
         <w:r>
           <w:rPr>
             <w:rStyle w:val="Hyperlink"/>
@@ -33820,7 +33736,7 @@
         </w:rPr>
         <w:t xml:space="preserve">10, 12　</w:t>
       </w:r>
-      <w:hyperlink w:history="1" r:id="rIdf0pbxisksjt16wazuvimj">
+      <w:hyperlink w:history="1" r:id="rId2njdic4avepp6pg1ofzn_">
         <w:r>
           <w:rPr>
             <w:rStyle w:val="Hyperlink"/>
@@ -33846,7 +33762,7 @@
         </w:rPr>
         <w:t xml:space="preserve">11　</w:t>
       </w:r>
-      <w:hyperlink w:history="1" r:id="rIdnudznxwsz9jmhchyczejz">
+      <w:hyperlink w:history="1" r:id="rIdgyyvguojgiblxp_vlfi3i">
         <w:r>
           <w:rPr>
             <w:rStyle w:val="Hyperlink"/>
@@ -33872,7 +33788,7 @@
         </w:rPr>
         <w:t xml:space="preserve">13　</w:t>
       </w:r>
-      <w:hyperlink w:history="1" r:id="rIdwlzoxe-d1gph5e_fypojh">
+      <w:hyperlink w:history="1" r:id="rId6bu8oodvbn2y2kdqajyki">
         <w:r>
           <w:rPr>
             <w:rStyle w:val="Hyperlink"/>
@@ -33898,7 +33814,7 @@
         </w:rPr>
         <w:t xml:space="preserve">14　</w:t>
       </w:r>
-      <w:hyperlink w:history="1" r:id="rIdnhygxd3d6ptcuxjpfs7en">
+      <w:hyperlink w:history="1" r:id="rIdtctsslpxr9twlo5zcssz3">
         <w:r>
           <w:rPr>
             <w:rStyle w:val="Hyperlink"/>
@@ -33924,7 +33840,7 @@
         </w:rPr>
         <w:t xml:space="preserve">16　</w:t>
       </w:r>
-      <w:hyperlink w:history="1" r:id="rIdxqmjgxwsipo_occugn9of">
+      <w:hyperlink w:history="1" r:id="rIdierbmj6ecxiqgc1looykc">
         <w:r>
           <w:rPr>
             <w:rStyle w:val="Hyperlink"/>
@@ -33950,7 +33866,7 @@
         </w:rPr>
         <w:t xml:space="preserve">17　</w:t>
       </w:r>
-      <w:hyperlink w:history="1" r:id="rIdof1usvfo_bhcuezzsz3zx">
+      <w:hyperlink w:history="1" r:id="rId_t1kgvgpudd4la13q88hy">
         <w:r>
           <w:rPr>
             <w:rStyle w:val="Hyperlink"/>
@@ -33976,7 +33892,7 @@
         </w:rPr>
         <w:t xml:space="preserve">18　</w:t>
       </w:r>
-      <w:hyperlink w:history="1" r:id="rIdwbz6m4edirocjnhv8xaub">
+      <w:hyperlink w:history="1" r:id="rIddcjdqqgkafxgzmzdyaak9">
         <w:r>
           <w:rPr>
             <w:rStyle w:val="Hyperlink"/>
@@ -34002,7 +33918,7 @@
         </w:rPr>
         <w:t xml:space="preserve">20　</w:t>
       </w:r>
-      <w:hyperlink w:history="1" r:id="rIdau-ssbti6bokbay8strxw">
+      <w:hyperlink w:history="1" r:id="rIdgsb4pkhddr31yrxssgy8t">
         <w:r>
           <w:rPr>
             <w:rStyle w:val="Hyperlink"/>
@@ -34028,7 +33944,7 @@
         </w:rPr>
         <w:t xml:space="preserve">21, 23　</w:t>
       </w:r>
-      <w:hyperlink w:history="1" r:id="rIddh5_k8o4id13q-gglnr28">
+      <w:hyperlink w:history="1" r:id="rIdag5pj-1xarytx_treq03a">
         <w:r>
           <w:rPr>
             <w:rStyle w:val="Hyperlink"/>
@@ -34054,7 +33970,7 @@
         </w:rPr>
         <w:t xml:space="preserve">22　</w:t>
       </w:r>
-      <w:hyperlink w:history="1" r:id="rIdjdwlvypphxzhm2ou1sukf">
+      <w:hyperlink w:history="1" r:id="rIdcjajk3o5odziz3nio9yjw">
         <w:r>
           <w:rPr>
             <w:rStyle w:val="Hyperlink"/>
@@ -34080,7 +33996,7 @@
         </w:rPr>
         <w:t xml:space="preserve">24　</w:t>
       </w:r>
-      <w:hyperlink w:history="1" r:id="rIdvpgyxq24dzidnuqp01oeq">
+      <w:hyperlink w:history="1" r:id="rIdnk-vzmjpxmhe1oxazfedf">
         <w:r>
           <w:rPr>
             <w:rStyle w:val="Hyperlink"/>
@@ -34106,7 +34022,7 @@
         </w:rPr>
         <w:t xml:space="preserve">25　</w:t>
       </w:r>
-      <w:hyperlink w:history="1" r:id="rIdpvficzswhwffesmsg6rzy">
+      <w:hyperlink w:history="1" r:id="rIdf401wu52shvfxqwuzsbq2">
         <w:r>
           <w:rPr>
             <w:rStyle w:val="Hyperlink"/>
@@ -34132,7 +34048,7 @@
         </w:rPr>
         <w:t xml:space="preserve">26　</w:t>
       </w:r>
-      <w:hyperlink w:history="1" r:id="rId1i1-nur0l5ylch-y302ih">
+      <w:hyperlink w:history="1" r:id="rIduwyxbuccc9wpv6udi3qh8">
         <w:r>
           <w:rPr>
             <w:rStyle w:val="Hyperlink"/>
@@ -34158,7 +34074,7 @@
         </w:rPr>
         <w:t xml:space="preserve">27　</w:t>
       </w:r>
-      <w:hyperlink w:history="1" r:id="rIdiebedq9kyj6-2h9llv37u">
+      <w:hyperlink w:history="1" r:id="rId21mynkmdjfusophh0pywk">
         <w:r>
           <w:rPr>
             <w:rStyle w:val="Hyperlink"/>
@@ -34184,7 +34100,7 @@
         </w:rPr>
         <w:t xml:space="preserve">28　</w:t>
       </w:r>
-      <w:hyperlink w:history="1" r:id="rId8wlygmwo660yffikvbvsv">
+      <w:hyperlink w:history="1" r:id="rId0wwgrerr_c0dipnybstrd">
         <w:r>
           <w:rPr>
             <w:rStyle w:val="Hyperlink"/>
@@ -34210,7 +34126,7 @@
         </w:rPr>
         <w:t xml:space="preserve">29　</w:t>
       </w:r>
-      <w:hyperlink w:history="1" r:id="rIdbfv8zxbtcfyah5d4mm0tp">
+      <w:hyperlink w:history="1" r:id="rIdzyobhcb8kpwwe8hvzt7uc">
         <w:r>
           <w:rPr>
             <w:rStyle w:val="Hyperlink"/>
@@ -34236,7 +34152,7 @@
         </w:rPr>
         <w:t xml:space="preserve">30　</w:t>
       </w:r>
-      <w:hyperlink w:history="1" r:id="rIdqma8y6kseei7fd-tba998">
+      <w:hyperlink w:history="1" r:id="rIdecfam4hgsose4dj9wzlaj">
         <w:r>
           <w:rPr>
             <w:rStyle w:val="Hyperlink"/>
@@ -34262,7 +34178,7 @@
         </w:rPr>
         <w:t xml:space="preserve">31　</w:t>
       </w:r>
-      <w:hyperlink w:history="1" r:id="rIdqv5myoshxagdlt1ts4wiw">
+      <w:hyperlink w:history="1" r:id="rIdwdfv1gokxwwddmmfx59gd">
         <w:r>
           <w:rPr>
             <w:rStyle w:val="Hyperlink"/>
@@ -34288,7 +34204,7 @@
         </w:rPr>
         <w:t xml:space="preserve">32　</w:t>
       </w:r>
-      <w:hyperlink w:history="1" r:id="rIdj1bzx3acmvxnzb3qco6cb">
+      <w:hyperlink w:history="1" r:id="rIdnswwlobhkt3huibyvgyxq">
         <w:r>
           <w:rPr>
             <w:rStyle w:val="Hyperlink"/>

</xml_diff>